<commit_message>
docs: document validated remote rviz workflow
</commit_message>
<xml_diff>
--- a/Autoware_Partition_Guide_KATECH.docx
+++ b/Autoware_Partition_Guide_KATECH.docx
@@ -25,7 +25,7 @@
           <w:color w:val="5F6368"/>
           <w:sz w:val="17"/>
         </w:rPr>
-        <w:t>KATECH 적용 가이드  |  Version 1.0  |  2026.07.16</w:t>
+        <w:t>KATECH 적용 가이드  |  Version 1.1  |  2026.07.20</w:t>
       </w:r>
     </w:p>
     <w:p>
@@ -7529,6 +7529,63 @@
       <w:tblPr>
         <w:tblW w:type="auto" w:w="0"/>
         <w:jc w:val="center"/>
+        <w:tblLook w:firstColumn="1" w:firstRow="1" w:lastColumn="0" w:lastRow="0" w:noHBand="0" w:noVBand="1" w:val="04A0"/>
+      </w:tblPr>
+      <w:tblGrid>
+        <w:gridCol w:w="9638"/>
+      </w:tblGrid>
+      <w:tr>
+        <w:trPr>
+          <w:cantSplit/>
+        </w:trPr>
+        <w:tc>
+          <w:tcPr>
+            <w:tcW w:type="dxa" w:w="9638"/>
+            <w:shd w:fill="F5F8FC"/>
+            <w:tcBorders>
+              <w:left w:val="single" w:sz="18" w:color="0B57D0"/>
+              <w:top w:val="nil"/>
+              <w:bottom w:val="nil"/>
+              <w:right w:val="nil"/>
+            </w:tcBorders>
+          </w:tcPr>
+          <w:p>
+            <w:pPr>
+              <w:spacing w:after="40"/>
+            </w:pPr>
+            <w:r>
+              <w:rPr>
+                <w:rFonts w:ascii="Noto Sans CJK KR" w:hAnsi="Noto Sans CJK KR" w:eastAsia="Noto Sans CJK KR"/>
+                <w:b/>
+                <w:color w:val="0B57D0"/>
+              </w:rPr>
+              <w:t>검증 완료</w:t>
+            </w:r>
+          </w:p>
+          <w:p>
+            <w:pPr>
+              <w:spacing w:after="20"/>
+            </w:pPr>
+            <w:r>
+              <w:rPr>
+                <w:rFonts w:ascii="Noto Sans CJK KR" w:hAnsi="Noto Sans CJK KR" w:eastAsia="Noto Sans CJK KR"/>
+                <w:sz w:val="17"/>
+              </w:rPr>
+              <w:t>ARM64 Headless 보드에서 세 파티션을 실행하고 AMD64 Ubuntu Desktop PC에서 RViz2만 실행하는 구성을 검증했습니다. 외부 PC는 Autoware 소스 빌드, ROS 2 직접 설치 및 맵 데이터가 필요하지 않으며 Docker가 PC 아키텍처에 맞는 이미지를 자동으로 선택합니다.</w:t>
+            </w:r>
+          </w:p>
+        </w:tc>
+      </w:tr>
+    </w:tbl>
+    <w:p>
+      <w:pPr>
+        <w:spacing w:after="0"/>
+      </w:pPr>
+    </w:p>
+    <w:tbl>
+      <w:tblPr>
+        <w:tblW w:type="auto" w:w="0"/>
+        <w:jc w:val="center"/>
         <w:tblLayout w:type="fixed"/>
         <w:tblLook w:firstColumn="1" w:firstRow="1" w:lastColumn="0" w:lastRow="0" w:noHBand="0" w:noVBand="1" w:val="04A0"/>
       </w:tblPr>
@@ -8756,6 +8813,302 @@
         </w:rPr>
         <w:t>보드에 Hello World!가 출력되면 UDP multicast가 전달된 것입니다. 실패하면 두 장비의 방화벽, 스위치/VLAN, Wi-Fi AP의 client isolation과 선택한 네트워크 인터페이스를 확인합니다.</w:t>
       </w:r>
+    </w:p>
+    <w:p>
+      <w:pPr>
+        <w:pStyle w:val="Heading3"/>
+      </w:pPr>
+      <w:r>
+        <w:rPr>
+          <w:rFonts w:ascii="Noto Sans CJK KR" w:hAnsi="Noto Sans CJK KR" w:eastAsia="Noto Sans CJK KR"/>
+          <w:b/>
+          <w:color w:val="2B2F33"/>
+          <w:sz w:val="21"/>
+        </w:rPr>
+        <w:t>6.2.5 통합 검증 순서</w:t>
+      </w:r>
+    </w:p>
+    <w:p>
+      <w:r>
+        <w:rPr>
+          <w:rFonts w:ascii="Noto Sans CJK KR" w:hAnsi="Noto Sans CJK KR" w:eastAsia="Noto Sans CJK KR"/>
+        </w:rPr>
+        <w:t>실제 장비에서는 다음 순서로 Headless 실행과 원격 시각화를 확인합니다.</w:t>
+      </w:r>
+    </w:p>
+    <w:p>
+      <w:pPr>
+        <w:spacing w:after="40"/>
+        <w:ind w:left="397" w:hanging="397"/>
+      </w:pPr>
+      <w:r>
+        <w:rPr>
+          <w:rFonts w:ascii="Noto Sans CJK KR" w:hAnsi="Noto Sans CJK KR" w:eastAsia="Noto Sans CJK KR"/>
+        </w:rPr>
+        <w:t xml:space="preserve">1.  </w:t>
+      </w:r>
+      <w:r>
+        <w:rPr>
+          <w:rFonts w:ascii="Noto Sans CJK KR" w:hAnsi="Noto Sans CJK KR" w:eastAsia="Noto Sans CJK KR"/>
+        </w:rPr>
+        <w:t>기존 Autoware 컨테이너를 종료하고 보드와 외부 PC가 서로 ping 되는지 확인합니다.</w:t>
+      </w:r>
+    </w:p>
+    <w:p>
+      <w:pPr>
+        <w:spacing w:after="40"/>
+        <w:ind w:left="397" w:hanging="397"/>
+      </w:pPr>
+      <w:r>
+        <w:rPr>
+          <w:rFonts w:ascii="Noto Sans CJK KR" w:hAnsi="Noto Sans CJK KR" w:eastAsia="Noto Sans CJK KR"/>
+        </w:rPr>
+        <w:t xml:space="preserve">2.  </w:t>
+      </w:r>
+      <w:r>
+        <w:rPr>
+          <w:rFonts w:ascii="Noto Sans CJK KR" w:hAnsi="Noto Sans CJK KR" w:eastAsia="Noto Sans CJK KR"/>
+        </w:rPr>
+        <w:t>보드에서 6.2.1의 --headless 명령을 실행하고 adsw-perception-42, adsw-decision-42, adsw-control-42 컨테이너가 실행되는지 확인합니다.</w:t>
+      </w:r>
+    </w:p>
+    <w:p>
+      <w:pPr>
+        <w:spacing w:after="40"/>
+        <w:ind w:left="397" w:hanging="397"/>
+      </w:pPr>
+      <w:r>
+        <w:rPr>
+          <w:rFonts w:ascii="Noto Sans CJK KR" w:hAnsi="Noto Sans CJK KR" w:eastAsia="Noto Sans CJK KR"/>
+        </w:rPr>
+        <w:t xml:space="preserve">3.  </w:t>
+      </w:r>
+      <w:r>
+        <w:rPr>
+          <w:rFonts w:ascii="Noto Sans CJK KR" w:hAnsi="Noto Sans CJK KR" w:eastAsia="Noto Sans CJK KR"/>
+        </w:rPr>
+        <w:t>외부 PC의 GUI 터미널에서 6.2.2의 run_remote_rviz.sh를 실행합니다. 처음 실행하면 AMD64 Perception 이미지가 자동으로 내려받아집니다.</w:t>
+      </w:r>
+    </w:p>
+    <w:p>
+      <w:pPr>
+        <w:spacing w:after="40"/>
+        <w:ind w:left="397" w:hanging="397"/>
+      </w:pPr>
+      <w:r>
+        <w:rPr>
+          <w:rFonts w:ascii="Noto Sans CJK KR" w:hAnsi="Noto Sans CJK KR" w:eastAsia="Noto Sans CJK KR"/>
+        </w:rPr>
+        <w:t xml:space="preserve">4.  </w:t>
+      </w:r>
+      <w:r>
+        <w:rPr>
+          <w:rFonts w:ascii="Noto Sans CJK KR" w:hAnsi="Noto Sans CJK KR" w:eastAsia="Noto Sans CJK KR"/>
+        </w:rPr>
+        <w:t>RViz에서 pointcloud map, vector map, 차량 및 TF가 표시되는지 확인합니다.</w:t>
+      </w:r>
+    </w:p>
+    <w:p>
+      <w:pPr>
+        <w:spacing w:after="40"/>
+        <w:ind w:left="397" w:hanging="397"/>
+      </w:pPr>
+      <w:r>
+        <w:rPr>
+          <w:rFonts w:ascii="Noto Sans CJK KR" w:hAnsi="Noto Sans CJK KR" w:eastAsia="Noto Sans CJK KR"/>
+        </w:rPr>
+        <w:t xml:space="preserve">5.  </w:t>
+      </w:r>
+      <w:r>
+        <w:rPr>
+          <w:rFonts w:ascii="Noto Sans CJK KR" w:hAnsi="Noto Sans CJK KR" w:eastAsia="Noto Sans CJK KR"/>
+        </w:rPr>
+        <w:t>2D Pose Estimate와 2D Goal Pose를 지정하여 route가 생성되고 Auto 조작이 보드로 전달되는지 확인합니다.</w:t>
+      </w:r>
+    </w:p>
+    <w:p>
+      <w:pPr>
+        <w:spacing w:after="40"/>
+        <w:ind w:left="397" w:hanging="397"/>
+      </w:pPr>
+      <w:r>
+        <w:rPr>
+          <w:rFonts w:ascii="Noto Sans CJK KR" w:hAnsi="Noto Sans CJK KR" w:eastAsia="Noto Sans CJK KR"/>
+        </w:rPr>
+        <w:t xml:space="preserve">6.  </w:t>
+      </w:r>
+      <w:r>
+        <w:rPr>
+          <w:rFonts w:ascii="Noto Sans CJK KR" w:hAnsi="Noto Sans CJK KR" w:eastAsia="Noto Sans CJK KR"/>
+        </w:rPr>
+        <w:t>종료할 때 외부 PC의 RViz와 보드 실행 터미널에서 각각 Ctrl-C를 누릅니다.</w:t>
+      </w:r>
+    </w:p>
+    <w:tbl>
+      <w:tblPr>
+        <w:tblW w:type="auto" w:w="0"/>
+        <w:jc w:val="center"/>
+        <w:tblLayout w:type="autofit"/>
+        <w:tblLook w:firstColumn="1" w:firstRow="1" w:lastColumn="0" w:lastRow="0" w:noHBand="0" w:noVBand="1" w:val="04A0"/>
+      </w:tblPr>
+      <w:tblGrid>
+        <w:gridCol w:w="9638"/>
+      </w:tblGrid>
+      <w:tr>
+        <w:trPr>
+          <w:cantSplit/>
+        </w:trPr>
+        <w:tc>
+          <w:tcPr>
+            <w:tcW w:type="dxa" w:w="9638"/>
+            <w:shd w:fill="EEF1F4"/>
+            <w:tcBorders>
+              <w:top w:val="nil"/>
+              <w:bottom w:val="nil"/>
+              <w:left w:val="nil"/>
+              <w:right w:val="nil"/>
+            </w:tcBorders>
+          </w:tcPr>
+          <w:p>
+            <w:pPr>
+              <w:spacing w:after="0" w:line="259" w:lineRule="auto"/>
+            </w:pPr>
+            <w:r>
+              <w:rPr>
+                <w:rFonts w:ascii="DejaVu Sans Mono" w:hAnsi="DejaVu Sans Mono" w:eastAsia="DejaVu Sans Mono"/>
+                <w:color w:val="30343A"/>
+                <w:sz w:val="15"/>
+              </w:rPr>
+              <w:t># 보드: 세 파티션 확인</w:t>
+            </w:r>
+          </w:p>
+        </w:tc>
+      </w:tr>
+      <w:tr>
+        <w:trPr>
+          <w:cantSplit/>
+        </w:trPr>
+        <w:tc>
+          <w:tcPr>
+            <w:tcW w:type="dxa" w:w="9638"/>
+            <w:shd w:fill="EEF1F4"/>
+            <w:tcBorders>
+              <w:top w:val="nil"/>
+              <w:bottom w:val="nil"/>
+              <w:left w:val="nil"/>
+              <w:right w:val="nil"/>
+            </w:tcBorders>
+          </w:tcPr>
+          <w:p>
+            <w:pPr>
+              <w:spacing w:after="0" w:line="259" w:lineRule="auto"/>
+            </w:pPr>
+            <w:r>
+              <w:rPr>
+                <w:rFonts w:ascii="DejaVu Sans Mono" w:hAnsi="DejaVu Sans Mono" w:eastAsia="DejaVu Sans Mono"/>
+                <w:color w:val="30343A"/>
+                <w:sz w:val="15"/>
+              </w:rPr>
+              <w:t>docker ps --filter 'name=adsw-'</w:t>
+            </w:r>
+          </w:p>
+        </w:tc>
+      </w:tr>
+      <w:tr>
+        <w:trPr>
+          <w:cantSplit/>
+        </w:trPr>
+        <w:tc>
+          <w:tcPr>
+            <w:tcW w:type="dxa" w:w="9638"/>
+            <w:shd w:fill="EEF1F4"/>
+            <w:tcBorders>
+              <w:top w:val="nil"/>
+              <w:bottom w:val="nil"/>
+              <w:left w:val="nil"/>
+              <w:right w:val="nil"/>
+            </w:tcBorders>
+          </w:tcPr>
+          <w:p>
+            <w:pPr>
+              <w:spacing w:after="0" w:line="259" w:lineRule="auto"/>
+            </w:pPr>
+            <w:r>
+              <w:rPr>
+                <w:rFonts w:ascii="DejaVu Sans Mono" w:hAnsi="DejaVu Sans Mono" w:eastAsia="DejaVu Sans Mono"/>
+                <w:color w:val="30343A"/>
+                <w:sz w:val="15"/>
+              </w:rPr>
+              <w:t xml:space="preserve"> </w:t>
+            </w:r>
+          </w:p>
+        </w:tc>
+      </w:tr>
+      <w:tr>
+        <w:trPr>
+          <w:cantSplit/>
+        </w:trPr>
+        <w:tc>
+          <w:tcPr>
+            <w:tcW w:type="dxa" w:w="9638"/>
+            <w:shd w:fill="EEF1F4"/>
+            <w:tcBorders>
+              <w:top w:val="nil"/>
+              <w:bottom w:val="nil"/>
+              <w:left w:val="nil"/>
+              <w:right w:val="nil"/>
+            </w:tcBorders>
+          </w:tcPr>
+          <w:p>
+            <w:pPr>
+              <w:spacing w:after="0" w:line="259" w:lineRule="auto"/>
+            </w:pPr>
+            <w:r>
+              <w:rPr>
+                <w:rFonts w:ascii="DejaVu Sans Mono" w:hAnsi="DejaVu Sans Mono" w:eastAsia="DejaVu Sans Mono"/>
+                <w:color w:val="30343A"/>
+                <w:sz w:val="15"/>
+              </w:rPr>
+              <w:t># 외부 PC: 원격 RViz 컨테이너에서 topic 확인</w:t>
+            </w:r>
+          </w:p>
+        </w:tc>
+      </w:tr>
+      <w:tr>
+        <w:trPr>
+          <w:cantSplit/>
+        </w:trPr>
+        <w:tc>
+          <w:tcPr>
+            <w:tcW w:type="dxa" w:w="9638"/>
+            <w:shd w:fill="EEF1F4"/>
+            <w:tcBorders>
+              <w:top w:val="nil"/>
+              <w:bottom w:val="nil"/>
+              <w:left w:val="nil"/>
+              <w:right w:val="nil"/>
+            </w:tcBorders>
+          </w:tcPr>
+          <w:p>
+            <w:pPr>
+              <w:spacing w:after="0" w:line="259" w:lineRule="auto"/>
+            </w:pPr>
+            <w:r>
+              <w:rPr>
+                <w:rFonts w:ascii="DejaVu Sans Mono" w:hAnsi="DejaVu Sans Mono" w:eastAsia="DejaVu Sans Mono"/>
+                <w:color w:val="30343A"/>
+                <w:sz w:val="15"/>
+              </w:rPr>
+              <w:t>docker exec -it adsw-remote-rviz-42 bash -lc   'source /opt/ros/humble/setup.bash &amp;&amp;    source /opt/autoware/setup.bash &amp;&amp;    ros2 topic list | head -n 30'</w:t>
+            </w:r>
+          </w:p>
+        </w:tc>
+      </w:tr>
+    </w:tbl>
+    <w:p>
+      <w:pPr>
+        <w:spacing w:after="0"/>
+      </w:pPr>
     </w:p>
     <w:p>
       <w:pPr>
@@ -11374,28 +11727,29 @@
         <w:rPr>
           <w:rFonts w:ascii="Noto Sans CJK KR" w:hAnsi="Noto Sans CJK KR" w:eastAsia="Noto Sans CJK KR"/>
         </w:rPr>
-        <w:t>□ 세 로그 파일이 host의 log/ 폴더에 생성됩니다.</w:t>
+        <w:t>□ Headless 보드에서 RViz 없이 세 파티션이 정상 실행됩니다.</w:t>
       </w:r>
     </w:p>
     <w:p>
+      <w:pPr>
+        <w:pStyle w:val="ListBullet"/>
+      </w:pPr>
       <w:r>
         <w:rPr>
           <w:rFonts w:ascii="Noto Sans CJK KR" w:hAnsi="Noto Sans CJK KR" w:eastAsia="Noto Sans CJK KR"/>
         </w:rPr>
+        <w:t>□ 외부 PC에서 빌드와 맵 데이터 없이 원격 RViz 시각화 및 조작이 가능합니다.</w:t>
       </w:r>
     </w:p>
     <w:p>
       <w:pPr>
-        <w:spacing w:before="360"/>
-        <w:jc w:val="center"/>
+        <w:pStyle w:val="ListBullet"/>
       </w:pPr>
       <w:r>
         <w:rPr>
           <w:rFonts w:ascii="Noto Sans CJK KR" w:hAnsi="Noto Sans CJK KR" w:eastAsia="Noto Sans CJK KR"/>
-          <w:color w:val="9AA0A6"/>
-          <w:sz w:val="16"/>
         </w:rPr>
-        <w:t>- End of Document -</w:t>
+        <w:t>□ 세 로그 파일이 host의 log/ 폴더에 생성됩니다.</w:t>
       </w:r>
     </w:p>
     <w:sectPr>

</xml_diff>

<commit_message>
docs: remove configuration change section
</commit_message>
<xml_diff>
--- a/Autoware_Partition_Guide_KATECH.docx
+++ b/Autoware_Partition_Guide_KATECH.docx
@@ -334,20 +334,6 @@
           <w:sz w:val="17"/>
         </w:rPr>
         <w:t>8. 문제 해결</w:t>
-      </w:r>
-    </w:p>
-    <w:p>
-      <w:pPr>
-        <w:spacing w:after="24" w:line="252" w:lineRule="auto"/>
-        <w:ind w:left="227"/>
-      </w:pPr>
-      <w:r>
-        <w:rPr>
-          <w:rFonts w:ascii="Noto Sans CJK KR" w:hAnsi="Noto Sans CJK KR" w:eastAsia="Noto Sans CJK KR"/>
-          <w:color w:val="0B57D0"/>
-          <w:sz w:val="17"/>
-        </w:rPr>
-        <w:t>9. 구성 변경 시 유의사항</w:t>
       </w:r>
     </w:p>
     <w:p>
@@ -11245,513 +11231,6 @@
         <w:t>UFW 또는 사내 방화벽에서 상대 장비의 UDP 통신을 허용합니다.</w:t>
       </w:r>
     </w:p>
-    <w:p>
-      <w:pPr>
-        <w:pStyle w:val="Heading1"/>
-      </w:pPr>
-      <w:r>
-        <w:rPr>
-          <w:rFonts w:ascii="Noto Sans CJK KR" w:hAnsi="Noto Sans CJK KR" w:eastAsia="Noto Sans CJK KR"/>
-          <w:b/>
-          <w:color w:val="2B2F33"/>
-          <w:sz w:val="31"/>
-        </w:rPr>
-        <w:t>9. 구성 변경 시 유의사항</w:t>
-      </w:r>
-    </w:p>
-    <w:p>
-      <w:r>
-        <w:rPr>
-          <w:rFonts w:ascii="Noto Sans CJK KR" w:hAnsi="Noto Sans CJK KR" w:eastAsia="Noto Sans CJK KR"/>
-        </w:rPr>
-        <w:t>파티션에 패키지를 추가하거나 이동할 때는 partition/partition_config의 JSON과 obigo_launch를 함께 검토합니다. 상위 저장소와 Autoware Universe는 별도 Git 저장소이므로 두 저장소의 katech-partition 브랜치 버전을 함께 관리해야 합니다.</w:t>
-      </w:r>
-    </w:p>
-    <w:tbl>
-      <w:tblPr>
-        <w:tblW w:type="auto" w:w="0"/>
-        <w:jc w:val="center"/>
-        <w:tblLayout w:type="fixed"/>
-        <w:tblLook w:firstColumn="1" w:firstRow="1" w:lastColumn="0" w:lastRow="0" w:noHBand="0" w:noVBand="1" w:val="04A0"/>
-      </w:tblPr>
-      <w:tblGrid>
-        <w:gridCol w:w="2835"/>
-        <w:gridCol w:w="6860"/>
-      </w:tblGrid>
-      <w:tr>
-        <w:trPr>
-          <w:tblHeader w:val="true"/>
-          <w:cantSplit/>
-        </w:trPr>
-        <w:tc>
-          <w:tcPr>
-            <w:tcW w:type="dxa" w:w="2834"/>
-            <w:shd w:fill="E2E6EA"/>
-            <w:vAlign w:val="center"/>
-            <w:tcBorders>
-              <w:top w:val="single" w:sz="6" w:color="C8CDD3"/>
-              <w:bottom w:val="single" w:sz="6" w:color="C8CDD3"/>
-              <w:left w:val="single" w:sz="6" w:color="C8CDD3"/>
-              <w:right w:val="single" w:sz="6" w:color="C8CDD3"/>
-            </w:tcBorders>
-          </w:tcPr>
-          <w:p>
-            <w:pPr>
-              <w:spacing w:after="0"/>
-              <w:jc w:val="center"/>
-            </w:pPr>
-            <w:r>
-              <w:rPr>
-                <w:rFonts w:ascii="Noto Sans CJK KR" w:hAnsi="Noto Sans CJK KR" w:eastAsia="Noto Sans CJK KR"/>
-                <w:b/>
-                <w:sz w:val="17"/>
-              </w:rPr>
-              <w:t>변경 대상</w:t>
-            </w:r>
-          </w:p>
-        </w:tc>
-        <w:tc>
-          <w:tcPr>
-            <w:tcW w:type="dxa" w:w="6859"/>
-            <w:shd w:fill="E2E6EA"/>
-            <w:vAlign w:val="center"/>
-            <w:tcBorders>
-              <w:top w:val="single" w:sz="6" w:color="C8CDD3"/>
-              <w:bottom w:val="single" w:sz="6" w:color="C8CDD3"/>
-              <w:left w:val="single" w:sz="6" w:color="C8CDD3"/>
-              <w:right w:val="single" w:sz="6" w:color="C8CDD3"/>
-            </w:tcBorders>
-          </w:tcPr>
-          <w:p>
-            <w:pPr>
-              <w:spacing w:after="0"/>
-              <w:jc w:val="center"/>
-            </w:pPr>
-            <w:r>
-              <w:rPr>
-                <w:rFonts w:ascii="Noto Sans CJK KR" w:hAnsi="Noto Sans CJK KR" w:eastAsia="Noto Sans CJK KR"/>
-                <w:b/>
-                <w:sz w:val="17"/>
-              </w:rPr>
-              <w:t>확인 사항</w:t>
-            </w:r>
-          </w:p>
-        </w:tc>
-      </w:tr>
-      <w:tr>
-        <w:trPr>
-          <w:cantSplit/>
-        </w:trPr>
-        <w:tc>
-          <w:tcPr>
-            <w:tcW w:type="dxa" w:w="2834"/>
-            <w:vAlign w:val="center"/>
-            <w:tcBorders>
-              <w:top w:val="single" w:sz="4" w:color="C8CDD3"/>
-              <w:bottom w:val="single" w:sz="4" w:color="C8CDD3"/>
-              <w:left w:val="single" w:sz="4" w:color="C8CDD3"/>
-              <w:right w:val="single" w:sz="4" w:color="C8CDD3"/>
-            </w:tcBorders>
-          </w:tcPr>
-          <w:p>
-            <w:pPr>
-              <w:spacing w:after="0"/>
-            </w:pPr>
-            <w:r>
-              <w:rPr>
-                <w:rFonts w:ascii="Noto Sans CJK KR" w:hAnsi="Noto Sans CJK KR" w:eastAsia="Noto Sans CJK KR"/>
-                <w:sz w:val="16"/>
-              </w:rPr>
-              <w:t>packages</w:t>
-            </w:r>
-          </w:p>
-        </w:tc>
-        <w:tc>
-          <w:tcPr>
-            <w:tcW w:type="dxa" w:w="6859"/>
-            <w:vAlign w:val="center"/>
-            <w:tcBorders>
-              <w:top w:val="single" w:sz="4" w:color="C8CDD3"/>
-              <w:bottom w:val="single" w:sz="4" w:color="C8CDD3"/>
-              <w:left w:val="single" w:sz="4" w:color="C8CDD3"/>
-              <w:right w:val="single" w:sz="4" w:color="C8CDD3"/>
-            </w:tcBorders>
-          </w:tcPr>
-          <w:p>
-            <w:pPr>
-              <w:spacing w:after="0"/>
-            </w:pPr>
-            <w:r>
-              <w:rPr>
-                <w:rFonts w:ascii="Noto Sans CJK KR" w:hAnsi="Noto Sans CJK KR" w:eastAsia="Noto Sans CJK KR"/>
-                <w:sz w:val="16"/>
-              </w:rPr>
-              <w:t>package.xml의 build/exec dependency와 실제 실행 노드</w:t>
-            </w:r>
-          </w:p>
-        </w:tc>
-      </w:tr>
-      <w:tr>
-        <w:trPr>
-          <w:cantSplit/>
-        </w:trPr>
-        <w:tc>
-          <w:tcPr>
-            <w:tcW w:type="dxa" w:w="2834"/>
-            <w:vAlign w:val="center"/>
-            <w:tcBorders>
-              <w:top w:val="single" w:sz="4" w:color="C8CDD3"/>
-              <w:bottom w:val="single" w:sz="4" w:color="C8CDD3"/>
-              <w:left w:val="single" w:sz="4" w:color="C8CDD3"/>
-              <w:right w:val="single" w:sz="4" w:color="C8CDD3"/>
-            </w:tcBorders>
-          </w:tcPr>
-          <w:p>
-            <w:pPr>
-              <w:spacing w:after="0"/>
-            </w:pPr>
-            <w:r>
-              <w:rPr>
-                <w:rFonts w:ascii="Noto Sans CJK KR" w:hAnsi="Noto Sans CJK KR" w:eastAsia="Noto Sans CJK KR"/>
-                <w:sz w:val="16"/>
-              </w:rPr>
-              <w:t>folders</w:t>
-            </w:r>
-          </w:p>
-        </w:tc>
-        <w:tc>
-          <w:tcPr>
-            <w:tcW w:type="dxa" w:w="6859"/>
-            <w:vAlign w:val="center"/>
-            <w:tcBorders>
-              <w:top w:val="single" w:sz="4" w:color="C8CDD3"/>
-              <w:bottom w:val="single" w:sz="4" w:color="C8CDD3"/>
-              <w:left w:val="single" w:sz="4" w:color="C8CDD3"/>
-              <w:right w:val="single" w:sz="4" w:color="C8CDD3"/>
-            </w:tcBorders>
-          </w:tcPr>
-          <w:p>
-            <w:pPr>
-              <w:spacing w:after="0"/>
-            </w:pPr>
-            <w:r>
-              <w:rPr>
-                <w:rFonts w:ascii="Noto Sans CJK KR" w:hAnsi="Noto Sans CJK KR" w:eastAsia="Noto Sans CJK KR"/>
-                <w:sz w:val="16"/>
-              </w:rPr>
-              <w:t>파티션에 함께 포함되는 소스 범위와 이미지 크기</w:t>
-            </w:r>
-          </w:p>
-        </w:tc>
-      </w:tr>
-      <w:tr>
-        <w:trPr>
-          <w:cantSplit/>
-        </w:trPr>
-        <w:tc>
-          <w:tcPr>
-            <w:tcW w:type="dxa" w:w="2834"/>
-            <w:vAlign w:val="center"/>
-            <w:tcBorders>
-              <w:top w:val="single" w:sz="4" w:color="C8CDD3"/>
-              <w:bottom w:val="single" w:sz="4" w:color="C8CDD3"/>
-              <w:left w:val="single" w:sz="4" w:color="C8CDD3"/>
-              <w:right w:val="single" w:sz="4" w:color="C8CDD3"/>
-            </w:tcBorders>
-          </w:tcPr>
-          <w:p>
-            <w:pPr>
-              <w:spacing w:after="0"/>
-            </w:pPr>
-            <w:r>
-              <w:rPr>
-                <w:rFonts w:ascii="Noto Sans CJK KR" w:hAnsi="Noto Sans CJK KR" w:eastAsia="Noto Sans CJK KR"/>
-                <w:sz w:val="16"/>
-              </w:rPr>
-              <w:t>obigo_launch</w:t>
-            </w:r>
-          </w:p>
-        </w:tc>
-        <w:tc>
-          <w:tcPr>
-            <w:tcW w:type="dxa" w:w="6859"/>
-            <w:vAlign w:val="center"/>
-            <w:tcBorders>
-              <w:top w:val="single" w:sz="4" w:color="C8CDD3"/>
-              <w:bottom w:val="single" w:sz="4" w:color="C8CDD3"/>
-              <w:left w:val="single" w:sz="4" w:color="C8CDD3"/>
-              <w:right w:val="single" w:sz="4" w:color="C8CDD3"/>
-            </w:tcBorders>
-          </w:tcPr>
-          <w:p>
-            <w:pPr>
-              <w:spacing w:after="0"/>
-            </w:pPr>
-            <w:r>
-              <w:rPr>
-                <w:rFonts w:ascii="Noto Sans CJK KR" w:hAnsi="Noto Sans CJK KR" w:eastAsia="Noto Sans CJK KR"/>
-                <w:sz w:val="16"/>
-              </w:rPr>
-              <w:t>launch, config, parameter, URDF 경로</w:t>
-            </w:r>
-          </w:p>
-        </w:tc>
-      </w:tr>
-      <w:tr>
-        <w:trPr>
-          <w:cantSplit/>
-        </w:trPr>
-        <w:tc>
-          <w:tcPr>
-            <w:tcW w:type="dxa" w:w="2834"/>
-            <w:vAlign w:val="center"/>
-            <w:tcBorders>
-              <w:top w:val="single" w:sz="4" w:color="C8CDD3"/>
-              <w:bottom w:val="single" w:sz="4" w:color="C8CDD3"/>
-              <w:left w:val="single" w:sz="4" w:color="C8CDD3"/>
-              <w:right w:val="single" w:sz="4" w:color="C8CDD3"/>
-            </w:tcBorders>
-          </w:tcPr>
-          <w:p>
-            <w:pPr>
-              <w:spacing w:after="0"/>
-            </w:pPr>
-            <w:r>
-              <w:rPr>
-                <w:rFonts w:ascii="Noto Sans CJK KR" w:hAnsi="Noto Sans CJK KR" w:eastAsia="Noto Sans CJK KR"/>
-                <w:sz w:val="16"/>
-              </w:rPr>
-              <w:t>Dockerfile.template</w:t>
-            </w:r>
-          </w:p>
-        </w:tc>
-        <w:tc>
-          <w:tcPr>
-            <w:tcW w:type="dxa" w:w="6859"/>
-            <w:vAlign w:val="center"/>
-            <w:tcBorders>
-              <w:top w:val="single" w:sz="4" w:color="C8CDD3"/>
-              <w:bottom w:val="single" w:sz="4" w:color="C8CDD3"/>
-              <w:left w:val="single" w:sz="4" w:color="C8CDD3"/>
-              <w:right w:val="single" w:sz="4" w:color="C8CDD3"/>
-            </w:tcBorders>
-          </w:tcPr>
-          <w:p>
-            <w:pPr>
-              <w:spacing w:after="0"/>
-            </w:pPr>
-            <w:r>
-              <w:rPr>
-                <w:rFonts w:ascii="Noto Sans CJK KR" w:hAnsi="Noto Sans CJK KR" w:eastAsia="Noto Sans CJK KR"/>
-                <w:sz w:val="16"/>
-              </w:rPr>
-              <w:t>공통 build/runtime 계층과 TARGETPLATFORM 처리</w:t>
-            </w:r>
-          </w:p>
-        </w:tc>
-      </w:tr>
-      <w:tr>
-        <w:trPr>
-          <w:cantSplit/>
-        </w:trPr>
-        <w:tc>
-          <w:tcPr>
-            <w:tcW w:type="dxa" w:w="2834"/>
-            <w:vAlign w:val="center"/>
-            <w:tcBorders>
-              <w:top w:val="single" w:sz="4" w:color="C8CDD3"/>
-              <w:bottom w:val="single" w:sz="4" w:color="C8CDD3"/>
-              <w:left w:val="single" w:sz="4" w:color="C8CDD3"/>
-              <w:right w:val="single" w:sz="4" w:color="C8CDD3"/>
-            </w:tcBorders>
-          </w:tcPr>
-          <w:p>
-            <w:pPr>
-              <w:spacing w:after="0"/>
-            </w:pPr>
-            <w:r>
-              <w:rPr>
-                <w:rFonts w:ascii="Noto Sans CJK KR" w:hAnsi="Noto Sans CJK KR" w:eastAsia="Noto Sans CJK KR"/>
-                <w:sz w:val="16"/>
-              </w:rPr>
-              <w:t>run_partitions.sh</w:t>
-            </w:r>
-          </w:p>
-        </w:tc>
-        <w:tc>
-          <w:tcPr>
-            <w:tcW w:type="dxa" w:w="6859"/>
-            <w:vAlign w:val="center"/>
-            <w:tcBorders>
-              <w:top w:val="single" w:sz="4" w:color="C8CDD3"/>
-              <w:bottom w:val="single" w:sz="4" w:color="C8CDD3"/>
-              <w:left w:val="single" w:sz="4" w:color="C8CDD3"/>
-              <w:right w:val="single" w:sz="4" w:color="C8CDD3"/>
-            </w:tcBorders>
-          </w:tcPr>
-          <w:p>
-            <w:pPr>
-              <w:spacing w:after="0"/>
-            </w:pPr>
-            <w:r>
-              <w:rPr>
-                <w:rFonts w:ascii="Noto Sans CJK KR" w:hAnsi="Noto Sans CJK KR" w:eastAsia="Noto Sans CJK KR"/>
-                <w:sz w:val="16"/>
-              </w:rPr>
-              <w:t>실행 순서, domain, mount, 로그 및 종료 처리</w:t>
-            </w:r>
-          </w:p>
-        </w:tc>
-      </w:tr>
-    </w:tbl>
-    <w:p>
-      <w:pPr>
-        <w:spacing w:after="0"/>
-      </w:pPr>
-    </w:p>
-    <w:p>
-      <w:pPr>
-        <w:spacing w:after="140"/>
-        <w:jc w:val="center"/>
-      </w:pPr>
-      <w:r>
-        <w:rPr>
-          <w:rFonts w:ascii="Noto Sans CJK KR" w:hAnsi="Noto Sans CJK KR" w:eastAsia="Noto Sans CJK KR"/>
-          <w:color w:val="5F6368"/>
-          <w:sz w:val="15"/>
-        </w:rPr>
-        <w:t>표 10. 구성 변경 점검 항목</w:t>
-      </w:r>
-    </w:p>
-    <w:p>
-      <w:r>
-        <w:rPr>
-          <w:rFonts w:ascii="Noto Sans CJK KR" w:hAnsi="Noto Sans CJK KR" w:eastAsia="Noto Sans CJK KR"/>
-        </w:rPr>
-        <w:t>최종 검증 체크리스트</w:t>
-      </w:r>
-    </w:p>
-    <w:p>
-      <w:pPr>
-        <w:pStyle w:val="ListBullet"/>
-      </w:pPr>
-      <w:r>
-        <w:rPr>
-          <w:rFonts w:ascii="Noto Sans CJK KR" w:hAnsi="Noto Sans CJK KR" w:eastAsia="Noto Sans CJK KR"/>
-        </w:rPr>
-        <w:t>□ Docker와 Buildx가 정상적으로 실행됩니다.</w:t>
-      </w:r>
-    </w:p>
-    <w:p>
-      <w:pPr>
-        <w:pStyle w:val="ListBullet"/>
-      </w:pPr>
-      <w:r>
-        <w:rPr>
-          <w:rFonts w:ascii="Noto Sans CJK KR" w:hAnsi="Noto Sans CJK KR" w:eastAsia="Noto Sans CJK KR"/>
-        </w:rPr>
-        <w:t>□ 현재 host가 amd64 또는 arm64로 확인됩니다.</w:t>
-      </w:r>
-    </w:p>
-    <w:p>
-      <w:pPr>
-        <w:pStyle w:val="ListBullet"/>
-      </w:pPr>
-      <w:r>
-        <w:rPr>
-          <w:rFonts w:ascii="Noto Sans CJK KR" w:hAnsi="Noto Sans CJK KR" w:eastAsia="Noto Sans CJK KR"/>
-        </w:rPr>
-        <w:t>□ sample-map-planning 폴더에 필수 맵 파일이 있습니다.</w:t>
-      </w:r>
-    </w:p>
-    <w:p>
-      <w:pPr>
-        <w:pStyle w:val="ListBullet"/>
-      </w:pPr>
-      <w:r>
-        <w:rPr>
-          <w:rFonts w:ascii="Noto Sans CJK KR" w:hAnsi="Noto Sans CJK KR" w:eastAsia="Noto Sans CJK KR"/>
-        </w:rPr>
-        <w:t>□ No-CUDA 파티션 이미지 세 개가 준비되었습니다.</w:t>
-      </w:r>
-    </w:p>
-    <w:p>
-      <w:pPr>
-        <w:pStyle w:val="ListBullet"/>
-      </w:pPr>
-      <w:r>
-        <w:rPr>
-          <w:rFonts w:ascii="Noto Sans CJK KR" w:hAnsi="Noto Sans CJK KR" w:eastAsia="Noto Sans CJK KR"/>
-        </w:rPr>
-        <w:t>□ 세 컨테이너가 같은 ROS_DOMAIN_ID로 실행됩니다.</w:t>
-      </w:r>
-    </w:p>
-    <w:p>
-      <w:pPr>
-        <w:pStyle w:val="ListBullet"/>
-      </w:pPr>
-      <w:r>
-        <w:rPr>
-          <w:rFonts w:ascii="Noto Sans CJK KR" w:hAnsi="Noto Sans CJK KR" w:eastAsia="Noto Sans CJK KR"/>
-        </w:rPr>
-        <w:t>□ Perception, Decision, Control 순서로 정상 시작됩니다.</w:t>
-      </w:r>
-    </w:p>
-    <w:p>
-      <w:pPr>
-        <w:pStyle w:val="ListBullet"/>
-      </w:pPr>
-      <w:r>
-        <w:rPr>
-          <w:rFonts w:ascii="Noto Sans CJK KR" w:hAnsi="Noto Sans CJK KR" w:eastAsia="Noto Sans CJK KR"/>
-        </w:rPr>
-        <w:t>□ RViz에서 initial pose, goal, route와 trajectory가 확인됩니다.</w:t>
-      </w:r>
-    </w:p>
-    <w:p>
-      <w:pPr>
-        <w:pStyle w:val="ListBullet"/>
-      </w:pPr>
-      <w:r>
-        <w:rPr>
-          <w:rFonts w:ascii="Noto Sans CJK KR" w:hAnsi="Noto Sans CJK KR" w:eastAsia="Noto Sans CJK KR"/>
-        </w:rPr>
-        <w:t>□ Auto 주행 후 차량이 목표 지점에 도착합니다.</w:t>
-      </w:r>
-    </w:p>
-    <w:p>
-      <w:pPr>
-        <w:pStyle w:val="ListBullet"/>
-      </w:pPr>
-      <w:r>
-        <w:rPr>
-          <w:rFonts w:ascii="Noto Sans CJK KR" w:hAnsi="Noto Sans CJK KR" w:eastAsia="Noto Sans CJK KR"/>
-        </w:rPr>
-        <w:t>□ Headless 보드에서 RViz 없이 세 파티션이 정상 실행됩니다.</w:t>
-      </w:r>
-    </w:p>
-    <w:p>
-      <w:pPr>
-        <w:pStyle w:val="ListBullet"/>
-      </w:pPr>
-      <w:r>
-        <w:rPr>
-          <w:rFonts w:ascii="Noto Sans CJK KR" w:hAnsi="Noto Sans CJK KR" w:eastAsia="Noto Sans CJK KR"/>
-        </w:rPr>
-        <w:t>□ 외부 PC에서 빌드와 맵 데이터 없이 원격 RViz 시각화 및 조작이 가능합니다.</w:t>
-      </w:r>
-    </w:p>
-    <w:p>
-      <w:pPr>
-        <w:pStyle w:val="ListBullet"/>
-      </w:pPr>
-      <w:r>
-        <w:rPr>
-          <w:rFonts w:ascii="Noto Sans CJK KR" w:hAnsi="Noto Sans CJK KR" w:eastAsia="Noto Sans CJK KR"/>
-        </w:rPr>
-        <w:t>□ 세 로그 파일이 host의 log/ 폴더에 생성됩니다.</w:t>
-      </w:r>
-    </w:p>
     <w:sectPr>
       <w:headerReference w:type="default" r:id="rId9"/>
       <w:footerReference w:type="default" r:id="rId10"/>

</xml_diff>

<commit_message>
docs: add virtual lidar partition variant
</commit_message>
<xml_diff>
--- a/Autoware_Partition_Guide_KATECH.docx
+++ b/Autoware_Partition_Guide_KATECH.docx
@@ -37,7 +37,7 @@
           <ns0:color ns0:val="5F6368"/>
           <ns0:sz ns0:val="17"/>
         </ns0:rPr>
-        <ns0:t xml:space="preserve">KATECH </ns0:t>
+        <ns0:t xml:space="preserve">KATECH 적용 가이드  |  Version 1.2  |  2026.07.20</ns0:t>
       </ns0:r>
       <ns0:r ns0:rsidRPr="005A6394">
         <ns0:rPr>
@@ -45,7 +45,7 @@
           <ns0:color ns0:val="5F6368"/>
           <ns0:sz ns0:val="17"/>
         </ns0:rPr>
-        <ns0:t>적용</ns0:t>
+        <ns0:t/>
       </ns0:r>
       <ns0:r ns0:rsidRPr="005A6394">
         <ns0:rPr>
@@ -53,7 +53,7 @@
           <ns0:color ns0:val="5F6368"/>
           <ns0:sz ns0:val="17"/>
         </ns0:rPr>
-        <ns0:t xml:space="preserve"> </ns0:t>
+        <ns0:t xml:space="preserve"/>
       </ns0:r>
       <ns0:r ns0:rsidRPr="005A6394">
         <ns0:rPr>
@@ -61,7 +61,7 @@
           <ns0:color ns0:val="5F6368"/>
           <ns0:sz ns0:val="17"/>
         </ns0:rPr>
-        <ns0:t>가이드</ns0:t>
+        <ns0:t/>
       </ns0:r>
       <ns0:r ns0:rsidRPr="005A6394">
         <ns0:rPr>
@@ -69,7 +69,7 @@
           <ns0:color ns0:val="5F6368"/>
           <ns0:sz ns0:val="17"/>
         </ns0:rPr>
-        <ns0:t xml:space="preserve">  |  Version 1.1  |  2026.07.20</ns0:t>
+        <ns0:t xml:space="preserve"/>
       </ns0:r>
     </ns0:p>
     <ns0:p ns2:paraId="4240993D" ns2:textId="77777777" ns0:rsidR="00C903FE" ns0:rsidRPr="005A6394" ns0:rsidRDefault="00361B4A">
@@ -1205,6 +1205,34 @@
         <ns0:t>테스트</ns0:t>
       </ns0:r>
     </ns0:p>
+    <ns0:p ns2:paraId="1750C811" ns2:textId="77777777" ns0:rsidR="00C903FE" ns0:rsidRPr="005A6394" ns0:rsidRDefault="00361B4A">
+      <ns0:pPr>
+        <ns0:spacing ns0:after="24" ns0:line="252" ns0:lineRule="auto"/>
+        <ns0:ind ns0:left="227"/>
+        <ns0:rPr>
+          <ns0:rFonts ns0:ascii="굴림" ns0:eastAsia="굴림" ns0:hAnsi="굴림"/>
+          <ns0:lang ns0:eastAsia="ko-KR"/>
+        </ns0:rPr>
+      </ns0:pPr>
+      <ns0:r ns0:rsidRPr="005A6394">
+        <ns0:rPr>
+          <ns0:rFonts ns0:ascii="굴림" ns0:eastAsia="굴림" ns0:hAnsi="굴림" ns0:cs="굴림"/>
+          <ns0:color ns0:val="0B57D0"/>
+          <ns0:sz ns0:val="17"/>
+          <ns0:lang ns0:eastAsia="ko-KR"/>
+        </ns0:rPr>
+        <ns0:t xml:space="preserve">7.1 가상 LiDAR 장애물 인지 흐름</ns0:t>
+      </ns0:r>
+      <ns0:r ns0:rsidRPr="005A6394">
+        <ns0:rPr>
+          <ns0:rFonts ns0:ascii="굴림" ns0:eastAsia="굴림" ns0:hAnsi="굴림" ns0:cs="굴림"/>
+          <ns0:color ns0:val="0B57D0"/>
+          <ns0:sz ns0:val="17"/>
+          <ns0:lang ns0:eastAsia="ko-KR"/>
+        </ns0:rPr>
+        <ns0:t/>
+      </ns0:r>
+    </ns0:p>
     <ns0:p ns2:paraId="1117E51B" ns2:textId="77777777" ns0:rsidR="00C903FE" ns0:rsidRPr="005A6394" ns0:rsidRDefault="00361B4A">
       <ns0:pPr>
         <ns0:spacing ns0:after="24" ns0:line="252" ns0:lineRule="auto"/>
@@ -1295,7 +1323,7 @@
           <ns0:rFonts ns0:ascii="굴림" ns0:eastAsia="굴림" ns0:hAnsi="굴림" ns0:cs="굴림"/>
           <ns0:lang ns0:eastAsia="ko-KR"/>
         </ns0:rPr>
-        <ns0:t>이 문서는 Autoware를 기능별 파티션으로 분리하여 Docker 컨테이너로 빌드하고, Planning Simulation의 Lane Driving 시나리오를 실행하는 방법을 다룹니다. 기존 GOASP Autoware Partition 가이드의 설계 방향을 기반으로 하되, KATECH에서 수정한 소스와 PC·ARM64 BSP 보드 시험 결과를 현재 절차에 반영했습니다.</ns0:t>
+        <ns0:t xml:space="preserve">이 문서는 Autoware를 기능별 파티션으로 분리하여 Docker 컨테이너로 빌드하고, Planning Simulation의 Lane Driving 시나리오를 실행하는 방법을 다룹니다. 기존 GOASP Autoware Partition 가이드의 설계 방향을 기반으로 하되, KATECH에서 수정한 소스와 PC·ARM64 BSP 보드 시험 결과를 현재 절차에 반영했습니다. RViz 장애물 시험은 가상 LiDAR Pointcloud가 Sensing 전처리와 CPU 기반 Perception 검출을 거치는 구성으로 설명합니다.</ns0:t>
       </ns0:r>
       <ns0:r ns0:rsidRPr="005A6394">
         <ns0:rPr>
@@ -6646,7 +6674,7 @@
                 <ns0:rFonts ns0:ascii="굴림" ns0:eastAsia="굴림" ns0:hAnsi="굴림" ns0:cs="굴림"/>
                 <ns0:sz ns0:val="16"/>
               </ns0:rPr>
-              <ns0:t>Map, Localization, Sensing, Perception, RViz2</ns0:t>
+              <ns0:t xml:space="preserve">Map, Localization, 가상 LiDAR Sensing, Perception, RViz2</ns0:t>
             </ns0:r>
           </ns0:p>
         </ns0:tc>
@@ -6937,7 +6965,7 @@
         <ns0:rPr>
           <ns0:rFonts ns0:ascii="굴림" ns0:hAnsi="굴림" ns0:eastAsia="굴림" ns0:cs="굴림"/>
         </ns0:rPr>
-        <ns0:t>RViz2 실행 파일과 설정은 Perception 이미지에 포함되지만, 권장 구성에서는 BSP 보드가 아니라 외부 PC에서 해당 이미지를 사용해 RViz2만 실행합니다.</ns0:t>
+        <ns0:t xml:space="preserve">RViz2 실행 파일과 설정은 Perception 이미지에 포함되지만, 권장 구성에서는 BSP 보드가 아니라 외부 PC에서 해당 이미지를 사용해 RViz2만 실행합니다. RViz에서 배치한 장애물은 가상 LiDAR Pointcloud로 변환되며, Perception 파티션의 Sensing 전처리와 CPU 군집화 경로를 거쳐 Planning에 전달됩니다.</ns0:t>
       </ns0:r>
     </ns0:p>
     <ns0:p ns2:paraId="62200909" ns2:textId="77777777" ns0:rsidR="00C903FE" ns0:rsidRPr="005A6394" ns0:rsidRDefault="00361B4A">
@@ -26100,7 +26128,7 @@
           <ns0:rFonts ns0:ascii="굴림" ns0:eastAsia="굴림" ns0:hAnsi="굴림" ns0:cs="굴림"/>
           <ns0:lang ns0:eastAsia="ko-KR"/>
         </ns0:rPr>
-        <ns0:t>세 파티션의 초기화가 완료된 뒤 외부 PC의 RViz에서 다음 순서로 검증합니다. BSP 보드에서 RViz를 직접 실행하는 대체 확인 방법에서도 절차는 동일합니다.</ns0:t>
+        <ns0:t xml:space="preserve">세 파티션의 초기화가 완료된 뒤 외부 PC의 RViz에서 다음 순서로 검증합니다. BSP 보드에서 RViz를 직접 실행하는 대체 확인 방법에서도 절차는 동일합니다. 기본 주행을 확인한 뒤 7.1 절의 가상 LiDAR 장애물 인지 흐름을 추가로 검증합니다.</ns0:t>
       </ns0:r>
       <ns0:r ns0:rsidRPr="005A6394">
         <ns0:rPr>
@@ -27575,6 +27603,2976 @@
           <ns0:lang ns0:eastAsia="ko-KR"/>
         </ns0:rPr>
         <ns0:t>ARM64 BSP 보드는 PC보다 map, localization, planning 초기화가 오래 걸릴 수 있습니다. Auto가 즉시 활성화되지 않으면 pose를 연속해서 다시 지정하기보다 각 파티션 로그가 안정될 때까지 기다립니다.</ns0:t>
+      </ns0:r>
+      <ns0:r ns0:rsidRPr="005A6394">
+        <ns0:rPr>
+          <ns0:rFonts ns0:ascii="굴림" ns0:eastAsia="굴림" ns0:hAnsi="굴림" ns0:cs="굴림"/>
+          <ns0:lang ns0:eastAsia="ko-KR"/>
+        </ns0:rPr>
+      </ns0:r>
+      <ns0:r ns0:rsidRPr="005A6394">
+        <ns0:rPr>
+          <ns0:rFonts ns0:ascii="굴림" ns0:eastAsia="굴림" ns0:hAnsi="굴림" ns0:cs="굴림"/>
+          <ns0:lang ns0:eastAsia="ko-KR"/>
+        </ns0:rPr>
+      </ns0:r>
+      <ns0:r ns0:rsidRPr="005A6394">
+        <ns0:rPr>
+          <ns0:rFonts ns0:ascii="굴림" ns0:eastAsia="굴림" ns0:hAnsi="굴림" ns0:cs="굴림"/>
+          <ns0:lang ns0:eastAsia="ko-KR"/>
+        </ns0:rPr>
+      </ns0:r>
+      <ns0:r ns0:rsidRPr="005A6394">
+        <ns0:rPr>
+          <ns0:rFonts ns0:ascii="굴림" ns0:eastAsia="굴림" ns0:hAnsi="굴림" ns0:cs="굴림"/>
+          <ns0:lang ns0:eastAsia="ko-KR"/>
+        </ns0:rPr>
+      </ns0:r>
+      <ns0:r ns0:rsidRPr="005A6394">
+        <ns0:rPr>
+          <ns0:rFonts ns0:ascii="굴림" ns0:eastAsia="굴림" ns0:hAnsi="굴림" ns0:cs="굴림"/>
+          <ns0:lang ns0:eastAsia="ko-KR"/>
+        </ns0:rPr>
+      </ns0:r>
+      <ns0:r ns0:rsidRPr="005A6394">
+        <ns0:rPr>
+          <ns0:rFonts ns0:ascii="굴림" ns0:eastAsia="굴림" ns0:hAnsi="굴림" ns0:cs="굴림"/>
+          <ns0:lang ns0:eastAsia="ko-KR"/>
+        </ns0:rPr>
+      </ns0:r>
+      <ns0:r ns0:rsidRPr="005A6394">
+        <ns0:rPr>
+          <ns0:rFonts ns0:ascii="굴림" ns0:eastAsia="굴림" ns0:hAnsi="굴림" ns0:cs="굴림"/>
+          <ns0:lang ns0:eastAsia="ko-KR"/>
+        </ns0:rPr>
+      </ns0:r>
+      <ns0:r ns0:rsidRPr="005A6394">
+        <ns0:rPr>
+          <ns0:rFonts ns0:ascii="굴림" ns0:eastAsia="굴림" ns0:hAnsi="굴림" ns0:cs="굴림"/>
+          <ns0:lang ns0:eastAsia="ko-KR"/>
+        </ns0:rPr>
+      </ns0:r>
+      <ns0:r ns0:rsidRPr="005A6394">
+        <ns0:rPr>
+          <ns0:rFonts ns0:ascii="굴림" ns0:eastAsia="굴림" ns0:hAnsi="굴림" ns0:cs="굴림"/>
+          <ns0:lang ns0:eastAsia="ko-KR"/>
+        </ns0:rPr>
+      </ns0:r>
+      <ns0:r ns0:rsidRPr="005A6394">
+        <ns0:rPr>
+          <ns0:rFonts ns0:ascii="굴림" ns0:eastAsia="굴림" ns0:hAnsi="굴림" ns0:cs="굴림"/>
+          <ns0:lang ns0:eastAsia="ko-KR"/>
+        </ns0:rPr>
+      </ns0:r>
+      <ns0:r ns0:rsidRPr="005A6394">
+        <ns0:rPr>
+          <ns0:rFonts ns0:ascii="굴림" ns0:eastAsia="굴림" ns0:hAnsi="굴림" ns0:cs="굴림"/>
+          <ns0:lang ns0:eastAsia="ko-KR"/>
+        </ns0:rPr>
+      </ns0:r>
+      <ns0:r ns0:rsidRPr="005A6394">
+        <ns0:rPr>
+          <ns0:rFonts ns0:ascii="굴림" ns0:eastAsia="굴림" ns0:hAnsi="굴림" ns0:cs="굴림"/>
+          <ns0:lang ns0:eastAsia="ko-KR"/>
+        </ns0:rPr>
+      </ns0:r>
+      <ns0:r ns0:rsidRPr="005A6394">
+        <ns0:rPr>
+          <ns0:rFonts ns0:ascii="굴림" ns0:eastAsia="굴림" ns0:hAnsi="굴림" ns0:cs="굴림"/>
+          <ns0:lang ns0:eastAsia="ko-KR"/>
+        </ns0:rPr>
+      </ns0:r>
+      <ns0:r ns0:rsidRPr="005A6394">
+        <ns0:rPr>
+          <ns0:rFonts ns0:ascii="굴림" ns0:eastAsia="굴림" ns0:hAnsi="굴림" ns0:cs="굴림"/>
+          <ns0:lang ns0:eastAsia="ko-KR"/>
+        </ns0:rPr>
+      </ns0:r>
+      <ns0:r ns0:rsidRPr="005A6394">
+        <ns0:rPr>
+          <ns0:rFonts ns0:ascii="굴림" ns0:eastAsia="굴림" ns0:hAnsi="굴림" ns0:cs="굴림"/>
+          <ns0:lang ns0:eastAsia="ko-KR"/>
+        </ns0:rPr>
+      </ns0:r>
+      <ns0:r ns0:rsidRPr="005A6394">
+        <ns0:rPr>
+          <ns0:rFonts ns0:ascii="굴림" ns0:eastAsia="굴림" ns0:hAnsi="굴림" ns0:cs="굴림"/>
+          <ns0:lang ns0:eastAsia="ko-KR"/>
+        </ns0:rPr>
+      </ns0:r>
+      <ns0:r ns0:rsidRPr="005A6394">
+        <ns0:rPr>
+          <ns0:rFonts ns0:ascii="굴림" ns0:eastAsia="굴림" ns0:hAnsi="굴림" ns0:cs="굴림"/>
+          <ns0:lang ns0:eastAsia="ko-KR"/>
+        </ns0:rPr>
+      </ns0:r>
+      <ns0:r ns0:rsidRPr="005A6394">
+        <ns0:rPr>
+          <ns0:rFonts ns0:ascii="굴림" ns0:eastAsia="굴림" ns0:hAnsi="굴림" ns0:cs="굴림"/>
+          <ns0:lang ns0:eastAsia="ko-KR"/>
+        </ns0:rPr>
+      </ns0:r>
+      <ns0:r ns0:rsidRPr="005A6394">
+        <ns0:rPr>
+          <ns0:rFonts ns0:ascii="굴림" ns0:eastAsia="굴림" ns0:hAnsi="굴림" ns0:cs="굴림"/>
+          <ns0:lang ns0:eastAsia="ko-KR"/>
+        </ns0:rPr>
+      </ns0:r>
+      <ns0:r ns0:rsidRPr="005A6394">
+        <ns0:rPr>
+          <ns0:rFonts ns0:ascii="굴림" ns0:eastAsia="굴림" ns0:hAnsi="굴림" ns0:cs="굴림"/>
+          <ns0:lang ns0:eastAsia="ko-KR"/>
+        </ns0:rPr>
+      </ns0:r>
+      <ns0:r ns0:rsidRPr="005A6394">
+        <ns0:rPr>
+          <ns0:rFonts ns0:ascii="굴림" ns0:eastAsia="굴림" ns0:hAnsi="굴림" ns0:cs="굴림"/>
+          <ns0:lang ns0:eastAsia="ko-KR"/>
+        </ns0:rPr>
+      </ns0:r>
+      <ns0:r ns0:rsidRPr="005A6394">
+        <ns0:rPr>
+          <ns0:rFonts ns0:ascii="굴림" ns0:eastAsia="굴림" ns0:hAnsi="굴림" ns0:cs="굴림"/>
+          <ns0:lang ns0:eastAsia="ko-KR"/>
+        </ns0:rPr>
+      </ns0:r>
+      <ns0:r ns0:rsidRPr="005A6394">
+        <ns0:rPr>
+          <ns0:rFonts ns0:ascii="굴림" ns0:eastAsia="굴림" ns0:hAnsi="굴림" ns0:cs="굴림"/>
+          <ns0:lang ns0:eastAsia="ko-KR"/>
+        </ns0:rPr>
+      </ns0:r>
+      <ns0:r ns0:rsidRPr="005A6394">
+        <ns0:rPr>
+          <ns0:rFonts ns0:ascii="굴림" ns0:eastAsia="굴림" ns0:hAnsi="굴림" ns0:cs="굴림"/>
+          <ns0:lang ns0:eastAsia="ko-KR"/>
+        </ns0:rPr>
+      </ns0:r>
+      <ns0:r ns0:rsidRPr="005A6394">
+        <ns0:rPr>
+          <ns0:rFonts ns0:ascii="굴림" ns0:eastAsia="굴림" ns0:hAnsi="굴림" ns0:cs="굴림"/>
+          <ns0:lang ns0:eastAsia="ko-KR"/>
+        </ns0:rPr>
+      </ns0:r>
+      <ns0:r ns0:rsidRPr="005A6394">
+        <ns0:rPr>
+          <ns0:rFonts ns0:ascii="굴림" ns0:eastAsia="굴림" ns0:hAnsi="굴림" ns0:cs="굴림"/>
+          <ns0:lang ns0:eastAsia="ko-KR"/>
+        </ns0:rPr>
+      </ns0:r>
+      <ns0:r ns0:rsidRPr="005A6394">
+        <ns0:rPr>
+          <ns0:rFonts ns0:ascii="굴림" ns0:eastAsia="굴림" ns0:hAnsi="굴림" ns0:cs="굴림"/>
+          <ns0:lang ns0:eastAsia="ko-KR"/>
+        </ns0:rPr>
+      </ns0:r>
+      <ns0:r ns0:rsidRPr="005A6394">
+        <ns0:rPr>
+          <ns0:rFonts ns0:ascii="굴림" ns0:eastAsia="굴림" ns0:hAnsi="굴림" ns0:cs="굴림"/>
+          <ns0:lang ns0:eastAsia="ko-KR"/>
+        </ns0:rPr>
+      </ns0:r>
+      <ns0:r ns0:rsidRPr="005A6394">
+        <ns0:rPr>
+          <ns0:rFonts ns0:ascii="굴림" ns0:eastAsia="굴림" ns0:hAnsi="굴림" ns0:cs="굴림"/>
+          <ns0:lang ns0:eastAsia="ko-KR"/>
+        </ns0:rPr>
+      </ns0:r>
+      <ns0:r ns0:rsidRPr="005A6394">
+        <ns0:rPr>
+          <ns0:rFonts ns0:ascii="굴림" ns0:eastAsia="굴림" ns0:hAnsi="굴림" ns0:cs="굴림"/>
+          <ns0:lang ns0:eastAsia="ko-KR"/>
+        </ns0:rPr>
+      </ns0:r>
+      <ns0:r ns0:rsidRPr="005A6394">
+        <ns0:rPr>
+          <ns0:rFonts ns0:ascii="굴림" ns0:eastAsia="굴림" ns0:hAnsi="굴림" ns0:cs="굴림"/>
+          <ns0:lang ns0:eastAsia="ko-KR"/>
+        </ns0:rPr>
+      </ns0:r>
+      <ns0:r ns0:rsidRPr="005A6394">
+        <ns0:rPr>
+          <ns0:rFonts ns0:ascii="굴림" ns0:eastAsia="굴림" ns0:hAnsi="굴림" ns0:cs="굴림"/>
+          <ns0:lang ns0:eastAsia="ko-KR"/>
+        </ns0:rPr>
+      </ns0:r>
+      <ns0:r ns0:rsidRPr="005A6394">
+        <ns0:rPr>
+          <ns0:rFonts ns0:ascii="굴림" ns0:eastAsia="굴림" ns0:hAnsi="굴림" ns0:cs="굴림"/>
+          <ns0:lang ns0:eastAsia="ko-KR"/>
+        </ns0:rPr>
+      </ns0:r>
+      <ns0:r ns0:rsidRPr="005A6394">
+        <ns0:rPr>
+          <ns0:rFonts ns0:ascii="굴림" ns0:eastAsia="굴림" ns0:hAnsi="굴림" ns0:cs="굴림"/>
+          <ns0:lang ns0:eastAsia="ko-KR"/>
+        </ns0:rPr>
+      </ns0:r>
+      <ns0:r ns0:rsidRPr="005A6394">
+        <ns0:rPr>
+          <ns0:rFonts ns0:ascii="굴림" ns0:eastAsia="굴림" ns0:hAnsi="굴림" ns0:cs="굴림"/>
+          <ns0:lang ns0:eastAsia="ko-KR"/>
+        </ns0:rPr>
+      </ns0:r>
+      <ns0:r ns0:rsidRPr="005A6394">
+        <ns0:rPr>
+          <ns0:rFonts ns0:ascii="굴림" ns0:eastAsia="굴림" ns0:hAnsi="굴림" ns0:cs="굴림"/>
+          <ns0:lang ns0:eastAsia="ko-KR"/>
+        </ns0:rPr>
+      </ns0:r>
+      <ns0:r ns0:rsidRPr="005A6394">
+        <ns0:rPr>
+          <ns0:rFonts ns0:ascii="굴림" ns0:eastAsia="굴림" ns0:hAnsi="굴림" ns0:cs="굴림"/>
+          <ns0:lang ns0:eastAsia="ko-KR"/>
+        </ns0:rPr>
+      </ns0:r>
+      <ns0:r ns0:rsidRPr="005A6394">
+        <ns0:rPr>
+          <ns0:rFonts ns0:ascii="굴림" ns0:eastAsia="굴림" ns0:hAnsi="굴림" ns0:cs="굴림"/>
+          <ns0:lang ns0:eastAsia="ko-KR"/>
+        </ns0:rPr>
+      </ns0:r>
+      <ns0:r ns0:rsidRPr="005A6394">
+        <ns0:rPr>
+          <ns0:rFonts ns0:ascii="굴림" ns0:eastAsia="굴림" ns0:hAnsi="굴림" ns0:cs="굴림"/>
+          <ns0:lang ns0:eastAsia="ko-KR"/>
+        </ns0:rPr>
+      </ns0:r>
+      <ns0:r ns0:rsidRPr="005A6394">
+        <ns0:rPr>
+          <ns0:rFonts ns0:ascii="굴림" ns0:eastAsia="굴림" ns0:hAnsi="굴림" ns0:cs="굴림"/>
+          <ns0:lang ns0:eastAsia="ko-KR"/>
+        </ns0:rPr>
+      </ns0:r>
+      <ns0:r ns0:rsidRPr="005A6394">
+        <ns0:rPr>
+          <ns0:rFonts ns0:ascii="굴림" ns0:eastAsia="굴림" ns0:hAnsi="굴림" ns0:cs="굴림"/>
+          <ns0:lang ns0:eastAsia="ko-KR"/>
+        </ns0:rPr>
+      </ns0:r>
+      <ns0:r ns0:rsidRPr="005A6394">
+        <ns0:rPr>
+          <ns0:rFonts ns0:ascii="굴림" ns0:eastAsia="굴림" ns0:hAnsi="굴림" ns0:cs="굴림"/>
+          <ns0:lang ns0:eastAsia="ko-KR"/>
+        </ns0:rPr>
+      </ns0:r>
+      <ns0:r ns0:rsidRPr="005A6394">
+        <ns0:rPr>
+          <ns0:rFonts ns0:ascii="굴림" ns0:eastAsia="굴림" ns0:hAnsi="굴림" ns0:cs="굴림"/>
+          <ns0:lang ns0:eastAsia="ko-KR"/>
+        </ns0:rPr>
+      </ns0:r>
+    </ns0:p>
+    <ns0:p ns2:paraId="6FE78441" ns2:textId="77777777" ns0:rsidR="00C903FE" ns0:rsidRPr="005A6394" ns0:rsidRDefault="00361B4A">
+      <ns0:pPr>
+        <ns0:pStyle ns0:val="21"/>
+        <ns0:rPr>
+          <ns0:rFonts ns0:ascii="굴림" ns0:eastAsia="굴림" ns0:hAnsi="굴림"/>
+          <ns0:lang ns0:eastAsia="ko-KR"/>
+        </ns0:rPr>
+      </ns0:pPr>
+      <ns0:r ns0:rsidRPr="005A6394">
+        <ns0:rPr>
+          <ns0:rFonts ns0:ascii="굴림" ns0:eastAsia="굴림" ns0:hAnsi="굴림" ns0:cs="굴림"/>
+          <ns0:lang ns0:eastAsia="ko-KR"/>
+        </ns0:rPr>
+        <ns0:t xml:space="preserve">7.1 가상 LiDAR 장애물 인지 흐름</ns0:t>
+      </ns0:r>
+      <ns0:r ns0:rsidRPr="005A6394">
+        <ns0:rPr>
+          <ns0:rFonts ns0:ascii="굴림" ns0:eastAsia="굴림" ns0:hAnsi="굴림" ns0:cs="굴림"/>
+          <ns0:lang ns0:eastAsia="ko-KR"/>
+        </ns0:rPr>
+      </ns0:r>
+      <ns0:r ns0:rsidRPr="005A6394">
+        <ns0:rPr>
+          <ns0:rFonts ns0:ascii="굴림" ns0:eastAsia="굴림" ns0:hAnsi="굴림" ns0:cs="굴림"/>
+          <ns0:lang ns0:eastAsia="ko-KR"/>
+        </ns0:rPr>
+      </ns0:r>
+      <ns0:r ns0:rsidRPr="005A6394">
+        <ns0:rPr>
+          <ns0:rFonts ns0:ascii="굴림" ns0:eastAsia="굴림" ns0:hAnsi="굴림" ns0:cs="굴림"/>
+          <ns0:lang ns0:eastAsia="ko-KR"/>
+        </ns0:rPr>
+      </ns0:r>
+      <ns0:r ns0:rsidRPr="005A6394">
+        <ns0:rPr>
+          <ns0:rFonts ns0:ascii="굴림" ns0:eastAsia="굴림" ns0:hAnsi="굴림" ns0:cs="굴림"/>
+          <ns0:lang ns0:eastAsia="ko-KR"/>
+        </ns0:rPr>
+      </ns0:r>
+      <ns0:r ns0:rsidRPr="005A6394">
+        <ns0:rPr>
+          <ns0:rFonts ns0:ascii="굴림" ns0:eastAsia="굴림" ns0:hAnsi="굴림" ns0:cs="굴림"/>
+          <ns0:lang ns0:eastAsia="ko-KR"/>
+        </ns0:rPr>
+      </ns0:r>
+      <ns0:r ns0:rsidRPr="005A6394">
+        <ns0:rPr>
+          <ns0:rFonts ns0:ascii="굴림" ns0:eastAsia="굴림" ns0:hAnsi="굴림" ns0:cs="굴림"/>
+          <ns0:lang ns0:eastAsia="ko-KR"/>
+        </ns0:rPr>
+      </ns0:r>
+      <ns0:proofErr ns0:type="spellStart"/>
+      <ns0:r ns0:rsidRPr="005A6394">
+        <ns0:rPr>
+          <ns0:rFonts ns0:ascii="굴림" ns0:eastAsia="굴림" ns0:hAnsi="굴림" ns0:cs="굴림"/>
+          <ns0:lang ns0:eastAsia="ko-KR"/>
+        </ns0:rPr>
+      </ns0:r>
+      <ns0:proofErr ns0:type="spellEnd"/>
+    </ns0:p>
+    <ns0:p ns2:paraId="6F7A3B83" ns2:textId="77777777" ns0:rsidR="00C903FE" ns0:rsidRPr="005A6394" ns0:rsidRDefault="00361B4A">
+      <ns0:pPr>
+        <ns0:rPr>
+          <ns0:rFonts ns0:ascii="굴림" ns0:eastAsia="굴림" ns0:hAnsi="굴림"/>
+          <ns0:lang ns0:eastAsia="ko-KR"/>
+        </ns0:rPr>
+      </ns0:pPr>
+      <ns0:r ns0:rsidRPr="005A6394">
+        <ns0:rPr>
+          <ns0:rFonts ns0:ascii="굴림" ns0:eastAsia="굴림" ns0:hAnsi="굴림" ns0:cs="굴림"/>
+          <ns0:lang ns0:eastAsia="ko-KR"/>
+        </ns0:rPr>
+        <ns0:t xml:space="preserve">현재 구성에서는 RViz의 Bus, Car, Pedestrian 도구가 DetectedObjects를 Planning으로 직접 전달하지 않습니다. 더미 객체의 위치와 형상으로 가상 LiDAR Pointcloud를 만들고 Sensing 전처리와 Perception CPU 검출을 거친 뒤 기존 Tracking, Prediction, Planning, Control 흐름에 연결합니다.</ns0:t>
+      </ns0:r>
+      <ns0:r ns0:rsidRPr="005A6394">
+        <ns0:rPr>
+          <ns0:rFonts ns0:ascii="굴림" ns0:eastAsia="굴림" ns0:hAnsi="굴림" ns0:cs="굴림"/>
+          <ns0:lang ns0:eastAsia="ko-KR"/>
+        </ns0:rPr>
+      </ns0:r>
+      <ns0:r ns0:rsidRPr="005A6394">
+        <ns0:rPr>
+          <ns0:rFonts ns0:ascii="굴림" ns0:eastAsia="굴림" ns0:hAnsi="굴림" ns0:cs="굴림"/>
+          <ns0:lang ns0:eastAsia="ko-KR"/>
+        </ns0:rPr>
+      </ns0:r>
+      <ns0:r ns0:rsidRPr="005A6394">
+        <ns0:rPr>
+          <ns0:rFonts ns0:ascii="굴림" ns0:eastAsia="굴림" ns0:hAnsi="굴림" ns0:cs="굴림"/>
+          <ns0:lang ns0:eastAsia="ko-KR"/>
+        </ns0:rPr>
+      </ns0:r>
+      <ns0:r ns0:rsidRPr="005A6394">
+        <ns0:rPr>
+          <ns0:rFonts ns0:ascii="굴림" ns0:eastAsia="굴림" ns0:hAnsi="굴림" ns0:cs="굴림"/>
+          <ns0:lang ns0:eastAsia="ko-KR"/>
+        </ns0:rPr>
+      </ns0:r>
+      <ns0:r ns0:rsidRPr="005A6394">
+        <ns0:rPr>
+          <ns0:rFonts ns0:ascii="굴림" ns0:eastAsia="굴림" ns0:hAnsi="굴림" ns0:cs="굴림"/>
+          <ns0:lang ns0:eastAsia="ko-KR"/>
+        </ns0:rPr>
+      </ns0:r>
+      <ns0:r ns0:rsidRPr="005A6394">
+        <ns0:rPr>
+          <ns0:rFonts ns0:ascii="굴림" ns0:eastAsia="굴림" ns0:hAnsi="굴림" ns0:cs="굴림"/>
+          <ns0:lang ns0:eastAsia="ko-KR"/>
+        </ns0:rPr>
+      </ns0:r>
+      <ns0:r ns0:rsidRPr="005A6394">
+        <ns0:rPr>
+          <ns0:rFonts ns0:ascii="굴림" ns0:eastAsia="굴림" ns0:hAnsi="굴림" ns0:cs="굴림"/>
+          <ns0:lang ns0:eastAsia="ko-KR"/>
+        </ns0:rPr>
+      </ns0:r>
+      <ns0:r ns0:rsidRPr="005A6394">
+        <ns0:rPr>
+          <ns0:rFonts ns0:ascii="굴림" ns0:eastAsia="굴림" ns0:hAnsi="굴림" ns0:cs="굴림"/>
+          <ns0:lang ns0:eastAsia="ko-KR"/>
+        </ns0:rPr>
+      </ns0:r>
+      <ns0:r ns0:rsidRPr="005A6394">
+        <ns0:rPr>
+          <ns0:rFonts ns0:ascii="굴림" ns0:eastAsia="굴림" ns0:hAnsi="굴림" ns0:cs="굴림"/>
+          <ns0:lang ns0:eastAsia="ko-KR"/>
+        </ns0:rPr>
+      </ns0:r>
+      <ns0:r ns0:rsidRPr="005A6394">
+        <ns0:rPr>
+          <ns0:rFonts ns0:ascii="굴림" ns0:eastAsia="굴림" ns0:hAnsi="굴림" ns0:cs="굴림"/>
+          <ns0:lang ns0:eastAsia="ko-KR"/>
+        </ns0:rPr>
+      </ns0:r>
+      <ns0:r ns0:rsidRPr="005A6394">
+        <ns0:rPr>
+          <ns0:rFonts ns0:ascii="굴림" ns0:eastAsia="굴림" ns0:hAnsi="굴림" ns0:cs="굴림"/>
+          <ns0:lang ns0:eastAsia="ko-KR"/>
+        </ns0:rPr>
+      </ns0:r>
+      <ns0:r ns0:rsidRPr="005A6394">
+        <ns0:rPr>
+          <ns0:rFonts ns0:ascii="굴림" ns0:eastAsia="굴림" ns0:hAnsi="굴림" ns0:cs="굴림"/>
+          <ns0:lang ns0:eastAsia="ko-KR"/>
+        </ns0:rPr>
+      </ns0:r>
+      <ns0:r ns0:rsidRPr="005A6394">
+        <ns0:rPr>
+          <ns0:rFonts ns0:ascii="굴림" ns0:eastAsia="굴림" ns0:hAnsi="굴림" ns0:cs="굴림"/>
+          <ns0:lang ns0:eastAsia="ko-KR"/>
+        </ns0:rPr>
+      </ns0:r>
+      <ns0:r ns0:rsidRPr="005A6394">
+        <ns0:rPr>
+          <ns0:rFonts ns0:ascii="굴림" ns0:eastAsia="굴림" ns0:hAnsi="굴림" ns0:cs="굴림"/>
+          <ns0:lang ns0:eastAsia="ko-KR"/>
+        </ns0:rPr>
+      </ns0:r>
+      <ns0:r ns0:rsidRPr="005A6394">
+        <ns0:rPr>
+          <ns0:rFonts ns0:ascii="굴림" ns0:eastAsia="굴림" ns0:hAnsi="굴림" ns0:cs="굴림"/>
+          <ns0:lang ns0:eastAsia="ko-KR"/>
+        </ns0:rPr>
+      </ns0:r>
+      <ns0:r ns0:rsidRPr="005A6394">
+        <ns0:rPr>
+          <ns0:rFonts ns0:ascii="굴림" ns0:eastAsia="굴림" ns0:hAnsi="굴림" ns0:cs="굴림"/>
+          <ns0:lang ns0:eastAsia="ko-KR"/>
+        </ns0:rPr>
+      </ns0:r>
+      <ns0:r ns0:rsidRPr="005A6394">
+        <ns0:rPr>
+          <ns0:rFonts ns0:ascii="굴림" ns0:eastAsia="굴림" ns0:hAnsi="굴림" ns0:cs="굴림"/>
+          <ns0:lang ns0:eastAsia="ko-KR"/>
+        </ns0:rPr>
+      </ns0:r>
+      <ns0:r ns0:rsidRPr="005A6394">
+        <ns0:rPr>
+          <ns0:rFonts ns0:ascii="굴림" ns0:eastAsia="굴림" ns0:hAnsi="굴림" ns0:cs="굴림"/>
+          <ns0:lang ns0:eastAsia="ko-KR"/>
+        </ns0:rPr>
+      </ns0:r>
+      <ns0:r ns0:rsidRPr="005A6394">
+        <ns0:rPr>
+          <ns0:rFonts ns0:ascii="굴림" ns0:eastAsia="굴림" ns0:hAnsi="굴림" ns0:cs="굴림"/>
+          <ns0:lang ns0:eastAsia="ko-KR"/>
+        </ns0:rPr>
+      </ns0:r>
+      <ns0:r ns0:rsidRPr="005A6394">
+        <ns0:rPr>
+          <ns0:rFonts ns0:ascii="굴림" ns0:eastAsia="굴림" ns0:hAnsi="굴림" ns0:cs="굴림"/>
+          <ns0:lang ns0:eastAsia="ko-KR"/>
+        </ns0:rPr>
+      </ns0:r>
+      <ns0:r ns0:rsidRPr="005A6394">
+        <ns0:rPr>
+          <ns0:rFonts ns0:ascii="굴림" ns0:eastAsia="굴림" ns0:hAnsi="굴림" ns0:cs="굴림"/>
+          <ns0:lang ns0:eastAsia="ko-KR"/>
+        </ns0:rPr>
+      </ns0:r>
+      <ns0:r ns0:rsidRPr="005A6394">
+        <ns0:rPr>
+          <ns0:rFonts ns0:ascii="굴림" ns0:eastAsia="굴림" ns0:hAnsi="굴림" ns0:cs="굴림"/>
+          <ns0:lang ns0:eastAsia="ko-KR"/>
+        </ns0:rPr>
+      </ns0:r>
+      <ns0:r ns0:rsidRPr="005A6394">
+        <ns0:rPr>
+          <ns0:rFonts ns0:ascii="굴림" ns0:eastAsia="굴림" ns0:hAnsi="굴림" ns0:cs="굴림"/>
+          <ns0:lang ns0:eastAsia="ko-KR"/>
+        </ns0:rPr>
+      </ns0:r>
+      <ns0:r ns0:rsidRPr="005A6394">
+        <ns0:rPr>
+          <ns0:rFonts ns0:ascii="굴림" ns0:eastAsia="굴림" ns0:hAnsi="굴림" ns0:cs="굴림"/>
+          <ns0:lang ns0:eastAsia="ko-KR"/>
+        </ns0:rPr>
+      </ns0:r>
+      <ns0:r ns0:rsidRPr="005A6394">
+        <ns0:rPr>
+          <ns0:rFonts ns0:ascii="굴림" ns0:eastAsia="굴림" ns0:hAnsi="굴림" ns0:cs="굴림"/>
+          <ns0:lang ns0:eastAsia="ko-KR"/>
+        </ns0:rPr>
+      </ns0:r>
+      <ns0:r ns0:rsidRPr="005A6394">
+        <ns0:rPr>
+          <ns0:rFonts ns0:ascii="굴림" ns0:eastAsia="굴림" ns0:hAnsi="굴림" ns0:cs="굴림"/>
+          <ns0:lang ns0:eastAsia="ko-KR"/>
+        </ns0:rPr>
+      </ns0:r>
+      <ns0:r ns0:rsidRPr="005A6394">
+        <ns0:rPr>
+          <ns0:rFonts ns0:ascii="굴림" ns0:eastAsia="굴림" ns0:hAnsi="굴림" ns0:cs="굴림"/>
+          <ns0:lang ns0:eastAsia="ko-KR"/>
+        </ns0:rPr>
+      </ns0:r>
+      <ns0:r ns0:rsidRPr="005A6394">
+        <ns0:rPr>
+          <ns0:rFonts ns0:ascii="굴림" ns0:eastAsia="굴림" ns0:hAnsi="굴림" ns0:cs="굴림"/>
+          <ns0:lang ns0:eastAsia="ko-KR"/>
+        </ns0:rPr>
+      </ns0:r>
+      <ns0:r ns0:rsidRPr="005A6394">
+        <ns0:rPr>
+          <ns0:rFonts ns0:ascii="굴림" ns0:eastAsia="굴림" ns0:hAnsi="굴림" ns0:cs="굴림"/>
+          <ns0:lang ns0:eastAsia="ko-KR"/>
+        </ns0:rPr>
+      </ns0:r>
+      <ns0:r ns0:rsidRPr="005A6394">
+        <ns0:rPr>
+          <ns0:rFonts ns0:ascii="굴림" ns0:eastAsia="굴림" ns0:hAnsi="굴림" ns0:cs="굴림"/>
+          <ns0:lang ns0:eastAsia="ko-KR"/>
+        </ns0:rPr>
+      </ns0:r>
+      <ns0:r ns0:rsidRPr="005A6394">
+        <ns0:rPr>
+          <ns0:rFonts ns0:ascii="굴림" ns0:eastAsia="굴림" ns0:hAnsi="굴림" ns0:cs="굴림"/>
+          <ns0:lang ns0:eastAsia="ko-KR"/>
+        </ns0:rPr>
+      </ns0:r>
+      <ns0:r ns0:rsidRPr="005A6394">
+        <ns0:rPr>
+          <ns0:rFonts ns0:ascii="굴림" ns0:eastAsia="굴림" ns0:hAnsi="굴림" ns0:cs="굴림"/>
+          <ns0:lang ns0:eastAsia="ko-KR"/>
+        </ns0:rPr>
+      </ns0:r>
+      <ns0:r ns0:rsidRPr="005A6394">
+        <ns0:rPr>
+          <ns0:rFonts ns0:ascii="굴림" ns0:eastAsia="굴림" ns0:hAnsi="굴림" ns0:cs="굴림"/>
+          <ns0:lang ns0:eastAsia="ko-KR"/>
+        </ns0:rPr>
+      </ns0:r>
+      <ns0:r ns0:rsidRPr="005A6394">
+        <ns0:rPr>
+          <ns0:rFonts ns0:ascii="굴림" ns0:eastAsia="굴림" ns0:hAnsi="굴림" ns0:cs="굴림"/>
+          <ns0:lang ns0:eastAsia="ko-KR"/>
+        </ns0:rPr>
+      </ns0:r>
+      <ns0:r ns0:rsidRPr="005A6394">
+        <ns0:rPr>
+          <ns0:rFonts ns0:ascii="굴림" ns0:eastAsia="굴림" ns0:hAnsi="굴림" ns0:cs="굴림"/>
+          <ns0:lang ns0:eastAsia="ko-KR"/>
+        </ns0:rPr>
+      </ns0:r>
+      <ns0:r ns0:rsidRPr="005A6394">
+        <ns0:rPr>
+          <ns0:rFonts ns0:ascii="굴림" ns0:eastAsia="굴림" ns0:hAnsi="굴림" ns0:cs="굴림"/>
+          <ns0:lang ns0:eastAsia="ko-KR"/>
+        </ns0:rPr>
+      </ns0:r>
+      <ns0:r ns0:rsidRPr="005A6394">
+        <ns0:rPr>
+          <ns0:rFonts ns0:ascii="굴림" ns0:eastAsia="굴림" ns0:hAnsi="굴림" ns0:cs="굴림"/>
+          <ns0:lang ns0:eastAsia="ko-KR"/>
+        </ns0:rPr>
+      </ns0:r>
+      <ns0:r ns0:rsidRPr="005A6394">
+        <ns0:rPr>
+          <ns0:rFonts ns0:ascii="굴림" ns0:eastAsia="굴림" ns0:hAnsi="굴림" ns0:cs="굴림"/>
+          <ns0:lang ns0:eastAsia="ko-KR"/>
+        </ns0:rPr>
+      </ns0:r>
+      <ns0:r ns0:rsidRPr="005A6394">
+        <ns0:rPr>
+          <ns0:rFonts ns0:ascii="굴림" ns0:eastAsia="굴림" ns0:hAnsi="굴림" ns0:cs="굴림"/>
+          <ns0:lang ns0:eastAsia="ko-KR"/>
+        </ns0:rPr>
+      </ns0:r>
+      <ns0:r ns0:rsidRPr="005A6394">
+        <ns0:rPr>
+          <ns0:rFonts ns0:ascii="굴림" ns0:eastAsia="굴림" ns0:hAnsi="굴림" ns0:cs="굴림"/>
+          <ns0:lang ns0:eastAsia="ko-KR"/>
+        </ns0:rPr>
+      </ns0:r>
+      <ns0:r ns0:rsidRPr="005A6394">
+        <ns0:rPr>
+          <ns0:rFonts ns0:ascii="굴림" ns0:eastAsia="굴림" ns0:hAnsi="굴림" ns0:cs="굴림"/>
+          <ns0:lang ns0:eastAsia="ko-KR"/>
+        </ns0:rPr>
+      </ns0:r>
+      <ns0:r ns0:rsidRPr="005A6394">
+        <ns0:rPr>
+          <ns0:rFonts ns0:ascii="굴림" ns0:eastAsia="굴림" ns0:hAnsi="굴림" ns0:cs="굴림"/>
+          <ns0:lang ns0:eastAsia="ko-KR"/>
+        </ns0:rPr>
+      </ns0:r>
+      <ns0:r ns0:rsidRPr="005A6394">
+        <ns0:rPr>
+          <ns0:rFonts ns0:ascii="굴림" ns0:eastAsia="굴림" ns0:hAnsi="굴림" ns0:cs="굴림"/>
+          <ns0:lang ns0:eastAsia="ko-KR"/>
+        </ns0:rPr>
+      </ns0:r>
+    </ns0:p>
+    <ns0:p ns2:paraId="6FE78441" ns2:textId="77777777" ns0:rsidR="00C903FE" ns0:rsidRPr="005A6394" ns0:rsidRDefault="00361B4A">
+      <ns0:pPr>
+        <ns0:pStyle ns0:val="21"/>
+        <ns0:rPr>
+          <ns0:rFonts ns0:ascii="굴림" ns0:eastAsia="굴림" ns0:hAnsi="굴림"/>
+          <ns0:lang ns0:eastAsia="ko-KR"/>
+        </ns0:rPr>
+      </ns0:pPr>
+      <ns0:r ns0:rsidRPr="005A6394">
+        <ns0:rPr>
+          <ns0:rFonts ns0:ascii="굴림" ns0:eastAsia="굴림" ns0:hAnsi="굴림" ns0:cs="굴림"/>
+          <ns0:lang ns0:eastAsia="ko-KR"/>
+        </ns0:rPr>
+        <ns0:t xml:space="preserve">처리 흐름</ns0:t>
+      </ns0:r>
+      <ns0:r ns0:rsidRPr="005A6394">
+        <ns0:rPr>
+          <ns0:rFonts ns0:ascii="굴림" ns0:eastAsia="굴림" ns0:hAnsi="굴림" ns0:cs="굴림"/>
+          <ns0:lang ns0:eastAsia="ko-KR"/>
+        </ns0:rPr>
+      </ns0:r>
+      <ns0:r ns0:rsidRPr="005A6394">
+        <ns0:rPr>
+          <ns0:rFonts ns0:ascii="굴림" ns0:eastAsia="굴림" ns0:hAnsi="굴림" ns0:cs="굴림"/>
+          <ns0:lang ns0:eastAsia="ko-KR"/>
+        </ns0:rPr>
+      </ns0:r>
+      <ns0:r ns0:rsidRPr="005A6394">
+        <ns0:rPr>
+          <ns0:rFonts ns0:ascii="굴림" ns0:eastAsia="굴림" ns0:hAnsi="굴림" ns0:cs="굴림"/>
+          <ns0:lang ns0:eastAsia="ko-KR"/>
+        </ns0:rPr>
+      </ns0:r>
+      <ns0:r ns0:rsidRPr="005A6394">
+        <ns0:rPr>
+          <ns0:rFonts ns0:ascii="굴림" ns0:eastAsia="굴림" ns0:hAnsi="굴림" ns0:cs="굴림"/>
+          <ns0:lang ns0:eastAsia="ko-KR"/>
+        </ns0:rPr>
+      </ns0:r>
+      <ns0:r ns0:rsidRPr="005A6394">
+        <ns0:rPr>
+          <ns0:rFonts ns0:ascii="굴림" ns0:eastAsia="굴림" ns0:hAnsi="굴림" ns0:cs="굴림"/>
+          <ns0:lang ns0:eastAsia="ko-KR"/>
+        </ns0:rPr>
+      </ns0:r>
+      <ns0:r ns0:rsidRPr="005A6394">
+        <ns0:rPr>
+          <ns0:rFonts ns0:ascii="굴림" ns0:eastAsia="굴림" ns0:hAnsi="굴림" ns0:cs="굴림"/>
+          <ns0:lang ns0:eastAsia="ko-KR"/>
+        </ns0:rPr>
+      </ns0:r>
+      <ns0:proofErr ns0:type="spellStart"/>
+      <ns0:r ns0:rsidRPr="005A6394">
+        <ns0:rPr>
+          <ns0:rFonts ns0:ascii="굴림" ns0:eastAsia="굴림" ns0:hAnsi="굴림" ns0:cs="굴림"/>
+          <ns0:lang ns0:eastAsia="ko-KR"/>
+        </ns0:rPr>
+      </ns0:r>
+      <ns0:proofErr ns0:type="spellEnd"/>
+    </ns0:p>
+    <ns0:p ns2:paraId="6F7A3B83" ns2:textId="77777777" ns0:rsidR="00C903FE" ns0:rsidRPr="005A6394" ns0:rsidRDefault="00361B4A">
+      <ns0:pPr>
+        <ns0:rPr>
+          <ns0:rFonts ns0:ascii="굴림" ns0:eastAsia="굴림" ns0:hAnsi="굴림"/>
+          <ns0:lang ns0:eastAsia="ko-KR"/>
+        </ns0:rPr>
+      </ns0:pPr>
+      <ns0:r ns0:rsidRPr="005A6394">
+        <ns0:rPr>
+          <ns0:rFonts ns0:ascii="굴림" ns0:eastAsia="굴림" ns0:hAnsi="굴림" ns0:cs="굴림"/>
+          <ns0:lang ns0:eastAsia="ko-KR"/>
+        </ns0:rPr>
+        <ns0:t xml:space="preserve">RViz tier4_dummy_object_rviz_plugin → /simulation/dummy_perception_publisher/object_info → autoware_dummy_perception_publisher → /sensing/lidar/virtual/pointcloud_raw → voxel_grid_downsample_filter_node → /sensing/lidar/concatenated/pointcloud → crop_box_filter_node → /perception/obstacle_segmentation/pointcloud → virtual_lidar_euclidean_cluster → /perception/object_recognition/detection/labeled_clusters → shape_estimation → multi_object_tracker → map_based_prediction → /perception/object_recognition/objects → Planning → Control</ns0:t>
+      </ns0:r>
+      <ns0:r ns0:rsidRPr="005A6394">
+        <ns0:rPr>
+          <ns0:rFonts ns0:ascii="굴림" ns0:eastAsia="굴림" ns0:hAnsi="굴림" ns0:cs="굴림"/>
+          <ns0:lang ns0:eastAsia="ko-KR"/>
+        </ns0:rPr>
+      </ns0:r>
+      <ns0:r ns0:rsidRPr="005A6394">
+        <ns0:rPr>
+          <ns0:rFonts ns0:ascii="굴림" ns0:eastAsia="굴림" ns0:hAnsi="굴림" ns0:cs="굴림"/>
+          <ns0:lang ns0:eastAsia="ko-KR"/>
+        </ns0:rPr>
+      </ns0:r>
+      <ns0:r ns0:rsidRPr="005A6394">
+        <ns0:rPr>
+          <ns0:rFonts ns0:ascii="굴림" ns0:eastAsia="굴림" ns0:hAnsi="굴림" ns0:cs="굴림"/>
+          <ns0:lang ns0:eastAsia="ko-KR"/>
+        </ns0:rPr>
+      </ns0:r>
+      <ns0:r ns0:rsidRPr="005A6394">
+        <ns0:rPr>
+          <ns0:rFonts ns0:ascii="굴림" ns0:eastAsia="굴림" ns0:hAnsi="굴림" ns0:cs="굴림"/>
+          <ns0:lang ns0:eastAsia="ko-KR"/>
+        </ns0:rPr>
+      </ns0:r>
+      <ns0:r ns0:rsidRPr="005A6394">
+        <ns0:rPr>
+          <ns0:rFonts ns0:ascii="굴림" ns0:eastAsia="굴림" ns0:hAnsi="굴림" ns0:cs="굴림"/>
+          <ns0:lang ns0:eastAsia="ko-KR"/>
+        </ns0:rPr>
+      </ns0:r>
+      <ns0:r ns0:rsidRPr="005A6394">
+        <ns0:rPr>
+          <ns0:rFonts ns0:ascii="굴림" ns0:eastAsia="굴림" ns0:hAnsi="굴림" ns0:cs="굴림"/>
+          <ns0:lang ns0:eastAsia="ko-KR"/>
+        </ns0:rPr>
+      </ns0:r>
+      <ns0:r ns0:rsidRPr="005A6394">
+        <ns0:rPr>
+          <ns0:rFonts ns0:ascii="굴림" ns0:eastAsia="굴림" ns0:hAnsi="굴림" ns0:cs="굴림"/>
+          <ns0:lang ns0:eastAsia="ko-KR"/>
+        </ns0:rPr>
+      </ns0:r>
+      <ns0:r ns0:rsidRPr="005A6394">
+        <ns0:rPr>
+          <ns0:rFonts ns0:ascii="굴림" ns0:eastAsia="굴림" ns0:hAnsi="굴림" ns0:cs="굴림"/>
+          <ns0:lang ns0:eastAsia="ko-KR"/>
+        </ns0:rPr>
+      </ns0:r>
+      <ns0:r ns0:rsidRPr="005A6394">
+        <ns0:rPr>
+          <ns0:rFonts ns0:ascii="굴림" ns0:eastAsia="굴림" ns0:hAnsi="굴림" ns0:cs="굴림"/>
+          <ns0:lang ns0:eastAsia="ko-KR"/>
+        </ns0:rPr>
+      </ns0:r>
+      <ns0:r ns0:rsidRPr="005A6394">
+        <ns0:rPr>
+          <ns0:rFonts ns0:ascii="굴림" ns0:eastAsia="굴림" ns0:hAnsi="굴림" ns0:cs="굴림"/>
+          <ns0:lang ns0:eastAsia="ko-KR"/>
+        </ns0:rPr>
+      </ns0:r>
+      <ns0:r ns0:rsidRPr="005A6394">
+        <ns0:rPr>
+          <ns0:rFonts ns0:ascii="굴림" ns0:eastAsia="굴림" ns0:hAnsi="굴림" ns0:cs="굴림"/>
+          <ns0:lang ns0:eastAsia="ko-KR"/>
+        </ns0:rPr>
+      </ns0:r>
+      <ns0:r ns0:rsidRPr="005A6394">
+        <ns0:rPr>
+          <ns0:rFonts ns0:ascii="굴림" ns0:eastAsia="굴림" ns0:hAnsi="굴림" ns0:cs="굴림"/>
+          <ns0:lang ns0:eastAsia="ko-KR"/>
+        </ns0:rPr>
+      </ns0:r>
+      <ns0:r ns0:rsidRPr="005A6394">
+        <ns0:rPr>
+          <ns0:rFonts ns0:ascii="굴림" ns0:eastAsia="굴림" ns0:hAnsi="굴림" ns0:cs="굴림"/>
+          <ns0:lang ns0:eastAsia="ko-KR"/>
+        </ns0:rPr>
+      </ns0:r>
+      <ns0:r ns0:rsidRPr="005A6394">
+        <ns0:rPr>
+          <ns0:rFonts ns0:ascii="굴림" ns0:eastAsia="굴림" ns0:hAnsi="굴림" ns0:cs="굴림"/>
+          <ns0:lang ns0:eastAsia="ko-KR"/>
+        </ns0:rPr>
+      </ns0:r>
+      <ns0:r ns0:rsidRPr="005A6394">
+        <ns0:rPr>
+          <ns0:rFonts ns0:ascii="굴림" ns0:eastAsia="굴림" ns0:hAnsi="굴림" ns0:cs="굴림"/>
+          <ns0:lang ns0:eastAsia="ko-KR"/>
+        </ns0:rPr>
+      </ns0:r>
+      <ns0:r ns0:rsidRPr="005A6394">
+        <ns0:rPr>
+          <ns0:rFonts ns0:ascii="굴림" ns0:eastAsia="굴림" ns0:hAnsi="굴림" ns0:cs="굴림"/>
+          <ns0:lang ns0:eastAsia="ko-KR"/>
+        </ns0:rPr>
+      </ns0:r>
+      <ns0:r ns0:rsidRPr="005A6394">
+        <ns0:rPr>
+          <ns0:rFonts ns0:ascii="굴림" ns0:eastAsia="굴림" ns0:hAnsi="굴림" ns0:cs="굴림"/>
+          <ns0:lang ns0:eastAsia="ko-KR"/>
+        </ns0:rPr>
+      </ns0:r>
+      <ns0:r ns0:rsidRPr="005A6394">
+        <ns0:rPr>
+          <ns0:rFonts ns0:ascii="굴림" ns0:eastAsia="굴림" ns0:hAnsi="굴림" ns0:cs="굴림"/>
+          <ns0:lang ns0:eastAsia="ko-KR"/>
+        </ns0:rPr>
+      </ns0:r>
+      <ns0:r ns0:rsidRPr="005A6394">
+        <ns0:rPr>
+          <ns0:rFonts ns0:ascii="굴림" ns0:eastAsia="굴림" ns0:hAnsi="굴림" ns0:cs="굴림"/>
+          <ns0:lang ns0:eastAsia="ko-KR"/>
+        </ns0:rPr>
+      </ns0:r>
+      <ns0:r ns0:rsidRPr="005A6394">
+        <ns0:rPr>
+          <ns0:rFonts ns0:ascii="굴림" ns0:eastAsia="굴림" ns0:hAnsi="굴림" ns0:cs="굴림"/>
+          <ns0:lang ns0:eastAsia="ko-KR"/>
+        </ns0:rPr>
+      </ns0:r>
+      <ns0:r ns0:rsidRPr="005A6394">
+        <ns0:rPr>
+          <ns0:rFonts ns0:ascii="굴림" ns0:eastAsia="굴림" ns0:hAnsi="굴림" ns0:cs="굴림"/>
+          <ns0:lang ns0:eastAsia="ko-KR"/>
+        </ns0:rPr>
+      </ns0:r>
+      <ns0:r ns0:rsidRPr="005A6394">
+        <ns0:rPr>
+          <ns0:rFonts ns0:ascii="굴림" ns0:eastAsia="굴림" ns0:hAnsi="굴림" ns0:cs="굴림"/>
+          <ns0:lang ns0:eastAsia="ko-KR"/>
+        </ns0:rPr>
+      </ns0:r>
+      <ns0:r ns0:rsidRPr="005A6394">
+        <ns0:rPr>
+          <ns0:rFonts ns0:ascii="굴림" ns0:eastAsia="굴림" ns0:hAnsi="굴림" ns0:cs="굴림"/>
+          <ns0:lang ns0:eastAsia="ko-KR"/>
+        </ns0:rPr>
+      </ns0:r>
+      <ns0:r ns0:rsidRPr="005A6394">
+        <ns0:rPr>
+          <ns0:rFonts ns0:ascii="굴림" ns0:eastAsia="굴림" ns0:hAnsi="굴림" ns0:cs="굴림"/>
+          <ns0:lang ns0:eastAsia="ko-KR"/>
+        </ns0:rPr>
+      </ns0:r>
+      <ns0:r ns0:rsidRPr="005A6394">
+        <ns0:rPr>
+          <ns0:rFonts ns0:ascii="굴림" ns0:eastAsia="굴림" ns0:hAnsi="굴림" ns0:cs="굴림"/>
+          <ns0:lang ns0:eastAsia="ko-KR"/>
+        </ns0:rPr>
+      </ns0:r>
+      <ns0:r ns0:rsidRPr="005A6394">
+        <ns0:rPr>
+          <ns0:rFonts ns0:ascii="굴림" ns0:eastAsia="굴림" ns0:hAnsi="굴림" ns0:cs="굴림"/>
+          <ns0:lang ns0:eastAsia="ko-KR"/>
+        </ns0:rPr>
+      </ns0:r>
+      <ns0:r ns0:rsidRPr="005A6394">
+        <ns0:rPr>
+          <ns0:rFonts ns0:ascii="굴림" ns0:eastAsia="굴림" ns0:hAnsi="굴림" ns0:cs="굴림"/>
+          <ns0:lang ns0:eastAsia="ko-KR"/>
+        </ns0:rPr>
+      </ns0:r>
+      <ns0:r ns0:rsidRPr="005A6394">
+        <ns0:rPr>
+          <ns0:rFonts ns0:ascii="굴림" ns0:eastAsia="굴림" ns0:hAnsi="굴림" ns0:cs="굴림"/>
+          <ns0:lang ns0:eastAsia="ko-KR"/>
+        </ns0:rPr>
+      </ns0:r>
+      <ns0:r ns0:rsidRPr="005A6394">
+        <ns0:rPr>
+          <ns0:rFonts ns0:ascii="굴림" ns0:eastAsia="굴림" ns0:hAnsi="굴림" ns0:cs="굴림"/>
+          <ns0:lang ns0:eastAsia="ko-KR"/>
+        </ns0:rPr>
+      </ns0:r>
+      <ns0:r ns0:rsidRPr="005A6394">
+        <ns0:rPr>
+          <ns0:rFonts ns0:ascii="굴림" ns0:eastAsia="굴림" ns0:hAnsi="굴림" ns0:cs="굴림"/>
+          <ns0:lang ns0:eastAsia="ko-KR"/>
+        </ns0:rPr>
+      </ns0:r>
+      <ns0:r ns0:rsidRPr="005A6394">
+        <ns0:rPr>
+          <ns0:rFonts ns0:ascii="굴림" ns0:eastAsia="굴림" ns0:hAnsi="굴림" ns0:cs="굴림"/>
+          <ns0:lang ns0:eastAsia="ko-KR"/>
+        </ns0:rPr>
+      </ns0:r>
+      <ns0:r ns0:rsidRPr="005A6394">
+        <ns0:rPr>
+          <ns0:rFonts ns0:ascii="굴림" ns0:eastAsia="굴림" ns0:hAnsi="굴림" ns0:cs="굴림"/>
+          <ns0:lang ns0:eastAsia="ko-KR"/>
+        </ns0:rPr>
+      </ns0:r>
+      <ns0:r ns0:rsidRPr="005A6394">
+        <ns0:rPr>
+          <ns0:rFonts ns0:ascii="굴림" ns0:eastAsia="굴림" ns0:hAnsi="굴림" ns0:cs="굴림"/>
+          <ns0:lang ns0:eastAsia="ko-KR"/>
+        </ns0:rPr>
+      </ns0:r>
+      <ns0:r ns0:rsidRPr="005A6394">
+        <ns0:rPr>
+          <ns0:rFonts ns0:ascii="굴림" ns0:eastAsia="굴림" ns0:hAnsi="굴림" ns0:cs="굴림"/>
+          <ns0:lang ns0:eastAsia="ko-KR"/>
+        </ns0:rPr>
+      </ns0:r>
+      <ns0:r ns0:rsidRPr="005A6394">
+        <ns0:rPr>
+          <ns0:rFonts ns0:ascii="굴림" ns0:eastAsia="굴림" ns0:hAnsi="굴림" ns0:cs="굴림"/>
+          <ns0:lang ns0:eastAsia="ko-KR"/>
+        </ns0:rPr>
+      </ns0:r>
+      <ns0:r ns0:rsidRPr="005A6394">
+        <ns0:rPr>
+          <ns0:rFonts ns0:ascii="굴림" ns0:eastAsia="굴림" ns0:hAnsi="굴림" ns0:cs="굴림"/>
+          <ns0:lang ns0:eastAsia="ko-KR"/>
+        </ns0:rPr>
+      </ns0:r>
+      <ns0:r ns0:rsidRPr="005A6394">
+        <ns0:rPr>
+          <ns0:rFonts ns0:ascii="굴림" ns0:eastAsia="굴림" ns0:hAnsi="굴림" ns0:cs="굴림"/>
+          <ns0:lang ns0:eastAsia="ko-KR"/>
+        </ns0:rPr>
+      </ns0:r>
+      <ns0:r ns0:rsidRPr="005A6394">
+        <ns0:rPr>
+          <ns0:rFonts ns0:ascii="굴림" ns0:eastAsia="굴림" ns0:hAnsi="굴림" ns0:cs="굴림"/>
+          <ns0:lang ns0:eastAsia="ko-KR"/>
+        </ns0:rPr>
+      </ns0:r>
+      <ns0:r ns0:rsidRPr="005A6394">
+        <ns0:rPr>
+          <ns0:rFonts ns0:ascii="굴림" ns0:eastAsia="굴림" ns0:hAnsi="굴림" ns0:cs="굴림"/>
+          <ns0:lang ns0:eastAsia="ko-KR"/>
+        </ns0:rPr>
+      </ns0:r>
+      <ns0:r ns0:rsidRPr="005A6394">
+        <ns0:rPr>
+          <ns0:rFonts ns0:ascii="굴림" ns0:eastAsia="굴림" ns0:hAnsi="굴림" ns0:cs="굴림"/>
+          <ns0:lang ns0:eastAsia="ko-KR"/>
+        </ns0:rPr>
+      </ns0:r>
+      <ns0:r ns0:rsidRPr="005A6394">
+        <ns0:rPr>
+          <ns0:rFonts ns0:ascii="굴림" ns0:eastAsia="굴림" ns0:hAnsi="굴림" ns0:cs="굴림"/>
+          <ns0:lang ns0:eastAsia="ko-KR"/>
+        </ns0:rPr>
+      </ns0:r>
+      <ns0:r ns0:rsidRPr="005A6394">
+        <ns0:rPr>
+          <ns0:rFonts ns0:ascii="굴림" ns0:eastAsia="굴림" ns0:hAnsi="굴림" ns0:cs="굴림"/>
+          <ns0:lang ns0:eastAsia="ko-KR"/>
+        </ns0:rPr>
+      </ns0:r>
+      <ns0:r ns0:rsidRPr="005A6394">
+        <ns0:rPr>
+          <ns0:rFonts ns0:ascii="굴림" ns0:eastAsia="굴림" ns0:hAnsi="굴림" ns0:cs="굴림"/>
+          <ns0:lang ns0:eastAsia="ko-KR"/>
+        </ns0:rPr>
+      </ns0:r>
+    </ns0:p>
+    <ns0:p ns2:paraId="6F7A3B83" ns2:textId="77777777" ns0:rsidR="00C903FE" ns0:rsidRPr="005A6394" ns0:rsidRDefault="00361B4A">
+      <ns0:pPr>
+        <ns0:rPr>
+          <ns0:rFonts ns0:ascii="굴림" ns0:eastAsia="굴림" ns0:hAnsi="굴림"/>
+          <ns0:lang ns0:eastAsia="ko-KR"/>
+        </ns0:rPr>
+      </ns0:pPr>
+      <ns0:r ns0:rsidRPr="005A6394">
+        <ns0:rPr>
+          <ns0:rFonts ns0:ascii="굴림" ns0:eastAsia="굴림" ns0:hAnsi="굴림" ns0:cs="굴림"/>
+          <ns0:lang ns0:eastAsia="ko-KR"/>
+        </ns0:rPr>
+        <ns0:t xml:space="preserve">voxel_grid_downsample_filter_node는 Pointcloud의 점 수를 줄이고, crop_box_filter_node는 차량 자체 영역을 제거합니다. virtual_lidar_euclidean_cluster는 PCL 기반 CPU 처리이므로 CUDA와 NVIDIA runtime을 사용하지 않습니다.</ns0:t>
+      </ns0:r>
+      <ns0:r ns0:rsidRPr="005A6394">
+        <ns0:rPr>
+          <ns0:rFonts ns0:ascii="굴림" ns0:eastAsia="굴림" ns0:hAnsi="굴림" ns0:cs="굴림"/>
+          <ns0:lang ns0:eastAsia="ko-KR"/>
+        </ns0:rPr>
+      </ns0:r>
+      <ns0:r ns0:rsidRPr="005A6394">
+        <ns0:rPr>
+          <ns0:rFonts ns0:ascii="굴림" ns0:eastAsia="굴림" ns0:hAnsi="굴림" ns0:cs="굴림"/>
+          <ns0:lang ns0:eastAsia="ko-KR"/>
+        </ns0:rPr>
+      </ns0:r>
+      <ns0:r ns0:rsidRPr="005A6394">
+        <ns0:rPr>
+          <ns0:rFonts ns0:ascii="굴림" ns0:eastAsia="굴림" ns0:hAnsi="굴림" ns0:cs="굴림"/>
+          <ns0:lang ns0:eastAsia="ko-KR"/>
+        </ns0:rPr>
+      </ns0:r>
+      <ns0:r ns0:rsidRPr="005A6394">
+        <ns0:rPr>
+          <ns0:rFonts ns0:ascii="굴림" ns0:eastAsia="굴림" ns0:hAnsi="굴림" ns0:cs="굴림"/>
+          <ns0:lang ns0:eastAsia="ko-KR"/>
+        </ns0:rPr>
+      </ns0:r>
+      <ns0:r ns0:rsidRPr="005A6394">
+        <ns0:rPr>
+          <ns0:rFonts ns0:ascii="굴림" ns0:eastAsia="굴림" ns0:hAnsi="굴림" ns0:cs="굴림"/>
+          <ns0:lang ns0:eastAsia="ko-KR"/>
+        </ns0:rPr>
+      </ns0:r>
+      <ns0:r ns0:rsidRPr="005A6394">
+        <ns0:rPr>
+          <ns0:rFonts ns0:ascii="굴림" ns0:eastAsia="굴림" ns0:hAnsi="굴림" ns0:cs="굴림"/>
+          <ns0:lang ns0:eastAsia="ko-KR"/>
+        </ns0:rPr>
+      </ns0:r>
+      <ns0:r ns0:rsidRPr="005A6394">
+        <ns0:rPr>
+          <ns0:rFonts ns0:ascii="굴림" ns0:eastAsia="굴림" ns0:hAnsi="굴림" ns0:cs="굴림"/>
+          <ns0:lang ns0:eastAsia="ko-KR"/>
+        </ns0:rPr>
+      </ns0:r>
+      <ns0:r ns0:rsidRPr="005A6394">
+        <ns0:rPr>
+          <ns0:rFonts ns0:ascii="굴림" ns0:eastAsia="굴림" ns0:hAnsi="굴림" ns0:cs="굴림"/>
+          <ns0:lang ns0:eastAsia="ko-KR"/>
+        </ns0:rPr>
+      </ns0:r>
+      <ns0:r ns0:rsidRPr="005A6394">
+        <ns0:rPr>
+          <ns0:rFonts ns0:ascii="굴림" ns0:eastAsia="굴림" ns0:hAnsi="굴림" ns0:cs="굴림"/>
+          <ns0:lang ns0:eastAsia="ko-KR"/>
+        </ns0:rPr>
+      </ns0:r>
+      <ns0:r ns0:rsidRPr="005A6394">
+        <ns0:rPr>
+          <ns0:rFonts ns0:ascii="굴림" ns0:eastAsia="굴림" ns0:hAnsi="굴림" ns0:cs="굴림"/>
+          <ns0:lang ns0:eastAsia="ko-KR"/>
+        </ns0:rPr>
+      </ns0:r>
+      <ns0:r ns0:rsidRPr="005A6394">
+        <ns0:rPr>
+          <ns0:rFonts ns0:ascii="굴림" ns0:eastAsia="굴림" ns0:hAnsi="굴림" ns0:cs="굴림"/>
+          <ns0:lang ns0:eastAsia="ko-KR"/>
+        </ns0:rPr>
+      </ns0:r>
+      <ns0:r ns0:rsidRPr="005A6394">
+        <ns0:rPr>
+          <ns0:rFonts ns0:ascii="굴림" ns0:eastAsia="굴림" ns0:hAnsi="굴림" ns0:cs="굴림"/>
+          <ns0:lang ns0:eastAsia="ko-KR"/>
+        </ns0:rPr>
+      </ns0:r>
+      <ns0:r ns0:rsidRPr="005A6394">
+        <ns0:rPr>
+          <ns0:rFonts ns0:ascii="굴림" ns0:eastAsia="굴림" ns0:hAnsi="굴림" ns0:cs="굴림"/>
+          <ns0:lang ns0:eastAsia="ko-KR"/>
+        </ns0:rPr>
+      </ns0:r>
+      <ns0:r ns0:rsidRPr="005A6394">
+        <ns0:rPr>
+          <ns0:rFonts ns0:ascii="굴림" ns0:eastAsia="굴림" ns0:hAnsi="굴림" ns0:cs="굴림"/>
+          <ns0:lang ns0:eastAsia="ko-KR"/>
+        </ns0:rPr>
+      </ns0:r>
+      <ns0:r ns0:rsidRPr="005A6394">
+        <ns0:rPr>
+          <ns0:rFonts ns0:ascii="굴림" ns0:eastAsia="굴림" ns0:hAnsi="굴림" ns0:cs="굴림"/>
+          <ns0:lang ns0:eastAsia="ko-KR"/>
+        </ns0:rPr>
+      </ns0:r>
+      <ns0:r ns0:rsidRPr="005A6394">
+        <ns0:rPr>
+          <ns0:rFonts ns0:ascii="굴림" ns0:eastAsia="굴림" ns0:hAnsi="굴림" ns0:cs="굴림"/>
+          <ns0:lang ns0:eastAsia="ko-KR"/>
+        </ns0:rPr>
+      </ns0:r>
+      <ns0:r ns0:rsidRPr="005A6394">
+        <ns0:rPr>
+          <ns0:rFonts ns0:ascii="굴림" ns0:eastAsia="굴림" ns0:hAnsi="굴림" ns0:cs="굴림"/>
+          <ns0:lang ns0:eastAsia="ko-KR"/>
+        </ns0:rPr>
+      </ns0:r>
+      <ns0:r ns0:rsidRPr="005A6394">
+        <ns0:rPr>
+          <ns0:rFonts ns0:ascii="굴림" ns0:eastAsia="굴림" ns0:hAnsi="굴림" ns0:cs="굴림"/>
+          <ns0:lang ns0:eastAsia="ko-KR"/>
+        </ns0:rPr>
+      </ns0:r>
+      <ns0:r ns0:rsidRPr="005A6394">
+        <ns0:rPr>
+          <ns0:rFonts ns0:ascii="굴림" ns0:eastAsia="굴림" ns0:hAnsi="굴림" ns0:cs="굴림"/>
+          <ns0:lang ns0:eastAsia="ko-KR"/>
+        </ns0:rPr>
+      </ns0:r>
+      <ns0:r ns0:rsidRPr="005A6394">
+        <ns0:rPr>
+          <ns0:rFonts ns0:ascii="굴림" ns0:eastAsia="굴림" ns0:hAnsi="굴림" ns0:cs="굴림"/>
+          <ns0:lang ns0:eastAsia="ko-KR"/>
+        </ns0:rPr>
+      </ns0:r>
+      <ns0:r ns0:rsidRPr="005A6394">
+        <ns0:rPr>
+          <ns0:rFonts ns0:ascii="굴림" ns0:eastAsia="굴림" ns0:hAnsi="굴림" ns0:cs="굴림"/>
+          <ns0:lang ns0:eastAsia="ko-KR"/>
+        </ns0:rPr>
+      </ns0:r>
+      <ns0:r ns0:rsidRPr="005A6394">
+        <ns0:rPr>
+          <ns0:rFonts ns0:ascii="굴림" ns0:eastAsia="굴림" ns0:hAnsi="굴림" ns0:cs="굴림"/>
+          <ns0:lang ns0:eastAsia="ko-KR"/>
+        </ns0:rPr>
+      </ns0:r>
+      <ns0:r ns0:rsidRPr="005A6394">
+        <ns0:rPr>
+          <ns0:rFonts ns0:ascii="굴림" ns0:eastAsia="굴림" ns0:hAnsi="굴림" ns0:cs="굴림"/>
+          <ns0:lang ns0:eastAsia="ko-KR"/>
+        </ns0:rPr>
+      </ns0:r>
+      <ns0:r ns0:rsidRPr="005A6394">
+        <ns0:rPr>
+          <ns0:rFonts ns0:ascii="굴림" ns0:eastAsia="굴림" ns0:hAnsi="굴림" ns0:cs="굴림"/>
+          <ns0:lang ns0:eastAsia="ko-KR"/>
+        </ns0:rPr>
+      </ns0:r>
+      <ns0:r ns0:rsidRPr="005A6394">
+        <ns0:rPr>
+          <ns0:rFonts ns0:ascii="굴림" ns0:eastAsia="굴림" ns0:hAnsi="굴림" ns0:cs="굴림"/>
+          <ns0:lang ns0:eastAsia="ko-KR"/>
+        </ns0:rPr>
+      </ns0:r>
+      <ns0:r ns0:rsidRPr="005A6394">
+        <ns0:rPr>
+          <ns0:rFonts ns0:ascii="굴림" ns0:eastAsia="굴림" ns0:hAnsi="굴림" ns0:cs="굴림"/>
+          <ns0:lang ns0:eastAsia="ko-KR"/>
+        </ns0:rPr>
+      </ns0:r>
+      <ns0:r ns0:rsidRPr="005A6394">
+        <ns0:rPr>
+          <ns0:rFonts ns0:ascii="굴림" ns0:eastAsia="굴림" ns0:hAnsi="굴림" ns0:cs="굴림"/>
+          <ns0:lang ns0:eastAsia="ko-KR"/>
+        </ns0:rPr>
+      </ns0:r>
+      <ns0:r ns0:rsidRPr="005A6394">
+        <ns0:rPr>
+          <ns0:rFonts ns0:ascii="굴림" ns0:eastAsia="굴림" ns0:hAnsi="굴림" ns0:cs="굴림"/>
+          <ns0:lang ns0:eastAsia="ko-KR"/>
+        </ns0:rPr>
+      </ns0:r>
+      <ns0:r ns0:rsidRPr="005A6394">
+        <ns0:rPr>
+          <ns0:rFonts ns0:ascii="굴림" ns0:eastAsia="굴림" ns0:hAnsi="굴림" ns0:cs="굴림"/>
+          <ns0:lang ns0:eastAsia="ko-KR"/>
+        </ns0:rPr>
+      </ns0:r>
+      <ns0:r ns0:rsidRPr="005A6394">
+        <ns0:rPr>
+          <ns0:rFonts ns0:ascii="굴림" ns0:eastAsia="굴림" ns0:hAnsi="굴림" ns0:cs="굴림"/>
+          <ns0:lang ns0:eastAsia="ko-KR"/>
+        </ns0:rPr>
+      </ns0:r>
+      <ns0:r ns0:rsidRPr="005A6394">
+        <ns0:rPr>
+          <ns0:rFonts ns0:ascii="굴림" ns0:eastAsia="굴림" ns0:hAnsi="굴림" ns0:cs="굴림"/>
+          <ns0:lang ns0:eastAsia="ko-KR"/>
+        </ns0:rPr>
+      </ns0:r>
+      <ns0:r ns0:rsidRPr="005A6394">
+        <ns0:rPr>
+          <ns0:rFonts ns0:ascii="굴림" ns0:eastAsia="굴림" ns0:hAnsi="굴림" ns0:cs="굴림"/>
+          <ns0:lang ns0:eastAsia="ko-KR"/>
+        </ns0:rPr>
+      </ns0:r>
+      <ns0:r ns0:rsidRPr="005A6394">
+        <ns0:rPr>
+          <ns0:rFonts ns0:ascii="굴림" ns0:eastAsia="굴림" ns0:hAnsi="굴림" ns0:cs="굴림"/>
+          <ns0:lang ns0:eastAsia="ko-KR"/>
+        </ns0:rPr>
+      </ns0:r>
+      <ns0:r ns0:rsidRPr="005A6394">
+        <ns0:rPr>
+          <ns0:rFonts ns0:ascii="굴림" ns0:eastAsia="굴림" ns0:hAnsi="굴림" ns0:cs="굴림"/>
+          <ns0:lang ns0:eastAsia="ko-KR"/>
+        </ns0:rPr>
+      </ns0:r>
+      <ns0:r ns0:rsidRPr="005A6394">
+        <ns0:rPr>
+          <ns0:rFonts ns0:ascii="굴림" ns0:eastAsia="굴림" ns0:hAnsi="굴림" ns0:cs="굴림"/>
+          <ns0:lang ns0:eastAsia="ko-KR"/>
+        </ns0:rPr>
+      </ns0:r>
+      <ns0:r ns0:rsidRPr="005A6394">
+        <ns0:rPr>
+          <ns0:rFonts ns0:ascii="굴림" ns0:eastAsia="굴림" ns0:hAnsi="굴림" ns0:cs="굴림"/>
+          <ns0:lang ns0:eastAsia="ko-KR"/>
+        </ns0:rPr>
+      </ns0:r>
+      <ns0:r ns0:rsidRPr="005A6394">
+        <ns0:rPr>
+          <ns0:rFonts ns0:ascii="굴림" ns0:eastAsia="굴림" ns0:hAnsi="굴림" ns0:cs="굴림"/>
+          <ns0:lang ns0:eastAsia="ko-KR"/>
+        </ns0:rPr>
+      </ns0:r>
+      <ns0:r ns0:rsidRPr="005A6394">
+        <ns0:rPr>
+          <ns0:rFonts ns0:ascii="굴림" ns0:eastAsia="굴림" ns0:hAnsi="굴림" ns0:cs="굴림"/>
+          <ns0:lang ns0:eastAsia="ko-KR"/>
+        </ns0:rPr>
+      </ns0:r>
+      <ns0:r ns0:rsidRPr="005A6394">
+        <ns0:rPr>
+          <ns0:rFonts ns0:ascii="굴림" ns0:eastAsia="굴림" ns0:hAnsi="굴림" ns0:cs="굴림"/>
+          <ns0:lang ns0:eastAsia="ko-KR"/>
+        </ns0:rPr>
+      </ns0:r>
+      <ns0:r ns0:rsidRPr="005A6394">
+        <ns0:rPr>
+          <ns0:rFonts ns0:ascii="굴림" ns0:eastAsia="굴림" ns0:hAnsi="굴림" ns0:cs="굴림"/>
+          <ns0:lang ns0:eastAsia="ko-KR"/>
+        </ns0:rPr>
+      </ns0:r>
+      <ns0:r ns0:rsidRPr="005A6394">
+        <ns0:rPr>
+          <ns0:rFonts ns0:ascii="굴림" ns0:eastAsia="굴림" ns0:hAnsi="굴림" ns0:cs="굴림"/>
+          <ns0:lang ns0:eastAsia="ko-KR"/>
+        </ns0:rPr>
+      </ns0:r>
+      <ns0:r ns0:rsidRPr="005A6394">
+        <ns0:rPr>
+          <ns0:rFonts ns0:ascii="굴림" ns0:eastAsia="굴림" ns0:hAnsi="굴림" ns0:cs="굴림"/>
+          <ns0:lang ns0:eastAsia="ko-KR"/>
+        </ns0:rPr>
+      </ns0:r>
+      <ns0:r ns0:rsidRPr="005A6394">
+        <ns0:rPr>
+          <ns0:rFonts ns0:ascii="굴림" ns0:eastAsia="굴림" ns0:hAnsi="굴림" ns0:cs="굴림"/>
+          <ns0:lang ns0:eastAsia="ko-KR"/>
+        </ns0:rPr>
+      </ns0:r>
+    </ns0:p>
+    <ns0:p ns2:paraId="6FE78441" ns2:textId="77777777" ns0:rsidR="00C903FE" ns0:rsidRPr="005A6394" ns0:rsidRDefault="00361B4A">
+      <ns0:pPr>
+        <ns0:pStyle ns0:val="21"/>
+        <ns0:rPr>
+          <ns0:rFonts ns0:ascii="굴림" ns0:eastAsia="굴림" ns0:hAnsi="굴림"/>
+          <ns0:lang ns0:eastAsia="ko-KR"/>
+        </ns0:rPr>
+      </ns0:pPr>
+      <ns0:r ns0:rsidRPr="005A6394">
+        <ns0:rPr>
+          <ns0:rFonts ns0:ascii="굴림" ns0:eastAsia="굴림" ns0:hAnsi="굴림" ns0:cs="굴림"/>
+          <ns0:lang ns0:eastAsia="ko-KR"/>
+        </ns0:rPr>
+        <ns0:t xml:space="preserve">검증 순서</ns0:t>
+      </ns0:r>
+      <ns0:r ns0:rsidRPr="005A6394">
+        <ns0:rPr>
+          <ns0:rFonts ns0:ascii="굴림" ns0:eastAsia="굴림" ns0:hAnsi="굴림" ns0:cs="굴림"/>
+          <ns0:lang ns0:eastAsia="ko-KR"/>
+        </ns0:rPr>
+      </ns0:r>
+      <ns0:r ns0:rsidRPr="005A6394">
+        <ns0:rPr>
+          <ns0:rFonts ns0:ascii="굴림" ns0:eastAsia="굴림" ns0:hAnsi="굴림" ns0:cs="굴림"/>
+          <ns0:lang ns0:eastAsia="ko-KR"/>
+        </ns0:rPr>
+      </ns0:r>
+      <ns0:r ns0:rsidRPr="005A6394">
+        <ns0:rPr>
+          <ns0:rFonts ns0:ascii="굴림" ns0:eastAsia="굴림" ns0:hAnsi="굴림" ns0:cs="굴림"/>
+          <ns0:lang ns0:eastAsia="ko-KR"/>
+        </ns0:rPr>
+      </ns0:r>
+      <ns0:r ns0:rsidRPr="005A6394">
+        <ns0:rPr>
+          <ns0:rFonts ns0:ascii="굴림" ns0:eastAsia="굴림" ns0:hAnsi="굴림" ns0:cs="굴림"/>
+          <ns0:lang ns0:eastAsia="ko-KR"/>
+        </ns0:rPr>
+      </ns0:r>
+      <ns0:r ns0:rsidRPr="005A6394">
+        <ns0:rPr>
+          <ns0:rFonts ns0:ascii="굴림" ns0:eastAsia="굴림" ns0:hAnsi="굴림" ns0:cs="굴림"/>
+          <ns0:lang ns0:eastAsia="ko-KR"/>
+        </ns0:rPr>
+      </ns0:r>
+      <ns0:r ns0:rsidRPr="005A6394">
+        <ns0:rPr>
+          <ns0:rFonts ns0:ascii="굴림" ns0:eastAsia="굴림" ns0:hAnsi="굴림" ns0:cs="굴림"/>
+          <ns0:lang ns0:eastAsia="ko-KR"/>
+        </ns0:rPr>
+      </ns0:r>
+      <ns0:proofErr ns0:type="spellStart"/>
+      <ns0:r ns0:rsidRPr="005A6394">
+        <ns0:rPr>
+          <ns0:rFonts ns0:ascii="굴림" ns0:eastAsia="굴림" ns0:hAnsi="굴림" ns0:cs="굴림"/>
+          <ns0:lang ns0:eastAsia="ko-KR"/>
+        </ns0:rPr>
+      </ns0:r>
+      <ns0:proofErr ns0:type="spellEnd"/>
+    </ns0:p>
+    <ns0:p ns2:paraId="6F7A3B83" ns2:textId="77777777" ns0:rsidR="00C903FE" ns0:rsidRPr="005A6394" ns0:rsidRDefault="00361B4A">
+      <ns0:pPr>
+        <ns0:rPr>
+          <ns0:rFonts ns0:ascii="굴림" ns0:eastAsia="굴림" ns0:hAnsi="굴림"/>
+          <ns0:lang ns0:eastAsia="ko-KR"/>
+        </ns0:rPr>
+      </ns0:pPr>
+      <ns0:r ns0:rsidRPr="005A6394">
+        <ns0:rPr>
+          <ns0:rFonts ns0:ascii="굴림" ns0:eastAsia="굴림" ns0:hAnsi="굴림" ns0:cs="굴림"/>
+          <ns0:lang ns0:eastAsia="ko-KR"/>
+        </ns0:rPr>
+        <ns0:t xml:space="preserve">1. 7장의 기본 절차로 initial pose와 goal을 지정하고 Auto 주행을 시작합니다.</ns0:t>
+      </ns0:r>
+      <ns0:r ns0:rsidRPr="005A6394">
+        <ns0:rPr>
+          <ns0:rFonts ns0:ascii="굴림" ns0:eastAsia="굴림" ns0:hAnsi="굴림" ns0:cs="굴림"/>
+          <ns0:lang ns0:eastAsia="ko-KR"/>
+        </ns0:rPr>
+      </ns0:r>
+      <ns0:r ns0:rsidRPr="005A6394">
+        <ns0:rPr>
+          <ns0:rFonts ns0:ascii="굴림" ns0:eastAsia="굴림" ns0:hAnsi="굴림" ns0:cs="굴림"/>
+          <ns0:lang ns0:eastAsia="ko-KR"/>
+        </ns0:rPr>
+      </ns0:r>
+      <ns0:r ns0:rsidRPr="005A6394">
+        <ns0:rPr>
+          <ns0:rFonts ns0:ascii="굴림" ns0:eastAsia="굴림" ns0:hAnsi="굴림" ns0:cs="굴림"/>
+          <ns0:lang ns0:eastAsia="ko-KR"/>
+        </ns0:rPr>
+      </ns0:r>
+      <ns0:r ns0:rsidRPr="005A6394">
+        <ns0:rPr>
+          <ns0:rFonts ns0:ascii="굴림" ns0:eastAsia="굴림" ns0:hAnsi="굴림" ns0:cs="굴림"/>
+          <ns0:lang ns0:eastAsia="ko-KR"/>
+        </ns0:rPr>
+      </ns0:r>
+      <ns0:r ns0:rsidRPr="005A6394">
+        <ns0:rPr>
+          <ns0:rFonts ns0:ascii="굴림" ns0:eastAsia="굴림" ns0:hAnsi="굴림" ns0:cs="굴림"/>
+          <ns0:lang ns0:eastAsia="ko-KR"/>
+        </ns0:rPr>
+      </ns0:r>
+      <ns0:r ns0:rsidRPr="005A6394">
+        <ns0:rPr>
+          <ns0:rFonts ns0:ascii="굴림" ns0:eastAsia="굴림" ns0:hAnsi="굴림" ns0:cs="굴림"/>
+          <ns0:lang ns0:eastAsia="ko-KR"/>
+        </ns0:rPr>
+      </ns0:r>
+      <ns0:r ns0:rsidRPr="005A6394">
+        <ns0:rPr>
+          <ns0:rFonts ns0:ascii="굴림" ns0:eastAsia="굴림" ns0:hAnsi="굴림" ns0:cs="굴림"/>
+          <ns0:lang ns0:eastAsia="ko-KR"/>
+        </ns0:rPr>
+      </ns0:r>
+      <ns0:r ns0:rsidRPr="005A6394">
+        <ns0:rPr>
+          <ns0:rFonts ns0:ascii="굴림" ns0:eastAsia="굴림" ns0:hAnsi="굴림" ns0:cs="굴림"/>
+          <ns0:lang ns0:eastAsia="ko-KR"/>
+        </ns0:rPr>
+      </ns0:r>
+      <ns0:r ns0:rsidRPr="005A6394">
+        <ns0:rPr>
+          <ns0:rFonts ns0:ascii="굴림" ns0:eastAsia="굴림" ns0:hAnsi="굴림" ns0:cs="굴림"/>
+          <ns0:lang ns0:eastAsia="ko-KR"/>
+        </ns0:rPr>
+      </ns0:r>
+      <ns0:r ns0:rsidRPr="005A6394">
+        <ns0:rPr>
+          <ns0:rFonts ns0:ascii="굴림" ns0:eastAsia="굴림" ns0:hAnsi="굴림" ns0:cs="굴림"/>
+          <ns0:lang ns0:eastAsia="ko-KR"/>
+        </ns0:rPr>
+      </ns0:r>
+      <ns0:r ns0:rsidRPr="005A6394">
+        <ns0:rPr>
+          <ns0:rFonts ns0:ascii="굴림" ns0:eastAsia="굴림" ns0:hAnsi="굴림" ns0:cs="굴림"/>
+          <ns0:lang ns0:eastAsia="ko-KR"/>
+        </ns0:rPr>
+      </ns0:r>
+      <ns0:r ns0:rsidRPr="005A6394">
+        <ns0:rPr>
+          <ns0:rFonts ns0:ascii="굴림" ns0:eastAsia="굴림" ns0:hAnsi="굴림" ns0:cs="굴림"/>
+          <ns0:lang ns0:eastAsia="ko-KR"/>
+        </ns0:rPr>
+      </ns0:r>
+      <ns0:r ns0:rsidRPr="005A6394">
+        <ns0:rPr>
+          <ns0:rFonts ns0:ascii="굴림" ns0:eastAsia="굴림" ns0:hAnsi="굴림" ns0:cs="굴림"/>
+          <ns0:lang ns0:eastAsia="ko-KR"/>
+        </ns0:rPr>
+      </ns0:r>
+      <ns0:r ns0:rsidRPr="005A6394">
+        <ns0:rPr>
+          <ns0:rFonts ns0:ascii="굴림" ns0:eastAsia="굴림" ns0:hAnsi="굴림" ns0:cs="굴림"/>
+          <ns0:lang ns0:eastAsia="ko-KR"/>
+        </ns0:rPr>
+      </ns0:r>
+      <ns0:r ns0:rsidRPr="005A6394">
+        <ns0:rPr>
+          <ns0:rFonts ns0:ascii="굴림" ns0:eastAsia="굴림" ns0:hAnsi="굴림" ns0:cs="굴림"/>
+          <ns0:lang ns0:eastAsia="ko-KR"/>
+        </ns0:rPr>
+      </ns0:r>
+      <ns0:r ns0:rsidRPr="005A6394">
+        <ns0:rPr>
+          <ns0:rFonts ns0:ascii="굴림" ns0:eastAsia="굴림" ns0:hAnsi="굴림" ns0:cs="굴림"/>
+          <ns0:lang ns0:eastAsia="ko-KR"/>
+        </ns0:rPr>
+      </ns0:r>
+      <ns0:r ns0:rsidRPr="005A6394">
+        <ns0:rPr>
+          <ns0:rFonts ns0:ascii="굴림" ns0:eastAsia="굴림" ns0:hAnsi="굴림" ns0:cs="굴림"/>
+          <ns0:lang ns0:eastAsia="ko-KR"/>
+        </ns0:rPr>
+      </ns0:r>
+      <ns0:r ns0:rsidRPr="005A6394">
+        <ns0:rPr>
+          <ns0:rFonts ns0:ascii="굴림" ns0:eastAsia="굴림" ns0:hAnsi="굴림" ns0:cs="굴림"/>
+          <ns0:lang ns0:eastAsia="ko-KR"/>
+        </ns0:rPr>
+      </ns0:r>
+      <ns0:r ns0:rsidRPr="005A6394">
+        <ns0:rPr>
+          <ns0:rFonts ns0:ascii="굴림" ns0:eastAsia="굴림" ns0:hAnsi="굴림" ns0:cs="굴림"/>
+          <ns0:lang ns0:eastAsia="ko-KR"/>
+        </ns0:rPr>
+      </ns0:r>
+      <ns0:r ns0:rsidRPr="005A6394">
+        <ns0:rPr>
+          <ns0:rFonts ns0:ascii="굴림" ns0:eastAsia="굴림" ns0:hAnsi="굴림" ns0:cs="굴림"/>
+          <ns0:lang ns0:eastAsia="ko-KR"/>
+        </ns0:rPr>
+      </ns0:r>
+      <ns0:r ns0:rsidRPr="005A6394">
+        <ns0:rPr>
+          <ns0:rFonts ns0:ascii="굴림" ns0:eastAsia="굴림" ns0:hAnsi="굴림" ns0:cs="굴림"/>
+          <ns0:lang ns0:eastAsia="ko-KR"/>
+        </ns0:rPr>
+      </ns0:r>
+      <ns0:r ns0:rsidRPr="005A6394">
+        <ns0:rPr>
+          <ns0:rFonts ns0:ascii="굴림" ns0:eastAsia="굴림" ns0:hAnsi="굴림" ns0:cs="굴림"/>
+          <ns0:lang ns0:eastAsia="ko-KR"/>
+        </ns0:rPr>
+      </ns0:r>
+      <ns0:r ns0:rsidRPr="005A6394">
+        <ns0:rPr>
+          <ns0:rFonts ns0:ascii="굴림" ns0:eastAsia="굴림" ns0:hAnsi="굴림" ns0:cs="굴림"/>
+          <ns0:lang ns0:eastAsia="ko-KR"/>
+        </ns0:rPr>
+      </ns0:r>
+      <ns0:r ns0:rsidRPr="005A6394">
+        <ns0:rPr>
+          <ns0:rFonts ns0:ascii="굴림" ns0:eastAsia="굴림" ns0:hAnsi="굴림" ns0:cs="굴림"/>
+          <ns0:lang ns0:eastAsia="ko-KR"/>
+        </ns0:rPr>
+      </ns0:r>
+      <ns0:r ns0:rsidRPr="005A6394">
+        <ns0:rPr>
+          <ns0:rFonts ns0:ascii="굴림" ns0:eastAsia="굴림" ns0:hAnsi="굴림" ns0:cs="굴림"/>
+          <ns0:lang ns0:eastAsia="ko-KR"/>
+        </ns0:rPr>
+      </ns0:r>
+      <ns0:r ns0:rsidRPr="005A6394">
+        <ns0:rPr>
+          <ns0:rFonts ns0:ascii="굴림" ns0:eastAsia="굴림" ns0:hAnsi="굴림" ns0:cs="굴림"/>
+          <ns0:lang ns0:eastAsia="ko-KR"/>
+        </ns0:rPr>
+      </ns0:r>
+      <ns0:r ns0:rsidRPr="005A6394">
+        <ns0:rPr>
+          <ns0:rFonts ns0:ascii="굴림" ns0:eastAsia="굴림" ns0:hAnsi="굴림" ns0:cs="굴림"/>
+          <ns0:lang ns0:eastAsia="ko-KR"/>
+        </ns0:rPr>
+      </ns0:r>
+      <ns0:r ns0:rsidRPr="005A6394">
+        <ns0:rPr>
+          <ns0:rFonts ns0:ascii="굴림" ns0:eastAsia="굴림" ns0:hAnsi="굴림" ns0:cs="굴림"/>
+          <ns0:lang ns0:eastAsia="ko-KR"/>
+        </ns0:rPr>
+      </ns0:r>
+      <ns0:r ns0:rsidRPr="005A6394">
+        <ns0:rPr>
+          <ns0:rFonts ns0:ascii="굴림" ns0:eastAsia="굴림" ns0:hAnsi="굴림" ns0:cs="굴림"/>
+          <ns0:lang ns0:eastAsia="ko-KR"/>
+        </ns0:rPr>
+      </ns0:r>
+      <ns0:r ns0:rsidRPr="005A6394">
+        <ns0:rPr>
+          <ns0:rFonts ns0:ascii="굴림" ns0:eastAsia="굴림" ns0:hAnsi="굴림" ns0:cs="굴림"/>
+          <ns0:lang ns0:eastAsia="ko-KR"/>
+        </ns0:rPr>
+      </ns0:r>
+      <ns0:r ns0:rsidRPr="005A6394">
+        <ns0:rPr>
+          <ns0:rFonts ns0:ascii="굴림" ns0:eastAsia="굴림" ns0:hAnsi="굴림" ns0:cs="굴림"/>
+          <ns0:lang ns0:eastAsia="ko-KR"/>
+        </ns0:rPr>
+      </ns0:r>
+      <ns0:r ns0:rsidRPr="005A6394">
+        <ns0:rPr>
+          <ns0:rFonts ns0:ascii="굴림" ns0:eastAsia="굴림" ns0:hAnsi="굴림" ns0:cs="굴림"/>
+          <ns0:lang ns0:eastAsia="ko-KR"/>
+        </ns0:rPr>
+      </ns0:r>
+      <ns0:r ns0:rsidRPr="005A6394">
+        <ns0:rPr>
+          <ns0:rFonts ns0:ascii="굴림" ns0:eastAsia="굴림" ns0:hAnsi="굴림" ns0:cs="굴림"/>
+          <ns0:lang ns0:eastAsia="ko-KR"/>
+        </ns0:rPr>
+      </ns0:r>
+      <ns0:r ns0:rsidRPr="005A6394">
+        <ns0:rPr>
+          <ns0:rFonts ns0:ascii="굴림" ns0:eastAsia="굴림" ns0:hAnsi="굴림" ns0:cs="굴림"/>
+          <ns0:lang ns0:eastAsia="ko-KR"/>
+        </ns0:rPr>
+      </ns0:r>
+      <ns0:r ns0:rsidRPr="005A6394">
+        <ns0:rPr>
+          <ns0:rFonts ns0:ascii="굴림" ns0:eastAsia="굴림" ns0:hAnsi="굴림" ns0:cs="굴림"/>
+          <ns0:lang ns0:eastAsia="ko-KR"/>
+        </ns0:rPr>
+      </ns0:r>
+      <ns0:r ns0:rsidRPr="005A6394">
+        <ns0:rPr>
+          <ns0:rFonts ns0:ascii="굴림" ns0:eastAsia="굴림" ns0:hAnsi="굴림" ns0:cs="굴림"/>
+          <ns0:lang ns0:eastAsia="ko-KR"/>
+        </ns0:rPr>
+      </ns0:r>
+      <ns0:r ns0:rsidRPr="005A6394">
+        <ns0:rPr>
+          <ns0:rFonts ns0:ascii="굴림" ns0:eastAsia="굴림" ns0:hAnsi="굴림" ns0:cs="굴림"/>
+          <ns0:lang ns0:eastAsia="ko-KR"/>
+        </ns0:rPr>
+      </ns0:r>
+      <ns0:r ns0:rsidRPr="005A6394">
+        <ns0:rPr>
+          <ns0:rFonts ns0:ascii="굴림" ns0:eastAsia="굴림" ns0:hAnsi="굴림" ns0:cs="굴림"/>
+          <ns0:lang ns0:eastAsia="ko-KR"/>
+        </ns0:rPr>
+      </ns0:r>
+      <ns0:r ns0:rsidRPr="005A6394">
+        <ns0:rPr>
+          <ns0:rFonts ns0:ascii="굴림" ns0:eastAsia="굴림" ns0:hAnsi="굴림" ns0:cs="굴림"/>
+          <ns0:lang ns0:eastAsia="ko-KR"/>
+        </ns0:rPr>
+      </ns0:r>
+      <ns0:r ns0:rsidRPr="005A6394">
+        <ns0:rPr>
+          <ns0:rFonts ns0:ascii="굴림" ns0:eastAsia="굴림" ns0:hAnsi="굴림" ns0:cs="굴림"/>
+          <ns0:lang ns0:eastAsia="ko-KR"/>
+        </ns0:rPr>
+      </ns0:r>
+      <ns0:r ns0:rsidRPr="005A6394">
+        <ns0:rPr>
+          <ns0:rFonts ns0:ascii="굴림" ns0:eastAsia="굴림" ns0:hAnsi="굴림" ns0:cs="굴림"/>
+          <ns0:lang ns0:eastAsia="ko-KR"/>
+        </ns0:rPr>
+      </ns0:r>
+      <ns0:r ns0:rsidRPr="005A6394">
+        <ns0:rPr>
+          <ns0:rFonts ns0:ascii="굴림" ns0:eastAsia="굴림" ns0:hAnsi="굴림" ns0:cs="굴림"/>
+          <ns0:lang ns0:eastAsia="ko-KR"/>
+        </ns0:rPr>
+      </ns0:r>
+      <ns0:r ns0:rsidRPr="005A6394">
+        <ns0:rPr>
+          <ns0:rFonts ns0:ascii="굴림" ns0:eastAsia="굴림" ns0:hAnsi="굴림" ns0:cs="굴림"/>
+          <ns0:lang ns0:eastAsia="ko-KR"/>
+        </ns0:rPr>
+      </ns0:r>
+    </ns0:p>
+    <ns0:p ns2:paraId="6F7A3B83" ns2:textId="77777777" ns0:rsidR="00C903FE" ns0:rsidRPr="005A6394" ns0:rsidRDefault="00361B4A">
+      <ns0:pPr>
+        <ns0:rPr>
+          <ns0:rFonts ns0:ascii="굴림" ns0:eastAsia="굴림" ns0:hAnsi="굴림"/>
+          <ns0:lang ns0:eastAsia="ko-KR"/>
+        </ns0:rPr>
+      </ns0:pPr>
+      <ns0:r ns0:rsidRPr="005A6394">
+        <ns0:rPr>
+          <ns0:rFonts ns0:ascii="굴림" ns0:eastAsia="굴림" ns0:hAnsi="굴림" ns0:cs="굴림"/>
+          <ns0:lang ns0:eastAsia="ko-KR"/>
+        </ns0:rPr>
+        <ns0:t xml:space="preserve">2. RViz에서 Bus, Car 또는 Pedestrian을 주행 경로 위에 배치합니다.</ns0:t>
+      </ns0:r>
+      <ns0:r ns0:rsidRPr="005A6394">
+        <ns0:rPr>
+          <ns0:rFonts ns0:ascii="굴림" ns0:eastAsia="굴림" ns0:hAnsi="굴림" ns0:cs="굴림"/>
+          <ns0:lang ns0:eastAsia="ko-KR"/>
+        </ns0:rPr>
+      </ns0:r>
+      <ns0:r ns0:rsidRPr="005A6394">
+        <ns0:rPr>
+          <ns0:rFonts ns0:ascii="굴림" ns0:eastAsia="굴림" ns0:hAnsi="굴림" ns0:cs="굴림"/>
+          <ns0:lang ns0:eastAsia="ko-KR"/>
+        </ns0:rPr>
+      </ns0:r>
+      <ns0:r ns0:rsidRPr="005A6394">
+        <ns0:rPr>
+          <ns0:rFonts ns0:ascii="굴림" ns0:eastAsia="굴림" ns0:hAnsi="굴림" ns0:cs="굴림"/>
+          <ns0:lang ns0:eastAsia="ko-KR"/>
+        </ns0:rPr>
+      </ns0:r>
+      <ns0:r ns0:rsidRPr="005A6394">
+        <ns0:rPr>
+          <ns0:rFonts ns0:ascii="굴림" ns0:eastAsia="굴림" ns0:hAnsi="굴림" ns0:cs="굴림"/>
+          <ns0:lang ns0:eastAsia="ko-KR"/>
+        </ns0:rPr>
+      </ns0:r>
+      <ns0:r ns0:rsidRPr="005A6394">
+        <ns0:rPr>
+          <ns0:rFonts ns0:ascii="굴림" ns0:eastAsia="굴림" ns0:hAnsi="굴림" ns0:cs="굴림"/>
+          <ns0:lang ns0:eastAsia="ko-KR"/>
+        </ns0:rPr>
+      </ns0:r>
+      <ns0:r ns0:rsidRPr="005A6394">
+        <ns0:rPr>
+          <ns0:rFonts ns0:ascii="굴림" ns0:eastAsia="굴림" ns0:hAnsi="굴림" ns0:cs="굴림"/>
+          <ns0:lang ns0:eastAsia="ko-KR"/>
+        </ns0:rPr>
+      </ns0:r>
+      <ns0:r ns0:rsidRPr="005A6394">
+        <ns0:rPr>
+          <ns0:rFonts ns0:ascii="굴림" ns0:eastAsia="굴림" ns0:hAnsi="굴림" ns0:cs="굴림"/>
+          <ns0:lang ns0:eastAsia="ko-KR"/>
+        </ns0:rPr>
+      </ns0:r>
+      <ns0:r ns0:rsidRPr="005A6394">
+        <ns0:rPr>
+          <ns0:rFonts ns0:ascii="굴림" ns0:eastAsia="굴림" ns0:hAnsi="굴림" ns0:cs="굴림"/>
+          <ns0:lang ns0:eastAsia="ko-KR"/>
+        </ns0:rPr>
+      </ns0:r>
+      <ns0:r ns0:rsidRPr="005A6394">
+        <ns0:rPr>
+          <ns0:rFonts ns0:ascii="굴림" ns0:eastAsia="굴림" ns0:hAnsi="굴림" ns0:cs="굴림"/>
+          <ns0:lang ns0:eastAsia="ko-KR"/>
+        </ns0:rPr>
+      </ns0:r>
+      <ns0:r ns0:rsidRPr="005A6394">
+        <ns0:rPr>
+          <ns0:rFonts ns0:ascii="굴림" ns0:eastAsia="굴림" ns0:hAnsi="굴림" ns0:cs="굴림"/>
+          <ns0:lang ns0:eastAsia="ko-KR"/>
+        </ns0:rPr>
+      </ns0:r>
+      <ns0:r ns0:rsidRPr="005A6394">
+        <ns0:rPr>
+          <ns0:rFonts ns0:ascii="굴림" ns0:eastAsia="굴림" ns0:hAnsi="굴림" ns0:cs="굴림"/>
+          <ns0:lang ns0:eastAsia="ko-KR"/>
+        </ns0:rPr>
+      </ns0:r>
+      <ns0:r ns0:rsidRPr="005A6394">
+        <ns0:rPr>
+          <ns0:rFonts ns0:ascii="굴림" ns0:eastAsia="굴림" ns0:hAnsi="굴림" ns0:cs="굴림"/>
+          <ns0:lang ns0:eastAsia="ko-KR"/>
+        </ns0:rPr>
+      </ns0:r>
+      <ns0:r ns0:rsidRPr="005A6394">
+        <ns0:rPr>
+          <ns0:rFonts ns0:ascii="굴림" ns0:eastAsia="굴림" ns0:hAnsi="굴림" ns0:cs="굴림"/>
+          <ns0:lang ns0:eastAsia="ko-KR"/>
+        </ns0:rPr>
+      </ns0:r>
+      <ns0:r ns0:rsidRPr="005A6394">
+        <ns0:rPr>
+          <ns0:rFonts ns0:ascii="굴림" ns0:eastAsia="굴림" ns0:hAnsi="굴림" ns0:cs="굴림"/>
+          <ns0:lang ns0:eastAsia="ko-KR"/>
+        </ns0:rPr>
+      </ns0:r>
+      <ns0:r ns0:rsidRPr="005A6394">
+        <ns0:rPr>
+          <ns0:rFonts ns0:ascii="굴림" ns0:eastAsia="굴림" ns0:hAnsi="굴림" ns0:cs="굴림"/>
+          <ns0:lang ns0:eastAsia="ko-KR"/>
+        </ns0:rPr>
+      </ns0:r>
+      <ns0:r ns0:rsidRPr="005A6394">
+        <ns0:rPr>
+          <ns0:rFonts ns0:ascii="굴림" ns0:eastAsia="굴림" ns0:hAnsi="굴림" ns0:cs="굴림"/>
+          <ns0:lang ns0:eastAsia="ko-KR"/>
+        </ns0:rPr>
+      </ns0:r>
+      <ns0:r ns0:rsidRPr="005A6394">
+        <ns0:rPr>
+          <ns0:rFonts ns0:ascii="굴림" ns0:eastAsia="굴림" ns0:hAnsi="굴림" ns0:cs="굴림"/>
+          <ns0:lang ns0:eastAsia="ko-KR"/>
+        </ns0:rPr>
+      </ns0:r>
+      <ns0:r ns0:rsidRPr="005A6394">
+        <ns0:rPr>
+          <ns0:rFonts ns0:ascii="굴림" ns0:eastAsia="굴림" ns0:hAnsi="굴림" ns0:cs="굴림"/>
+          <ns0:lang ns0:eastAsia="ko-KR"/>
+        </ns0:rPr>
+      </ns0:r>
+      <ns0:r ns0:rsidRPr="005A6394">
+        <ns0:rPr>
+          <ns0:rFonts ns0:ascii="굴림" ns0:eastAsia="굴림" ns0:hAnsi="굴림" ns0:cs="굴림"/>
+          <ns0:lang ns0:eastAsia="ko-KR"/>
+        </ns0:rPr>
+      </ns0:r>
+      <ns0:r ns0:rsidRPr="005A6394">
+        <ns0:rPr>
+          <ns0:rFonts ns0:ascii="굴림" ns0:eastAsia="굴림" ns0:hAnsi="굴림" ns0:cs="굴림"/>
+          <ns0:lang ns0:eastAsia="ko-KR"/>
+        </ns0:rPr>
+      </ns0:r>
+      <ns0:r ns0:rsidRPr="005A6394">
+        <ns0:rPr>
+          <ns0:rFonts ns0:ascii="굴림" ns0:eastAsia="굴림" ns0:hAnsi="굴림" ns0:cs="굴림"/>
+          <ns0:lang ns0:eastAsia="ko-KR"/>
+        </ns0:rPr>
+      </ns0:r>
+      <ns0:r ns0:rsidRPr="005A6394">
+        <ns0:rPr>
+          <ns0:rFonts ns0:ascii="굴림" ns0:eastAsia="굴림" ns0:hAnsi="굴림" ns0:cs="굴림"/>
+          <ns0:lang ns0:eastAsia="ko-KR"/>
+        </ns0:rPr>
+      </ns0:r>
+      <ns0:r ns0:rsidRPr="005A6394">
+        <ns0:rPr>
+          <ns0:rFonts ns0:ascii="굴림" ns0:eastAsia="굴림" ns0:hAnsi="굴림" ns0:cs="굴림"/>
+          <ns0:lang ns0:eastAsia="ko-KR"/>
+        </ns0:rPr>
+      </ns0:r>
+      <ns0:r ns0:rsidRPr="005A6394">
+        <ns0:rPr>
+          <ns0:rFonts ns0:ascii="굴림" ns0:eastAsia="굴림" ns0:hAnsi="굴림" ns0:cs="굴림"/>
+          <ns0:lang ns0:eastAsia="ko-KR"/>
+        </ns0:rPr>
+      </ns0:r>
+      <ns0:r ns0:rsidRPr="005A6394">
+        <ns0:rPr>
+          <ns0:rFonts ns0:ascii="굴림" ns0:eastAsia="굴림" ns0:hAnsi="굴림" ns0:cs="굴림"/>
+          <ns0:lang ns0:eastAsia="ko-KR"/>
+        </ns0:rPr>
+      </ns0:r>
+      <ns0:r ns0:rsidRPr="005A6394">
+        <ns0:rPr>
+          <ns0:rFonts ns0:ascii="굴림" ns0:eastAsia="굴림" ns0:hAnsi="굴림" ns0:cs="굴림"/>
+          <ns0:lang ns0:eastAsia="ko-KR"/>
+        </ns0:rPr>
+      </ns0:r>
+      <ns0:r ns0:rsidRPr="005A6394">
+        <ns0:rPr>
+          <ns0:rFonts ns0:ascii="굴림" ns0:eastAsia="굴림" ns0:hAnsi="굴림" ns0:cs="굴림"/>
+          <ns0:lang ns0:eastAsia="ko-KR"/>
+        </ns0:rPr>
+      </ns0:r>
+      <ns0:r ns0:rsidRPr="005A6394">
+        <ns0:rPr>
+          <ns0:rFonts ns0:ascii="굴림" ns0:eastAsia="굴림" ns0:hAnsi="굴림" ns0:cs="굴림"/>
+          <ns0:lang ns0:eastAsia="ko-KR"/>
+        </ns0:rPr>
+      </ns0:r>
+      <ns0:r ns0:rsidRPr="005A6394">
+        <ns0:rPr>
+          <ns0:rFonts ns0:ascii="굴림" ns0:eastAsia="굴림" ns0:hAnsi="굴림" ns0:cs="굴림"/>
+          <ns0:lang ns0:eastAsia="ko-KR"/>
+        </ns0:rPr>
+      </ns0:r>
+      <ns0:r ns0:rsidRPr="005A6394">
+        <ns0:rPr>
+          <ns0:rFonts ns0:ascii="굴림" ns0:eastAsia="굴림" ns0:hAnsi="굴림" ns0:cs="굴림"/>
+          <ns0:lang ns0:eastAsia="ko-KR"/>
+        </ns0:rPr>
+      </ns0:r>
+      <ns0:r ns0:rsidRPr="005A6394">
+        <ns0:rPr>
+          <ns0:rFonts ns0:ascii="굴림" ns0:eastAsia="굴림" ns0:hAnsi="굴림" ns0:cs="굴림"/>
+          <ns0:lang ns0:eastAsia="ko-KR"/>
+        </ns0:rPr>
+      </ns0:r>
+      <ns0:r ns0:rsidRPr="005A6394">
+        <ns0:rPr>
+          <ns0:rFonts ns0:ascii="굴림" ns0:eastAsia="굴림" ns0:hAnsi="굴림" ns0:cs="굴림"/>
+          <ns0:lang ns0:eastAsia="ko-KR"/>
+        </ns0:rPr>
+      </ns0:r>
+      <ns0:r ns0:rsidRPr="005A6394">
+        <ns0:rPr>
+          <ns0:rFonts ns0:ascii="굴림" ns0:eastAsia="굴림" ns0:hAnsi="굴림" ns0:cs="굴림"/>
+          <ns0:lang ns0:eastAsia="ko-KR"/>
+        </ns0:rPr>
+      </ns0:r>
+      <ns0:r ns0:rsidRPr="005A6394">
+        <ns0:rPr>
+          <ns0:rFonts ns0:ascii="굴림" ns0:eastAsia="굴림" ns0:hAnsi="굴림" ns0:cs="굴림"/>
+          <ns0:lang ns0:eastAsia="ko-KR"/>
+        </ns0:rPr>
+      </ns0:r>
+      <ns0:r ns0:rsidRPr="005A6394">
+        <ns0:rPr>
+          <ns0:rFonts ns0:ascii="굴림" ns0:eastAsia="굴림" ns0:hAnsi="굴림" ns0:cs="굴림"/>
+          <ns0:lang ns0:eastAsia="ko-KR"/>
+        </ns0:rPr>
+      </ns0:r>
+      <ns0:r ns0:rsidRPr="005A6394">
+        <ns0:rPr>
+          <ns0:rFonts ns0:ascii="굴림" ns0:eastAsia="굴림" ns0:hAnsi="굴림" ns0:cs="굴림"/>
+          <ns0:lang ns0:eastAsia="ko-KR"/>
+        </ns0:rPr>
+      </ns0:r>
+      <ns0:r ns0:rsidRPr="005A6394">
+        <ns0:rPr>
+          <ns0:rFonts ns0:ascii="굴림" ns0:eastAsia="굴림" ns0:hAnsi="굴림" ns0:cs="굴림"/>
+          <ns0:lang ns0:eastAsia="ko-KR"/>
+        </ns0:rPr>
+      </ns0:r>
+      <ns0:r ns0:rsidRPr="005A6394">
+        <ns0:rPr>
+          <ns0:rFonts ns0:ascii="굴림" ns0:eastAsia="굴림" ns0:hAnsi="굴림" ns0:cs="굴림"/>
+          <ns0:lang ns0:eastAsia="ko-KR"/>
+        </ns0:rPr>
+      </ns0:r>
+      <ns0:r ns0:rsidRPr="005A6394">
+        <ns0:rPr>
+          <ns0:rFonts ns0:ascii="굴림" ns0:eastAsia="굴림" ns0:hAnsi="굴림" ns0:cs="굴림"/>
+          <ns0:lang ns0:eastAsia="ko-KR"/>
+        </ns0:rPr>
+      </ns0:r>
+      <ns0:r ns0:rsidRPr="005A6394">
+        <ns0:rPr>
+          <ns0:rFonts ns0:ascii="굴림" ns0:eastAsia="굴림" ns0:hAnsi="굴림" ns0:cs="굴림"/>
+          <ns0:lang ns0:eastAsia="ko-KR"/>
+        </ns0:rPr>
+      </ns0:r>
+      <ns0:r ns0:rsidRPr="005A6394">
+        <ns0:rPr>
+          <ns0:rFonts ns0:ascii="굴림" ns0:eastAsia="굴림" ns0:hAnsi="굴림" ns0:cs="굴림"/>
+          <ns0:lang ns0:eastAsia="ko-KR"/>
+        </ns0:rPr>
+      </ns0:r>
+      <ns0:r ns0:rsidRPr="005A6394">
+        <ns0:rPr>
+          <ns0:rFonts ns0:ascii="굴림" ns0:eastAsia="굴림" ns0:hAnsi="굴림" ns0:cs="굴림"/>
+          <ns0:lang ns0:eastAsia="ko-KR"/>
+        </ns0:rPr>
+      </ns0:r>
+      <ns0:r ns0:rsidRPr="005A6394">
+        <ns0:rPr>
+          <ns0:rFonts ns0:ascii="굴림" ns0:eastAsia="굴림" ns0:hAnsi="굴림" ns0:cs="굴림"/>
+          <ns0:lang ns0:eastAsia="ko-KR"/>
+        </ns0:rPr>
+      </ns0:r>
+    </ns0:p>
+    <ns0:p ns2:paraId="6F7A3B83" ns2:textId="77777777" ns0:rsidR="00C903FE" ns0:rsidRPr="005A6394" ns0:rsidRDefault="00361B4A">
+      <ns0:pPr>
+        <ns0:rPr>
+          <ns0:rFonts ns0:ascii="굴림" ns0:eastAsia="굴림" ns0:hAnsi="굴림"/>
+          <ns0:lang ns0:eastAsia="ko-KR"/>
+        </ns0:rPr>
+      </ns0:pPr>
+      <ns0:r ns0:rsidRPr="005A6394">
+        <ns0:rPr>
+          <ns0:rFonts ns0:ascii="굴림" ns0:eastAsia="굴림" ns0:hAnsi="굴림" ns0:cs="굴림"/>
+          <ns0:lang ns0:eastAsia="ko-KR"/>
+        </ns0:rPr>
+        <ns0:t xml:space="preserve">3. RViz에서 Pointcloud와 검출 객체가 표시되고 차량이 장애물을 반영하여 감속·정지 또는 회피하는지 확인합니다.</ns0:t>
+      </ns0:r>
+      <ns0:r ns0:rsidRPr="005A6394">
+        <ns0:rPr>
+          <ns0:rFonts ns0:ascii="굴림" ns0:eastAsia="굴림" ns0:hAnsi="굴림" ns0:cs="굴림"/>
+          <ns0:lang ns0:eastAsia="ko-KR"/>
+        </ns0:rPr>
+      </ns0:r>
+      <ns0:r ns0:rsidRPr="005A6394">
+        <ns0:rPr>
+          <ns0:rFonts ns0:ascii="굴림" ns0:eastAsia="굴림" ns0:hAnsi="굴림" ns0:cs="굴림"/>
+          <ns0:lang ns0:eastAsia="ko-KR"/>
+        </ns0:rPr>
+      </ns0:r>
+      <ns0:r ns0:rsidRPr="005A6394">
+        <ns0:rPr>
+          <ns0:rFonts ns0:ascii="굴림" ns0:eastAsia="굴림" ns0:hAnsi="굴림" ns0:cs="굴림"/>
+          <ns0:lang ns0:eastAsia="ko-KR"/>
+        </ns0:rPr>
+      </ns0:r>
+      <ns0:r ns0:rsidRPr="005A6394">
+        <ns0:rPr>
+          <ns0:rFonts ns0:ascii="굴림" ns0:eastAsia="굴림" ns0:hAnsi="굴림" ns0:cs="굴림"/>
+          <ns0:lang ns0:eastAsia="ko-KR"/>
+        </ns0:rPr>
+      </ns0:r>
+      <ns0:r ns0:rsidRPr="005A6394">
+        <ns0:rPr>
+          <ns0:rFonts ns0:ascii="굴림" ns0:eastAsia="굴림" ns0:hAnsi="굴림" ns0:cs="굴림"/>
+          <ns0:lang ns0:eastAsia="ko-KR"/>
+        </ns0:rPr>
+      </ns0:r>
+      <ns0:r ns0:rsidRPr="005A6394">
+        <ns0:rPr>
+          <ns0:rFonts ns0:ascii="굴림" ns0:eastAsia="굴림" ns0:hAnsi="굴림" ns0:cs="굴림"/>
+          <ns0:lang ns0:eastAsia="ko-KR"/>
+        </ns0:rPr>
+      </ns0:r>
+      <ns0:r ns0:rsidRPr="005A6394">
+        <ns0:rPr>
+          <ns0:rFonts ns0:ascii="굴림" ns0:eastAsia="굴림" ns0:hAnsi="굴림" ns0:cs="굴림"/>
+          <ns0:lang ns0:eastAsia="ko-KR"/>
+        </ns0:rPr>
+      </ns0:r>
+      <ns0:r ns0:rsidRPr="005A6394">
+        <ns0:rPr>
+          <ns0:rFonts ns0:ascii="굴림" ns0:eastAsia="굴림" ns0:hAnsi="굴림" ns0:cs="굴림"/>
+          <ns0:lang ns0:eastAsia="ko-KR"/>
+        </ns0:rPr>
+      </ns0:r>
+      <ns0:r ns0:rsidRPr="005A6394">
+        <ns0:rPr>
+          <ns0:rFonts ns0:ascii="굴림" ns0:eastAsia="굴림" ns0:hAnsi="굴림" ns0:cs="굴림"/>
+          <ns0:lang ns0:eastAsia="ko-KR"/>
+        </ns0:rPr>
+      </ns0:r>
+      <ns0:r ns0:rsidRPr="005A6394">
+        <ns0:rPr>
+          <ns0:rFonts ns0:ascii="굴림" ns0:eastAsia="굴림" ns0:hAnsi="굴림" ns0:cs="굴림"/>
+          <ns0:lang ns0:eastAsia="ko-KR"/>
+        </ns0:rPr>
+      </ns0:r>
+      <ns0:r ns0:rsidRPr="005A6394">
+        <ns0:rPr>
+          <ns0:rFonts ns0:ascii="굴림" ns0:eastAsia="굴림" ns0:hAnsi="굴림" ns0:cs="굴림"/>
+          <ns0:lang ns0:eastAsia="ko-KR"/>
+        </ns0:rPr>
+      </ns0:r>
+      <ns0:r ns0:rsidRPr="005A6394">
+        <ns0:rPr>
+          <ns0:rFonts ns0:ascii="굴림" ns0:eastAsia="굴림" ns0:hAnsi="굴림" ns0:cs="굴림"/>
+          <ns0:lang ns0:eastAsia="ko-KR"/>
+        </ns0:rPr>
+      </ns0:r>
+      <ns0:r ns0:rsidRPr="005A6394">
+        <ns0:rPr>
+          <ns0:rFonts ns0:ascii="굴림" ns0:eastAsia="굴림" ns0:hAnsi="굴림" ns0:cs="굴림"/>
+          <ns0:lang ns0:eastAsia="ko-KR"/>
+        </ns0:rPr>
+      </ns0:r>
+      <ns0:r ns0:rsidRPr="005A6394">
+        <ns0:rPr>
+          <ns0:rFonts ns0:ascii="굴림" ns0:eastAsia="굴림" ns0:hAnsi="굴림" ns0:cs="굴림"/>
+          <ns0:lang ns0:eastAsia="ko-KR"/>
+        </ns0:rPr>
+      </ns0:r>
+      <ns0:r ns0:rsidRPr="005A6394">
+        <ns0:rPr>
+          <ns0:rFonts ns0:ascii="굴림" ns0:eastAsia="굴림" ns0:hAnsi="굴림" ns0:cs="굴림"/>
+          <ns0:lang ns0:eastAsia="ko-KR"/>
+        </ns0:rPr>
+      </ns0:r>
+      <ns0:r ns0:rsidRPr="005A6394">
+        <ns0:rPr>
+          <ns0:rFonts ns0:ascii="굴림" ns0:eastAsia="굴림" ns0:hAnsi="굴림" ns0:cs="굴림"/>
+          <ns0:lang ns0:eastAsia="ko-KR"/>
+        </ns0:rPr>
+      </ns0:r>
+      <ns0:r ns0:rsidRPr="005A6394">
+        <ns0:rPr>
+          <ns0:rFonts ns0:ascii="굴림" ns0:eastAsia="굴림" ns0:hAnsi="굴림" ns0:cs="굴림"/>
+          <ns0:lang ns0:eastAsia="ko-KR"/>
+        </ns0:rPr>
+      </ns0:r>
+      <ns0:r ns0:rsidRPr="005A6394">
+        <ns0:rPr>
+          <ns0:rFonts ns0:ascii="굴림" ns0:eastAsia="굴림" ns0:hAnsi="굴림" ns0:cs="굴림"/>
+          <ns0:lang ns0:eastAsia="ko-KR"/>
+        </ns0:rPr>
+      </ns0:r>
+      <ns0:r ns0:rsidRPr="005A6394">
+        <ns0:rPr>
+          <ns0:rFonts ns0:ascii="굴림" ns0:eastAsia="굴림" ns0:hAnsi="굴림" ns0:cs="굴림"/>
+          <ns0:lang ns0:eastAsia="ko-KR"/>
+        </ns0:rPr>
+      </ns0:r>
+      <ns0:r ns0:rsidRPr="005A6394">
+        <ns0:rPr>
+          <ns0:rFonts ns0:ascii="굴림" ns0:eastAsia="굴림" ns0:hAnsi="굴림" ns0:cs="굴림"/>
+          <ns0:lang ns0:eastAsia="ko-KR"/>
+        </ns0:rPr>
+      </ns0:r>
+      <ns0:r ns0:rsidRPr="005A6394">
+        <ns0:rPr>
+          <ns0:rFonts ns0:ascii="굴림" ns0:eastAsia="굴림" ns0:hAnsi="굴림" ns0:cs="굴림"/>
+          <ns0:lang ns0:eastAsia="ko-KR"/>
+        </ns0:rPr>
+      </ns0:r>
+      <ns0:r ns0:rsidRPr="005A6394">
+        <ns0:rPr>
+          <ns0:rFonts ns0:ascii="굴림" ns0:eastAsia="굴림" ns0:hAnsi="굴림" ns0:cs="굴림"/>
+          <ns0:lang ns0:eastAsia="ko-KR"/>
+        </ns0:rPr>
+      </ns0:r>
+      <ns0:r ns0:rsidRPr="005A6394">
+        <ns0:rPr>
+          <ns0:rFonts ns0:ascii="굴림" ns0:eastAsia="굴림" ns0:hAnsi="굴림" ns0:cs="굴림"/>
+          <ns0:lang ns0:eastAsia="ko-KR"/>
+        </ns0:rPr>
+      </ns0:r>
+      <ns0:r ns0:rsidRPr="005A6394">
+        <ns0:rPr>
+          <ns0:rFonts ns0:ascii="굴림" ns0:eastAsia="굴림" ns0:hAnsi="굴림" ns0:cs="굴림"/>
+          <ns0:lang ns0:eastAsia="ko-KR"/>
+        </ns0:rPr>
+      </ns0:r>
+      <ns0:r ns0:rsidRPr="005A6394">
+        <ns0:rPr>
+          <ns0:rFonts ns0:ascii="굴림" ns0:eastAsia="굴림" ns0:hAnsi="굴림" ns0:cs="굴림"/>
+          <ns0:lang ns0:eastAsia="ko-KR"/>
+        </ns0:rPr>
+      </ns0:r>
+      <ns0:r ns0:rsidRPr="005A6394">
+        <ns0:rPr>
+          <ns0:rFonts ns0:ascii="굴림" ns0:eastAsia="굴림" ns0:hAnsi="굴림" ns0:cs="굴림"/>
+          <ns0:lang ns0:eastAsia="ko-KR"/>
+        </ns0:rPr>
+      </ns0:r>
+      <ns0:r ns0:rsidRPr="005A6394">
+        <ns0:rPr>
+          <ns0:rFonts ns0:ascii="굴림" ns0:eastAsia="굴림" ns0:hAnsi="굴림" ns0:cs="굴림"/>
+          <ns0:lang ns0:eastAsia="ko-KR"/>
+        </ns0:rPr>
+      </ns0:r>
+      <ns0:r ns0:rsidRPr="005A6394">
+        <ns0:rPr>
+          <ns0:rFonts ns0:ascii="굴림" ns0:eastAsia="굴림" ns0:hAnsi="굴림" ns0:cs="굴림"/>
+          <ns0:lang ns0:eastAsia="ko-KR"/>
+        </ns0:rPr>
+      </ns0:r>
+      <ns0:r ns0:rsidRPr="005A6394">
+        <ns0:rPr>
+          <ns0:rFonts ns0:ascii="굴림" ns0:eastAsia="굴림" ns0:hAnsi="굴림" ns0:cs="굴림"/>
+          <ns0:lang ns0:eastAsia="ko-KR"/>
+        </ns0:rPr>
+      </ns0:r>
+      <ns0:r ns0:rsidRPr="005A6394">
+        <ns0:rPr>
+          <ns0:rFonts ns0:ascii="굴림" ns0:eastAsia="굴림" ns0:hAnsi="굴림" ns0:cs="굴림"/>
+          <ns0:lang ns0:eastAsia="ko-KR"/>
+        </ns0:rPr>
+      </ns0:r>
+      <ns0:r ns0:rsidRPr="005A6394">
+        <ns0:rPr>
+          <ns0:rFonts ns0:ascii="굴림" ns0:eastAsia="굴림" ns0:hAnsi="굴림" ns0:cs="굴림"/>
+          <ns0:lang ns0:eastAsia="ko-KR"/>
+        </ns0:rPr>
+      </ns0:r>
+      <ns0:r ns0:rsidRPr="005A6394">
+        <ns0:rPr>
+          <ns0:rFonts ns0:ascii="굴림" ns0:eastAsia="굴림" ns0:hAnsi="굴림" ns0:cs="굴림"/>
+          <ns0:lang ns0:eastAsia="ko-KR"/>
+        </ns0:rPr>
+      </ns0:r>
+      <ns0:r ns0:rsidRPr="005A6394">
+        <ns0:rPr>
+          <ns0:rFonts ns0:ascii="굴림" ns0:eastAsia="굴림" ns0:hAnsi="굴림" ns0:cs="굴림"/>
+          <ns0:lang ns0:eastAsia="ko-KR"/>
+        </ns0:rPr>
+      </ns0:r>
+      <ns0:r ns0:rsidRPr="005A6394">
+        <ns0:rPr>
+          <ns0:rFonts ns0:ascii="굴림" ns0:eastAsia="굴림" ns0:hAnsi="굴림" ns0:cs="굴림"/>
+          <ns0:lang ns0:eastAsia="ko-KR"/>
+        </ns0:rPr>
+      </ns0:r>
+      <ns0:r ns0:rsidRPr="005A6394">
+        <ns0:rPr>
+          <ns0:rFonts ns0:ascii="굴림" ns0:eastAsia="굴림" ns0:hAnsi="굴림" ns0:cs="굴림"/>
+          <ns0:lang ns0:eastAsia="ko-KR"/>
+        </ns0:rPr>
+      </ns0:r>
+      <ns0:r ns0:rsidRPr="005A6394">
+        <ns0:rPr>
+          <ns0:rFonts ns0:ascii="굴림" ns0:eastAsia="굴림" ns0:hAnsi="굴림" ns0:cs="굴림"/>
+          <ns0:lang ns0:eastAsia="ko-KR"/>
+        </ns0:rPr>
+      </ns0:r>
+      <ns0:r ns0:rsidRPr="005A6394">
+        <ns0:rPr>
+          <ns0:rFonts ns0:ascii="굴림" ns0:eastAsia="굴림" ns0:hAnsi="굴림" ns0:cs="굴림"/>
+          <ns0:lang ns0:eastAsia="ko-KR"/>
+        </ns0:rPr>
+      </ns0:r>
+      <ns0:r ns0:rsidRPr="005A6394">
+        <ns0:rPr>
+          <ns0:rFonts ns0:ascii="굴림" ns0:eastAsia="굴림" ns0:hAnsi="굴림" ns0:cs="굴림"/>
+          <ns0:lang ns0:eastAsia="ko-KR"/>
+        </ns0:rPr>
+      </ns0:r>
+      <ns0:r ns0:rsidRPr="005A6394">
+        <ns0:rPr>
+          <ns0:rFonts ns0:ascii="굴림" ns0:eastAsia="굴림" ns0:hAnsi="굴림" ns0:cs="굴림"/>
+          <ns0:lang ns0:eastAsia="ko-KR"/>
+        </ns0:rPr>
+      </ns0:r>
+      <ns0:r ns0:rsidRPr="005A6394">
+        <ns0:rPr>
+          <ns0:rFonts ns0:ascii="굴림" ns0:eastAsia="굴림" ns0:hAnsi="굴림" ns0:cs="굴림"/>
+          <ns0:lang ns0:eastAsia="ko-KR"/>
+        </ns0:rPr>
+      </ns0:r>
+      <ns0:r ns0:rsidRPr="005A6394">
+        <ns0:rPr>
+          <ns0:rFonts ns0:ascii="굴림" ns0:eastAsia="굴림" ns0:hAnsi="굴림" ns0:cs="굴림"/>
+          <ns0:lang ns0:eastAsia="ko-KR"/>
+        </ns0:rPr>
+      </ns0:r>
+      <ns0:r ns0:rsidRPr="005A6394">
+        <ns0:rPr>
+          <ns0:rFonts ns0:ascii="굴림" ns0:eastAsia="굴림" ns0:hAnsi="굴림" ns0:cs="굴림"/>
+          <ns0:lang ns0:eastAsia="ko-KR"/>
+        </ns0:rPr>
+      </ns0:r>
+      <ns0:r ns0:rsidRPr="005A6394">
+        <ns0:rPr>
+          <ns0:rFonts ns0:ascii="굴림" ns0:eastAsia="굴림" ns0:hAnsi="굴림" ns0:cs="굴림"/>
+          <ns0:lang ns0:eastAsia="ko-KR"/>
+        </ns0:rPr>
+      </ns0:r>
+    </ns0:p>
+    <ns0:p ns2:paraId="6F7A3B83" ns2:textId="77777777" ns0:rsidR="00C903FE" ns0:rsidRPr="005A6394" ns0:rsidRDefault="00361B4A">
+      <ns0:pPr>
+        <ns0:rPr>
+          <ns0:rFonts ns0:ascii="굴림" ns0:eastAsia="굴림" ns0:hAnsi="굴림"/>
+          <ns0:lang ns0:eastAsia="ko-KR"/>
+        </ns0:rPr>
+      </ns0:pPr>
+      <ns0:r ns0:rsidRPr="005A6394">
+        <ns0:rPr>
+          <ns0:rFonts ns0:ascii="굴림" ns0:eastAsia="굴림" ns0:hAnsi="굴림" ns0:cs="굴림"/>
+          <ns0:lang ns0:eastAsia="ko-KR"/>
+        </ns0:rPr>
+        <ns0:t xml:space="preserve">4. 장애물을 삭제한 뒤 Planning trajectory가 갱신되고 차량이 다시 주행하는지 확인합니다.</ns0:t>
+      </ns0:r>
+      <ns0:r ns0:rsidRPr="005A6394">
+        <ns0:rPr>
+          <ns0:rFonts ns0:ascii="굴림" ns0:eastAsia="굴림" ns0:hAnsi="굴림" ns0:cs="굴림"/>
+          <ns0:lang ns0:eastAsia="ko-KR"/>
+        </ns0:rPr>
+      </ns0:r>
+      <ns0:r ns0:rsidRPr="005A6394">
+        <ns0:rPr>
+          <ns0:rFonts ns0:ascii="굴림" ns0:eastAsia="굴림" ns0:hAnsi="굴림" ns0:cs="굴림"/>
+          <ns0:lang ns0:eastAsia="ko-KR"/>
+        </ns0:rPr>
+      </ns0:r>
+      <ns0:r ns0:rsidRPr="005A6394">
+        <ns0:rPr>
+          <ns0:rFonts ns0:ascii="굴림" ns0:eastAsia="굴림" ns0:hAnsi="굴림" ns0:cs="굴림"/>
+          <ns0:lang ns0:eastAsia="ko-KR"/>
+        </ns0:rPr>
+      </ns0:r>
+      <ns0:r ns0:rsidRPr="005A6394">
+        <ns0:rPr>
+          <ns0:rFonts ns0:ascii="굴림" ns0:eastAsia="굴림" ns0:hAnsi="굴림" ns0:cs="굴림"/>
+          <ns0:lang ns0:eastAsia="ko-KR"/>
+        </ns0:rPr>
+      </ns0:r>
+      <ns0:r ns0:rsidRPr="005A6394">
+        <ns0:rPr>
+          <ns0:rFonts ns0:ascii="굴림" ns0:eastAsia="굴림" ns0:hAnsi="굴림" ns0:cs="굴림"/>
+          <ns0:lang ns0:eastAsia="ko-KR"/>
+        </ns0:rPr>
+      </ns0:r>
+      <ns0:r ns0:rsidRPr="005A6394">
+        <ns0:rPr>
+          <ns0:rFonts ns0:ascii="굴림" ns0:eastAsia="굴림" ns0:hAnsi="굴림" ns0:cs="굴림"/>
+          <ns0:lang ns0:eastAsia="ko-KR"/>
+        </ns0:rPr>
+      </ns0:r>
+      <ns0:r ns0:rsidRPr="005A6394">
+        <ns0:rPr>
+          <ns0:rFonts ns0:ascii="굴림" ns0:eastAsia="굴림" ns0:hAnsi="굴림" ns0:cs="굴림"/>
+          <ns0:lang ns0:eastAsia="ko-KR"/>
+        </ns0:rPr>
+      </ns0:r>
+      <ns0:r ns0:rsidRPr="005A6394">
+        <ns0:rPr>
+          <ns0:rFonts ns0:ascii="굴림" ns0:eastAsia="굴림" ns0:hAnsi="굴림" ns0:cs="굴림"/>
+          <ns0:lang ns0:eastAsia="ko-KR"/>
+        </ns0:rPr>
+      </ns0:r>
+      <ns0:r ns0:rsidRPr="005A6394">
+        <ns0:rPr>
+          <ns0:rFonts ns0:ascii="굴림" ns0:eastAsia="굴림" ns0:hAnsi="굴림" ns0:cs="굴림"/>
+          <ns0:lang ns0:eastAsia="ko-KR"/>
+        </ns0:rPr>
+      </ns0:r>
+      <ns0:r ns0:rsidRPr="005A6394">
+        <ns0:rPr>
+          <ns0:rFonts ns0:ascii="굴림" ns0:eastAsia="굴림" ns0:hAnsi="굴림" ns0:cs="굴림"/>
+          <ns0:lang ns0:eastAsia="ko-KR"/>
+        </ns0:rPr>
+      </ns0:r>
+      <ns0:r ns0:rsidRPr="005A6394">
+        <ns0:rPr>
+          <ns0:rFonts ns0:ascii="굴림" ns0:eastAsia="굴림" ns0:hAnsi="굴림" ns0:cs="굴림"/>
+          <ns0:lang ns0:eastAsia="ko-KR"/>
+        </ns0:rPr>
+      </ns0:r>
+      <ns0:r ns0:rsidRPr="005A6394">
+        <ns0:rPr>
+          <ns0:rFonts ns0:ascii="굴림" ns0:eastAsia="굴림" ns0:hAnsi="굴림" ns0:cs="굴림"/>
+          <ns0:lang ns0:eastAsia="ko-KR"/>
+        </ns0:rPr>
+      </ns0:r>
+      <ns0:r ns0:rsidRPr="005A6394">
+        <ns0:rPr>
+          <ns0:rFonts ns0:ascii="굴림" ns0:eastAsia="굴림" ns0:hAnsi="굴림" ns0:cs="굴림"/>
+          <ns0:lang ns0:eastAsia="ko-KR"/>
+        </ns0:rPr>
+      </ns0:r>
+      <ns0:r ns0:rsidRPr="005A6394">
+        <ns0:rPr>
+          <ns0:rFonts ns0:ascii="굴림" ns0:eastAsia="굴림" ns0:hAnsi="굴림" ns0:cs="굴림"/>
+          <ns0:lang ns0:eastAsia="ko-KR"/>
+        </ns0:rPr>
+      </ns0:r>
+      <ns0:r ns0:rsidRPr="005A6394">
+        <ns0:rPr>
+          <ns0:rFonts ns0:ascii="굴림" ns0:eastAsia="굴림" ns0:hAnsi="굴림" ns0:cs="굴림"/>
+          <ns0:lang ns0:eastAsia="ko-KR"/>
+        </ns0:rPr>
+      </ns0:r>
+      <ns0:r ns0:rsidRPr="005A6394">
+        <ns0:rPr>
+          <ns0:rFonts ns0:ascii="굴림" ns0:eastAsia="굴림" ns0:hAnsi="굴림" ns0:cs="굴림"/>
+          <ns0:lang ns0:eastAsia="ko-KR"/>
+        </ns0:rPr>
+      </ns0:r>
+      <ns0:r ns0:rsidRPr="005A6394">
+        <ns0:rPr>
+          <ns0:rFonts ns0:ascii="굴림" ns0:eastAsia="굴림" ns0:hAnsi="굴림" ns0:cs="굴림"/>
+          <ns0:lang ns0:eastAsia="ko-KR"/>
+        </ns0:rPr>
+      </ns0:r>
+      <ns0:r ns0:rsidRPr="005A6394">
+        <ns0:rPr>
+          <ns0:rFonts ns0:ascii="굴림" ns0:eastAsia="굴림" ns0:hAnsi="굴림" ns0:cs="굴림"/>
+          <ns0:lang ns0:eastAsia="ko-KR"/>
+        </ns0:rPr>
+      </ns0:r>
+      <ns0:r ns0:rsidRPr="005A6394">
+        <ns0:rPr>
+          <ns0:rFonts ns0:ascii="굴림" ns0:eastAsia="굴림" ns0:hAnsi="굴림" ns0:cs="굴림"/>
+          <ns0:lang ns0:eastAsia="ko-KR"/>
+        </ns0:rPr>
+      </ns0:r>
+      <ns0:r ns0:rsidRPr="005A6394">
+        <ns0:rPr>
+          <ns0:rFonts ns0:ascii="굴림" ns0:eastAsia="굴림" ns0:hAnsi="굴림" ns0:cs="굴림"/>
+          <ns0:lang ns0:eastAsia="ko-KR"/>
+        </ns0:rPr>
+      </ns0:r>
+      <ns0:r ns0:rsidRPr="005A6394">
+        <ns0:rPr>
+          <ns0:rFonts ns0:ascii="굴림" ns0:eastAsia="굴림" ns0:hAnsi="굴림" ns0:cs="굴림"/>
+          <ns0:lang ns0:eastAsia="ko-KR"/>
+        </ns0:rPr>
+      </ns0:r>
+      <ns0:r ns0:rsidRPr="005A6394">
+        <ns0:rPr>
+          <ns0:rFonts ns0:ascii="굴림" ns0:eastAsia="굴림" ns0:hAnsi="굴림" ns0:cs="굴림"/>
+          <ns0:lang ns0:eastAsia="ko-KR"/>
+        </ns0:rPr>
+      </ns0:r>
+      <ns0:r ns0:rsidRPr="005A6394">
+        <ns0:rPr>
+          <ns0:rFonts ns0:ascii="굴림" ns0:eastAsia="굴림" ns0:hAnsi="굴림" ns0:cs="굴림"/>
+          <ns0:lang ns0:eastAsia="ko-KR"/>
+        </ns0:rPr>
+      </ns0:r>
+      <ns0:r ns0:rsidRPr="005A6394">
+        <ns0:rPr>
+          <ns0:rFonts ns0:ascii="굴림" ns0:eastAsia="굴림" ns0:hAnsi="굴림" ns0:cs="굴림"/>
+          <ns0:lang ns0:eastAsia="ko-KR"/>
+        </ns0:rPr>
+      </ns0:r>
+      <ns0:r ns0:rsidRPr="005A6394">
+        <ns0:rPr>
+          <ns0:rFonts ns0:ascii="굴림" ns0:eastAsia="굴림" ns0:hAnsi="굴림" ns0:cs="굴림"/>
+          <ns0:lang ns0:eastAsia="ko-KR"/>
+        </ns0:rPr>
+      </ns0:r>
+      <ns0:r ns0:rsidRPr="005A6394">
+        <ns0:rPr>
+          <ns0:rFonts ns0:ascii="굴림" ns0:eastAsia="굴림" ns0:hAnsi="굴림" ns0:cs="굴림"/>
+          <ns0:lang ns0:eastAsia="ko-KR"/>
+        </ns0:rPr>
+      </ns0:r>
+      <ns0:r ns0:rsidRPr="005A6394">
+        <ns0:rPr>
+          <ns0:rFonts ns0:ascii="굴림" ns0:eastAsia="굴림" ns0:hAnsi="굴림" ns0:cs="굴림"/>
+          <ns0:lang ns0:eastAsia="ko-KR"/>
+        </ns0:rPr>
+      </ns0:r>
+      <ns0:r ns0:rsidRPr="005A6394">
+        <ns0:rPr>
+          <ns0:rFonts ns0:ascii="굴림" ns0:eastAsia="굴림" ns0:hAnsi="굴림" ns0:cs="굴림"/>
+          <ns0:lang ns0:eastAsia="ko-KR"/>
+        </ns0:rPr>
+      </ns0:r>
+      <ns0:r ns0:rsidRPr="005A6394">
+        <ns0:rPr>
+          <ns0:rFonts ns0:ascii="굴림" ns0:eastAsia="굴림" ns0:hAnsi="굴림" ns0:cs="굴림"/>
+          <ns0:lang ns0:eastAsia="ko-KR"/>
+        </ns0:rPr>
+      </ns0:r>
+      <ns0:r ns0:rsidRPr="005A6394">
+        <ns0:rPr>
+          <ns0:rFonts ns0:ascii="굴림" ns0:eastAsia="굴림" ns0:hAnsi="굴림" ns0:cs="굴림"/>
+          <ns0:lang ns0:eastAsia="ko-KR"/>
+        </ns0:rPr>
+      </ns0:r>
+      <ns0:r ns0:rsidRPr="005A6394">
+        <ns0:rPr>
+          <ns0:rFonts ns0:ascii="굴림" ns0:eastAsia="굴림" ns0:hAnsi="굴림" ns0:cs="굴림"/>
+          <ns0:lang ns0:eastAsia="ko-KR"/>
+        </ns0:rPr>
+      </ns0:r>
+      <ns0:r ns0:rsidRPr="005A6394">
+        <ns0:rPr>
+          <ns0:rFonts ns0:ascii="굴림" ns0:eastAsia="굴림" ns0:hAnsi="굴림" ns0:cs="굴림"/>
+          <ns0:lang ns0:eastAsia="ko-KR"/>
+        </ns0:rPr>
+      </ns0:r>
+      <ns0:r ns0:rsidRPr="005A6394">
+        <ns0:rPr>
+          <ns0:rFonts ns0:ascii="굴림" ns0:eastAsia="굴림" ns0:hAnsi="굴림" ns0:cs="굴림"/>
+          <ns0:lang ns0:eastAsia="ko-KR"/>
+        </ns0:rPr>
+      </ns0:r>
+      <ns0:r ns0:rsidRPr="005A6394">
+        <ns0:rPr>
+          <ns0:rFonts ns0:ascii="굴림" ns0:eastAsia="굴림" ns0:hAnsi="굴림" ns0:cs="굴림"/>
+          <ns0:lang ns0:eastAsia="ko-KR"/>
+        </ns0:rPr>
+      </ns0:r>
+      <ns0:r ns0:rsidRPr="005A6394">
+        <ns0:rPr>
+          <ns0:rFonts ns0:ascii="굴림" ns0:eastAsia="굴림" ns0:hAnsi="굴림" ns0:cs="굴림"/>
+          <ns0:lang ns0:eastAsia="ko-KR"/>
+        </ns0:rPr>
+      </ns0:r>
+      <ns0:r ns0:rsidRPr="005A6394">
+        <ns0:rPr>
+          <ns0:rFonts ns0:ascii="굴림" ns0:eastAsia="굴림" ns0:hAnsi="굴림" ns0:cs="굴림"/>
+          <ns0:lang ns0:eastAsia="ko-KR"/>
+        </ns0:rPr>
+      </ns0:r>
+      <ns0:r ns0:rsidRPr="005A6394">
+        <ns0:rPr>
+          <ns0:rFonts ns0:ascii="굴림" ns0:eastAsia="굴림" ns0:hAnsi="굴림" ns0:cs="굴림"/>
+          <ns0:lang ns0:eastAsia="ko-KR"/>
+        </ns0:rPr>
+      </ns0:r>
+      <ns0:r ns0:rsidRPr="005A6394">
+        <ns0:rPr>
+          <ns0:rFonts ns0:ascii="굴림" ns0:eastAsia="굴림" ns0:hAnsi="굴림" ns0:cs="굴림"/>
+          <ns0:lang ns0:eastAsia="ko-KR"/>
+        </ns0:rPr>
+      </ns0:r>
+      <ns0:r ns0:rsidRPr="005A6394">
+        <ns0:rPr>
+          <ns0:rFonts ns0:ascii="굴림" ns0:eastAsia="굴림" ns0:hAnsi="굴림" ns0:cs="굴림"/>
+          <ns0:lang ns0:eastAsia="ko-KR"/>
+        </ns0:rPr>
+      </ns0:r>
+      <ns0:r ns0:rsidRPr="005A6394">
+        <ns0:rPr>
+          <ns0:rFonts ns0:ascii="굴림" ns0:eastAsia="굴림" ns0:hAnsi="굴림" ns0:cs="굴림"/>
+          <ns0:lang ns0:eastAsia="ko-KR"/>
+        </ns0:rPr>
+      </ns0:r>
+      <ns0:r ns0:rsidRPr="005A6394">
+        <ns0:rPr>
+          <ns0:rFonts ns0:ascii="굴림" ns0:eastAsia="굴림" ns0:hAnsi="굴림" ns0:cs="굴림"/>
+          <ns0:lang ns0:eastAsia="ko-KR"/>
+        </ns0:rPr>
+      </ns0:r>
+      <ns0:r ns0:rsidRPr="005A6394">
+        <ns0:rPr>
+          <ns0:rFonts ns0:ascii="굴림" ns0:eastAsia="굴림" ns0:hAnsi="굴림" ns0:cs="굴림"/>
+          <ns0:lang ns0:eastAsia="ko-KR"/>
+        </ns0:rPr>
+      </ns0:r>
+      <ns0:r ns0:rsidRPr="005A6394">
+        <ns0:rPr>
+          <ns0:rFonts ns0:ascii="굴림" ns0:eastAsia="굴림" ns0:hAnsi="굴림" ns0:cs="굴림"/>
+          <ns0:lang ns0:eastAsia="ko-KR"/>
+        </ns0:rPr>
+      </ns0:r>
+    </ns0:p>
+    <ns0:p ns2:paraId="6F7A3B83" ns2:textId="77777777" ns0:rsidR="00C903FE" ns0:rsidRPr="005A6394" ns0:rsidRDefault="00361B4A">
+      <ns0:pPr>
+        <ns0:rPr>
+          <ns0:rFonts ns0:ascii="굴림" ns0:eastAsia="굴림" ns0:hAnsi="굴림"/>
+          <ns0:lang ns0:eastAsia="ko-KR"/>
+        </ns0:rPr>
+      </ns0:pPr>
+      <ns0:r ns0:rsidRPr="005A6394">
+        <ns0:rPr>
+          <ns0:rFonts ns0:ascii="굴림" ns0:eastAsia="굴림" ns0:hAnsi="굴림" ns0:cs="굴림"/>
+          <ns0:lang ns0:eastAsia="ko-KR"/>
+        </ns0:rPr>
+        <ns0:t xml:space="preserve">5. 필요하면 Perception 컨테이너에서 다음 토픽의 발행 여부를 순서대로 확인합니다: /sensing/lidar/virtual/pointcloud_raw, /sensing/lidar/concatenated/pointcloud, /perception/obstacle_segmentation/pointcloud, /perception/object_recognition/detection/labeled_clusters, /perception/object_recognition/objects.</ns0:t>
+      </ns0:r>
+      <ns0:r ns0:rsidRPr="005A6394">
+        <ns0:rPr>
+          <ns0:rFonts ns0:ascii="굴림" ns0:eastAsia="굴림" ns0:hAnsi="굴림" ns0:cs="굴림"/>
+          <ns0:lang ns0:eastAsia="ko-KR"/>
+        </ns0:rPr>
+      </ns0:r>
+      <ns0:r ns0:rsidRPr="005A6394">
+        <ns0:rPr>
+          <ns0:rFonts ns0:ascii="굴림" ns0:eastAsia="굴림" ns0:hAnsi="굴림" ns0:cs="굴림"/>
+          <ns0:lang ns0:eastAsia="ko-KR"/>
+        </ns0:rPr>
+      </ns0:r>
+      <ns0:r ns0:rsidRPr="005A6394">
+        <ns0:rPr>
+          <ns0:rFonts ns0:ascii="굴림" ns0:eastAsia="굴림" ns0:hAnsi="굴림" ns0:cs="굴림"/>
+          <ns0:lang ns0:eastAsia="ko-KR"/>
+        </ns0:rPr>
+      </ns0:r>
+      <ns0:r ns0:rsidRPr="005A6394">
+        <ns0:rPr>
+          <ns0:rFonts ns0:ascii="굴림" ns0:eastAsia="굴림" ns0:hAnsi="굴림" ns0:cs="굴림"/>
+          <ns0:lang ns0:eastAsia="ko-KR"/>
+        </ns0:rPr>
+      </ns0:r>
+      <ns0:r ns0:rsidRPr="005A6394">
+        <ns0:rPr>
+          <ns0:rFonts ns0:ascii="굴림" ns0:eastAsia="굴림" ns0:hAnsi="굴림" ns0:cs="굴림"/>
+          <ns0:lang ns0:eastAsia="ko-KR"/>
+        </ns0:rPr>
+      </ns0:r>
+      <ns0:r ns0:rsidRPr="005A6394">
+        <ns0:rPr>
+          <ns0:rFonts ns0:ascii="굴림" ns0:eastAsia="굴림" ns0:hAnsi="굴림" ns0:cs="굴림"/>
+          <ns0:lang ns0:eastAsia="ko-KR"/>
+        </ns0:rPr>
+      </ns0:r>
+      <ns0:r ns0:rsidRPr="005A6394">
+        <ns0:rPr>
+          <ns0:rFonts ns0:ascii="굴림" ns0:eastAsia="굴림" ns0:hAnsi="굴림" ns0:cs="굴림"/>
+          <ns0:lang ns0:eastAsia="ko-KR"/>
+        </ns0:rPr>
+      </ns0:r>
+      <ns0:r ns0:rsidRPr="005A6394">
+        <ns0:rPr>
+          <ns0:rFonts ns0:ascii="굴림" ns0:eastAsia="굴림" ns0:hAnsi="굴림" ns0:cs="굴림"/>
+          <ns0:lang ns0:eastAsia="ko-KR"/>
+        </ns0:rPr>
+      </ns0:r>
+      <ns0:r ns0:rsidRPr="005A6394">
+        <ns0:rPr>
+          <ns0:rFonts ns0:ascii="굴림" ns0:eastAsia="굴림" ns0:hAnsi="굴림" ns0:cs="굴림"/>
+          <ns0:lang ns0:eastAsia="ko-KR"/>
+        </ns0:rPr>
+      </ns0:r>
+      <ns0:r ns0:rsidRPr="005A6394">
+        <ns0:rPr>
+          <ns0:rFonts ns0:ascii="굴림" ns0:eastAsia="굴림" ns0:hAnsi="굴림" ns0:cs="굴림"/>
+          <ns0:lang ns0:eastAsia="ko-KR"/>
+        </ns0:rPr>
+      </ns0:r>
+      <ns0:r ns0:rsidRPr="005A6394">
+        <ns0:rPr>
+          <ns0:rFonts ns0:ascii="굴림" ns0:eastAsia="굴림" ns0:hAnsi="굴림" ns0:cs="굴림"/>
+          <ns0:lang ns0:eastAsia="ko-KR"/>
+        </ns0:rPr>
+      </ns0:r>
+      <ns0:r ns0:rsidRPr="005A6394">
+        <ns0:rPr>
+          <ns0:rFonts ns0:ascii="굴림" ns0:eastAsia="굴림" ns0:hAnsi="굴림" ns0:cs="굴림"/>
+          <ns0:lang ns0:eastAsia="ko-KR"/>
+        </ns0:rPr>
+      </ns0:r>
+      <ns0:r ns0:rsidRPr="005A6394">
+        <ns0:rPr>
+          <ns0:rFonts ns0:ascii="굴림" ns0:eastAsia="굴림" ns0:hAnsi="굴림" ns0:cs="굴림"/>
+          <ns0:lang ns0:eastAsia="ko-KR"/>
+        </ns0:rPr>
+      </ns0:r>
+      <ns0:r ns0:rsidRPr="005A6394">
+        <ns0:rPr>
+          <ns0:rFonts ns0:ascii="굴림" ns0:eastAsia="굴림" ns0:hAnsi="굴림" ns0:cs="굴림"/>
+          <ns0:lang ns0:eastAsia="ko-KR"/>
+        </ns0:rPr>
+      </ns0:r>
+      <ns0:r ns0:rsidRPr="005A6394">
+        <ns0:rPr>
+          <ns0:rFonts ns0:ascii="굴림" ns0:eastAsia="굴림" ns0:hAnsi="굴림" ns0:cs="굴림"/>
+          <ns0:lang ns0:eastAsia="ko-KR"/>
+        </ns0:rPr>
+      </ns0:r>
+      <ns0:r ns0:rsidRPr="005A6394">
+        <ns0:rPr>
+          <ns0:rFonts ns0:ascii="굴림" ns0:eastAsia="굴림" ns0:hAnsi="굴림" ns0:cs="굴림"/>
+          <ns0:lang ns0:eastAsia="ko-KR"/>
+        </ns0:rPr>
+      </ns0:r>
+      <ns0:r ns0:rsidRPr="005A6394">
+        <ns0:rPr>
+          <ns0:rFonts ns0:ascii="굴림" ns0:eastAsia="굴림" ns0:hAnsi="굴림" ns0:cs="굴림"/>
+          <ns0:lang ns0:eastAsia="ko-KR"/>
+        </ns0:rPr>
+      </ns0:r>
+      <ns0:r ns0:rsidRPr="005A6394">
+        <ns0:rPr>
+          <ns0:rFonts ns0:ascii="굴림" ns0:eastAsia="굴림" ns0:hAnsi="굴림" ns0:cs="굴림"/>
+          <ns0:lang ns0:eastAsia="ko-KR"/>
+        </ns0:rPr>
+      </ns0:r>
+      <ns0:r ns0:rsidRPr="005A6394">
+        <ns0:rPr>
+          <ns0:rFonts ns0:ascii="굴림" ns0:eastAsia="굴림" ns0:hAnsi="굴림" ns0:cs="굴림"/>
+          <ns0:lang ns0:eastAsia="ko-KR"/>
+        </ns0:rPr>
+      </ns0:r>
+      <ns0:r ns0:rsidRPr="005A6394">
+        <ns0:rPr>
+          <ns0:rFonts ns0:ascii="굴림" ns0:eastAsia="굴림" ns0:hAnsi="굴림" ns0:cs="굴림"/>
+          <ns0:lang ns0:eastAsia="ko-KR"/>
+        </ns0:rPr>
+      </ns0:r>
+      <ns0:r ns0:rsidRPr="005A6394">
+        <ns0:rPr>
+          <ns0:rFonts ns0:ascii="굴림" ns0:eastAsia="굴림" ns0:hAnsi="굴림" ns0:cs="굴림"/>
+          <ns0:lang ns0:eastAsia="ko-KR"/>
+        </ns0:rPr>
+      </ns0:r>
+      <ns0:r ns0:rsidRPr="005A6394">
+        <ns0:rPr>
+          <ns0:rFonts ns0:ascii="굴림" ns0:eastAsia="굴림" ns0:hAnsi="굴림" ns0:cs="굴림"/>
+          <ns0:lang ns0:eastAsia="ko-KR"/>
+        </ns0:rPr>
+      </ns0:r>
+      <ns0:r ns0:rsidRPr="005A6394">
+        <ns0:rPr>
+          <ns0:rFonts ns0:ascii="굴림" ns0:eastAsia="굴림" ns0:hAnsi="굴림" ns0:cs="굴림"/>
+          <ns0:lang ns0:eastAsia="ko-KR"/>
+        </ns0:rPr>
+      </ns0:r>
+      <ns0:r ns0:rsidRPr="005A6394">
+        <ns0:rPr>
+          <ns0:rFonts ns0:ascii="굴림" ns0:eastAsia="굴림" ns0:hAnsi="굴림" ns0:cs="굴림"/>
+          <ns0:lang ns0:eastAsia="ko-KR"/>
+        </ns0:rPr>
+      </ns0:r>
+      <ns0:r ns0:rsidRPr="005A6394">
+        <ns0:rPr>
+          <ns0:rFonts ns0:ascii="굴림" ns0:eastAsia="굴림" ns0:hAnsi="굴림" ns0:cs="굴림"/>
+          <ns0:lang ns0:eastAsia="ko-KR"/>
+        </ns0:rPr>
+      </ns0:r>
+      <ns0:r ns0:rsidRPr="005A6394">
+        <ns0:rPr>
+          <ns0:rFonts ns0:ascii="굴림" ns0:eastAsia="굴림" ns0:hAnsi="굴림" ns0:cs="굴림"/>
+          <ns0:lang ns0:eastAsia="ko-KR"/>
+        </ns0:rPr>
+      </ns0:r>
+      <ns0:r ns0:rsidRPr="005A6394">
+        <ns0:rPr>
+          <ns0:rFonts ns0:ascii="굴림" ns0:eastAsia="굴림" ns0:hAnsi="굴림" ns0:cs="굴림"/>
+          <ns0:lang ns0:eastAsia="ko-KR"/>
+        </ns0:rPr>
+      </ns0:r>
+      <ns0:r ns0:rsidRPr="005A6394">
+        <ns0:rPr>
+          <ns0:rFonts ns0:ascii="굴림" ns0:eastAsia="굴림" ns0:hAnsi="굴림" ns0:cs="굴림"/>
+          <ns0:lang ns0:eastAsia="ko-KR"/>
+        </ns0:rPr>
+      </ns0:r>
+      <ns0:r ns0:rsidRPr="005A6394">
+        <ns0:rPr>
+          <ns0:rFonts ns0:ascii="굴림" ns0:eastAsia="굴림" ns0:hAnsi="굴림" ns0:cs="굴림"/>
+          <ns0:lang ns0:eastAsia="ko-KR"/>
+        </ns0:rPr>
+      </ns0:r>
+      <ns0:r ns0:rsidRPr="005A6394">
+        <ns0:rPr>
+          <ns0:rFonts ns0:ascii="굴림" ns0:eastAsia="굴림" ns0:hAnsi="굴림" ns0:cs="굴림"/>
+          <ns0:lang ns0:eastAsia="ko-KR"/>
+        </ns0:rPr>
+      </ns0:r>
+      <ns0:r ns0:rsidRPr="005A6394">
+        <ns0:rPr>
+          <ns0:rFonts ns0:ascii="굴림" ns0:eastAsia="굴림" ns0:hAnsi="굴림" ns0:cs="굴림"/>
+          <ns0:lang ns0:eastAsia="ko-KR"/>
+        </ns0:rPr>
+      </ns0:r>
+      <ns0:r ns0:rsidRPr="005A6394">
+        <ns0:rPr>
+          <ns0:rFonts ns0:ascii="굴림" ns0:eastAsia="굴림" ns0:hAnsi="굴림" ns0:cs="굴림"/>
+          <ns0:lang ns0:eastAsia="ko-KR"/>
+        </ns0:rPr>
+      </ns0:r>
+      <ns0:r ns0:rsidRPr="005A6394">
+        <ns0:rPr>
+          <ns0:rFonts ns0:ascii="굴림" ns0:eastAsia="굴림" ns0:hAnsi="굴림" ns0:cs="굴림"/>
+          <ns0:lang ns0:eastAsia="ko-KR"/>
+        </ns0:rPr>
+      </ns0:r>
+      <ns0:r ns0:rsidRPr="005A6394">
+        <ns0:rPr>
+          <ns0:rFonts ns0:ascii="굴림" ns0:eastAsia="굴림" ns0:hAnsi="굴림" ns0:cs="굴림"/>
+          <ns0:lang ns0:eastAsia="ko-KR"/>
+        </ns0:rPr>
+      </ns0:r>
+      <ns0:r ns0:rsidRPr="005A6394">
+        <ns0:rPr>
+          <ns0:rFonts ns0:ascii="굴림" ns0:eastAsia="굴림" ns0:hAnsi="굴림" ns0:cs="굴림"/>
+          <ns0:lang ns0:eastAsia="ko-KR"/>
+        </ns0:rPr>
+      </ns0:r>
+      <ns0:r ns0:rsidRPr="005A6394">
+        <ns0:rPr>
+          <ns0:rFonts ns0:ascii="굴림" ns0:eastAsia="굴림" ns0:hAnsi="굴림" ns0:cs="굴림"/>
+          <ns0:lang ns0:eastAsia="ko-KR"/>
+        </ns0:rPr>
+      </ns0:r>
+      <ns0:r ns0:rsidRPr="005A6394">
+        <ns0:rPr>
+          <ns0:rFonts ns0:ascii="굴림" ns0:eastAsia="굴림" ns0:hAnsi="굴림" ns0:cs="굴림"/>
+          <ns0:lang ns0:eastAsia="ko-KR"/>
+        </ns0:rPr>
+      </ns0:r>
+      <ns0:r ns0:rsidRPr="005A6394">
+        <ns0:rPr>
+          <ns0:rFonts ns0:ascii="굴림" ns0:eastAsia="굴림" ns0:hAnsi="굴림" ns0:cs="굴림"/>
+          <ns0:lang ns0:eastAsia="ko-KR"/>
+        </ns0:rPr>
+      </ns0:r>
+      <ns0:r ns0:rsidRPr="005A6394">
+        <ns0:rPr>
+          <ns0:rFonts ns0:ascii="굴림" ns0:eastAsia="굴림" ns0:hAnsi="굴림" ns0:cs="굴림"/>
+          <ns0:lang ns0:eastAsia="ko-KR"/>
+        </ns0:rPr>
+      </ns0:r>
+      <ns0:r ns0:rsidRPr="005A6394">
+        <ns0:rPr>
+          <ns0:rFonts ns0:ascii="굴림" ns0:eastAsia="굴림" ns0:hAnsi="굴림" ns0:cs="굴림"/>
+          <ns0:lang ns0:eastAsia="ko-KR"/>
+        </ns0:rPr>
+      </ns0:r>
+      <ns0:r ns0:rsidRPr="005A6394">
+        <ns0:rPr>
+          <ns0:rFonts ns0:ascii="굴림" ns0:eastAsia="굴림" ns0:hAnsi="굴림" ns0:cs="굴림"/>
+          <ns0:lang ns0:eastAsia="ko-KR"/>
+        </ns0:rPr>
+      </ns0:r>
+      <ns0:r ns0:rsidRPr="005A6394">
+        <ns0:rPr>
+          <ns0:rFonts ns0:ascii="굴림" ns0:eastAsia="굴림" ns0:hAnsi="굴림" ns0:cs="굴림"/>
+          <ns0:lang ns0:eastAsia="ko-KR"/>
+        </ns0:rPr>
+      </ns0:r>
+      <ns0:r ns0:rsidRPr="005A6394">
+        <ns0:rPr>
+          <ns0:rFonts ns0:ascii="굴림" ns0:eastAsia="굴림" ns0:hAnsi="굴림" ns0:cs="굴림"/>
+          <ns0:lang ns0:eastAsia="ko-KR"/>
+        </ns0:rPr>
+      </ns0:r>
+    </ns0:p>
+    <ns0:p ns2:paraId="6FE78441" ns2:textId="77777777" ns0:rsidR="00C903FE" ns0:rsidRPr="005A6394" ns0:rsidRDefault="00361B4A">
+      <ns0:pPr>
+        <ns0:pStyle ns0:val="21"/>
+        <ns0:rPr>
+          <ns0:rFonts ns0:ascii="굴림" ns0:eastAsia="굴림" ns0:hAnsi="굴림"/>
+          <ns0:lang ns0:eastAsia="ko-KR"/>
+        </ns0:rPr>
+      </ns0:pPr>
+      <ns0:r ns0:rsidRPr="005A6394">
+        <ns0:rPr>
+          <ns0:rFonts ns0:ascii="굴림" ns0:eastAsia="굴림" ns0:hAnsi="굴림" ns0:cs="굴림"/>
+          <ns0:lang ns0:eastAsia="ko-KR"/>
+        </ns0:rPr>
+        <ns0:t xml:space="preserve">제한 사항</ns0:t>
+      </ns0:r>
+      <ns0:r ns0:rsidRPr="005A6394">
+        <ns0:rPr>
+          <ns0:rFonts ns0:ascii="굴림" ns0:eastAsia="굴림" ns0:hAnsi="굴림" ns0:cs="굴림"/>
+          <ns0:lang ns0:eastAsia="ko-KR"/>
+        </ns0:rPr>
+      </ns0:r>
+      <ns0:r ns0:rsidRPr="005A6394">
+        <ns0:rPr>
+          <ns0:rFonts ns0:ascii="굴림" ns0:eastAsia="굴림" ns0:hAnsi="굴림" ns0:cs="굴림"/>
+          <ns0:lang ns0:eastAsia="ko-KR"/>
+        </ns0:rPr>
+      </ns0:r>
+      <ns0:r ns0:rsidRPr="005A6394">
+        <ns0:rPr>
+          <ns0:rFonts ns0:ascii="굴림" ns0:eastAsia="굴림" ns0:hAnsi="굴림" ns0:cs="굴림"/>
+          <ns0:lang ns0:eastAsia="ko-KR"/>
+        </ns0:rPr>
+      </ns0:r>
+      <ns0:r ns0:rsidRPr="005A6394">
+        <ns0:rPr>
+          <ns0:rFonts ns0:ascii="굴림" ns0:eastAsia="굴림" ns0:hAnsi="굴림" ns0:cs="굴림"/>
+          <ns0:lang ns0:eastAsia="ko-KR"/>
+        </ns0:rPr>
+      </ns0:r>
+      <ns0:r ns0:rsidRPr="005A6394">
+        <ns0:rPr>
+          <ns0:rFonts ns0:ascii="굴림" ns0:eastAsia="굴림" ns0:hAnsi="굴림" ns0:cs="굴림"/>
+          <ns0:lang ns0:eastAsia="ko-KR"/>
+        </ns0:rPr>
+      </ns0:r>
+      <ns0:r ns0:rsidRPr="005A6394">
+        <ns0:rPr>
+          <ns0:rFonts ns0:ascii="굴림" ns0:eastAsia="굴림" ns0:hAnsi="굴림" ns0:cs="굴림"/>
+          <ns0:lang ns0:eastAsia="ko-KR"/>
+        </ns0:rPr>
+      </ns0:r>
+      <ns0:proofErr ns0:type="spellStart"/>
+      <ns0:r ns0:rsidRPr="005A6394">
+        <ns0:rPr>
+          <ns0:rFonts ns0:ascii="굴림" ns0:eastAsia="굴림" ns0:hAnsi="굴림" ns0:cs="굴림"/>
+          <ns0:lang ns0:eastAsia="ko-KR"/>
+        </ns0:rPr>
+      </ns0:r>
+      <ns0:proofErr ns0:type="spellEnd"/>
+    </ns0:p>
+    <ns0:p ns2:paraId="6F7A3B83" ns2:textId="77777777" ns0:rsidR="00C903FE" ns0:rsidRPr="005A6394" ns0:rsidRDefault="00361B4A">
+      <ns0:pPr>
+        <ns0:rPr>
+          <ns0:rFonts ns0:ascii="굴림" ns0:eastAsia="굴림" ns0:hAnsi="굴림"/>
+          <ns0:lang ns0:eastAsia="ko-KR"/>
+        </ns0:rPr>
+      </ns0:pPr>
+      <ns0:r ns0:rsidRPr="005A6394">
+        <ns0:rPr>
+          <ns0:rFonts ns0:ascii="굴림" ns0:eastAsia="굴림" ns0:hAnsi="굴림" ns0:cs="굴림"/>
+          <ns0:lang ns0:eastAsia="ko-KR"/>
+        </ns0:rPr>
+        <ns0:t xml:space="preserve">이 경로는 실제 LiDAR 하드웨어 드라이버나 DNN 객체 분류기를 실행하지 않습니다. CPU Euclidean 군집화 결과의 객체 분류는 UNKNOWN이며, Bus·Car·Pedestrian의 원래 분류는 후단으로 직접 전달되지 않습니다.</ns0:t>
+      </ns0:r>
+      <ns0:r ns0:rsidRPr="005A6394">
+        <ns0:rPr>
+          <ns0:rFonts ns0:ascii="굴림" ns0:eastAsia="굴림" ns0:hAnsi="굴림" ns0:cs="굴림"/>
+          <ns0:lang ns0:eastAsia="ko-KR"/>
+        </ns0:rPr>
+      </ns0:r>
+      <ns0:r ns0:rsidRPr="005A6394">
+        <ns0:rPr>
+          <ns0:rFonts ns0:ascii="굴림" ns0:eastAsia="굴림" ns0:hAnsi="굴림" ns0:cs="굴림"/>
+          <ns0:lang ns0:eastAsia="ko-KR"/>
+        </ns0:rPr>
+      </ns0:r>
+      <ns0:r ns0:rsidRPr="005A6394">
+        <ns0:rPr>
+          <ns0:rFonts ns0:ascii="굴림" ns0:eastAsia="굴림" ns0:hAnsi="굴림" ns0:cs="굴림"/>
+          <ns0:lang ns0:eastAsia="ko-KR"/>
+        </ns0:rPr>
+      </ns0:r>
+      <ns0:r ns0:rsidRPr="005A6394">
+        <ns0:rPr>
+          <ns0:rFonts ns0:ascii="굴림" ns0:eastAsia="굴림" ns0:hAnsi="굴림" ns0:cs="굴림"/>
+          <ns0:lang ns0:eastAsia="ko-KR"/>
+        </ns0:rPr>
+      </ns0:r>
+      <ns0:r ns0:rsidRPr="005A6394">
+        <ns0:rPr>
+          <ns0:rFonts ns0:ascii="굴림" ns0:eastAsia="굴림" ns0:hAnsi="굴림" ns0:cs="굴림"/>
+          <ns0:lang ns0:eastAsia="ko-KR"/>
+        </ns0:rPr>
+      </ns0:r>
+      <ns0:r ns0:rsidRPr="005A6394">
+        <ns0:rPr>
+          <ns0:rFonts ns0:ascii="굴림" ns0:eastAsia="굴림" ns0:hAnsi="굴림" ns0:cs="굴림"/>
+          <ns0:lang ns0:eastAsia="ko-KR"/>
+        </ns0:rPr>
+      </ns0:r>
+      <ns0:r ns0:rsidRPr="005A6394">
+        <ns0:rPr>
+          <ns0:rFonts ns0:ascii="굴림" ns0:eastAsia="굴림" ns0:hAnsi="굴림" ns0:cs="굴림"/>
+          <ns0:lang ns0:eastAsia="ko-KR"/>
+        </ns0:rPr>
+      </ns0:r>
+      <ns0:r ns0:rsidRPr="005A6394">
+        <ns0:rPr>
+          <ns0:rFonts ns0:ascii="굴림" ns0:eastAsia="굴림" ns0:hAnsi="굴림" ns0:cs="굴림"/>
+          <ns0:lang ns0:eastAsia="ko-KR"/>
+        </ns0:rPr>
+      </ns0:r>
+      <ns0:r ns0:rsidRPr="005A6394">
+        <ns0:rPr>
+          <ns0:rFonts ns0:ascii="굴림" ns0:eastAsia="굴림" ns0:hAnsi="굴림" ns0:cs="굴림"/>
+          <ns0:lang ns0:eastAsia="ko-KR"/>
+        </ns0:rPr>
+      </ns0:r>
+      <ns0:r ns0:rsidRPr="005A6394">
+        <ns0:rPr>
+          <ns0:rFonts ns0:ascii="굴림" ns0:eastAsia="굴림" ns0:hAnsi="굴림" ns0:cs="굴림"/>
+          <ns0:lang ns0:eastAsia="ko-KR"/>
+        </ns0:rPr>
+      </ns0:r>
+      <ns0:r ns0:rsidRPr="005A6394">
+        <ns0:rPr>
+          <ns0:rFonts ns0:ascii="굴림" ns0:eastAsia="굴림" ns0:hAnsi="굴림" ns0:cs="굴림"/>
+          <ns0:lang ns0:eastAsia="ko-KR"/>
+        </ns0:rPr>
+      </ns0:r>
+      <ns0:r ns0:rsidRPr="005A6394">
+        <ns0:rPr>
+          <ns0:rFonts ns0:ascii="굴림" ns0:eastAsia="굴림" ns0:hAnsi="굴림" ns0:cs="굴림"/>
+          <ns0:lang ns0:eastAsia="ko-KR"/>
+        </ns0:rPr>
+      </ns0:r>
+      <ns0:r ns0:rsidRPr="005A6394">
+        <ns0:rPr>
+          <ns0:rFonts ns0:ascii="굴림" ns0:eastAsia="굴림" ns0:hAnsi="굴림" ns0:cs="굴림"/>
+          <ns0:lang ns0:eastAsia="ko-KR"/>
+        </ns0:rPr>
+      </ns0:r>
+      <ns0:r ns0:rsidRPr="005A6394">
+        <ns0:rPr>
+          <ns0:rFonts ns0:ascii="굴림" ns0:eastAsia="굴림" ns0:hAnsi="굴림" ns0:cs="굴림"/>
+          <ns0:lang ns0:eastAsia="ko-KR"/>
+        </ns0:rPr>
+      </ns0:r>
+      <ns0:r ns0:rsidRPr="005A6394">
+        <ns0:rPr>
+          <ns0:rFonts ns0:ascii="굴림" ns0:eastAsia="굴림" ns0:hAnsi="굴림" ns0:cs="굴림"/>
+          <ns0:lang ns0:eastAsia="ko-KR"/>
+        </ns0:rPr>
+      </ns0:r>
+      <ns0:r ns0:rsidRPr="005A6394">
+        <ns0:rPr>
+          <ns0:rFonts ns0:ascii="굴림" ns0:eastAsia="굴림" ns0:hAnsi="굴림" ns0:cs="굴림"/>
+          <ns0:lang ns0:eastAsia="ko-KR"/>
+        </ns0:rPr>
+      </ns0:r>
+      <ns0:r ns0:rsidRPr="005A6394">
+        <ns0:rPr>
+          <ns0:rFonts ns0:ascii="굴림" ns0:eastAsia="굴림" ns0:hAnsi="굴림" ns0:cs="굴림"/>
+          <ns0:lang ns0:eastAsia="ko-KR"/>
+        </ns0:rPr>
+      </ns0:r>
+      <ns0:r ns0:rsidRPr="005A6394">
+        <ns0:rPr>
+          <ns0:rFonts ns0:ascii="굴림" ns0:eastAsia="굴림" ns0:hAnsi="굴림" ns0:cs="굴림"/>
+          <ns0:lang ns0:eastAsia="ko-KR"/>
+        </ns0:rPr>
+      </ns0:r>
+      <ns0:r ns0:rsidRPr="005A6394">
+        <ns0:rPr>
+          <ns0:rFonts ns0:ascii="굴림" ns0:eastAsia="굴림" ns0:hAnsi="굴림" ns0:cs="굴림"/>
+          <ns0:lang ns0:eastAsia="ko-KR"/>
+        </ns0:rPr>
+      </ns0:r>
+      <ns0:r ns0:rsidRPr="005A6394">
+        <ns0:rPr>
+          <ns0:rFonts ns0:ascii="굴림" ns0:eastAsia="굴림" ns0:hAnsi="굴림" ns0:cs="굴림"/>
+          <ns0:lang ns0:eastAsia="ko-KR"/>
+        </ns0:rPr>
+      </ns0:r>
+      <ns0:r ns0:rsidRPr="005A6394">
+        <ns0:rPr>
+          <ns0:rFonts ns0:ascii="굴림" ns0:eastAsia="굴림" ns0:hAnsi="굴림" ns0:cs="굴림"/>
+          <ns0:lang ns0:eastAsia="ko-KR"/>
+        </ns0:rPr>
+      </ns0:r>
+      <ns0:r ns0:rsidRPr="005A6394">
+        <ns0:rPr>
+          <ns0:rFonts ns0:ascii="굴림" ns0:eastAsia="굴림" ns0:hAnsi="굴림" ns0:cs="굴림"/>
+          <ns0:lang ns0:eastAsia="ko-KR"/>
+        </ns0:rPr>
+      </ns0:r>
+      <ns0:r ns0:rsidRPr="005A6394">
+        <ns0:rPr>
+          <ns0:rFonts ns0:ascii="굴림" ns0:eastAsia="굴림" ns0:hAnsi="굴림" ns0:cs="굴림"/>
+          <ns0:lang ns0:eastAsia="ko-KR"/>
+        </ns0:rPr>
+      </ns0:r>
+      <ns0:r ns0:rsidRPr="005A6394">
+        <ns0:rPr>
+          <ns0:rFonts ns0:ascii="굴림" ns0:eastAsia="굴림" ns0:hAnsi="굴림" ns0:cs="굴림"/>
+          <ns0:lang ns0:eastAsia="ko-KR"/>
+        </ns0:rPr>
+      </ns0:r>
+      <ns0:r ns0:rsidRPr="005A6394">
+        <ns0:rPr>
+          <ns0:rFonts ns0:ascii="굴림" ns0:eastAsia="굴림" ns0:hAnsi="굴림" ns0:cs="굴림"/>
+          <ns0:lang ns0:eastAsia="ko-KR"/>
+        </ns0:rPr>
+      </ns0:r>
+      <ns0:r ns0:rsidRPr="005A6394">
+        <ns0:rPr>
+          <ns0:rFonts ns0:ascii="굴림" ns0:eastAsia="굴림" ns0:hAnsi="굴림" ns0:cs="굴림"/>
+          <ns0:lang ns0:eastAsia="ko-KR"/>
+        </ns0:rPr>
+      </ns0:r>
+      <ns0:r ns0:rsidRPr="005A6394">
+        <ns0:rPr>
+          <ns0:rFonts ns0:ascii="굴림" ns0:eastAsia="굴림" ns0:hAnsi="굴림" ns0:cs="굴림"/>
+          <ns0:lang ns0:eastAsia="ko-KR"/>
+        </ns0:rPr>
+      </ns0:r>
+      <ns0:r ns0:rsidRPr="005A6394">
+        <ns0:rPr>
+          <ns0:rFonts ns0:ascii="굴림" ns0:eastAsia="굴림" ns0:hAnsi="굴림" ns0:cs="굴림"/>
+          <ns0:lang ns0:eastAsia="ko-KR"/>
+        </ns0:rPr>
+      </ns0:r>
+      <ns0:r ns0:rsidRPr="005A6394">
+        <ns0:rPr>
+          <ns0:rFonts ns0:ascii="굴림" ns0:eastAsia="굴림" ns0:hAnsi="굴림" ns0:cs="굴림"/>
+          <ns0:lang ns0:eastAsia="ko-KR"/>
+        </ns0:rPr>
+      </ns0:r>
+      <ns0:r ns0:rsidRPr="005A6394">
+        <ns0:rPr>
+          <ns0:rFonts ns0:ascii="굴림" ns0:eastAsia="굴림" ns0:hAnsi="굴림" ns0:cs="굴림"/>
+          <ns0:lang ns0:eastAsia="ko-KR"/>
+        </ns0:rPr>
+      </ns0:r>
+      <ns0:r ns0:rsidRPr="005A6394">
+        <ns0:rPr>
+          <ns0:rFonts ns0:ascii="굴림" ns0:eastAsia="굴림" ns0:hAnsi="굴림" ns0:cs="굴림"/>
+          <ns0:lang ns0:eastAsia="ko-KR"/>
+        </ns0:rPr>
+      </ns0:r>
+      <ns0:r ns0:rsidRPr="005A6394">
+        <ns0:rPr>
+          <ns0:rFonts ns0:ascii="굴림" ns0:eastAsia="굴림" ns0:hAnsi="굴림" ns0:cs="굴림"/>
+          <ns0:lang ns0:eastAsia="ko-KR"/>
+        </ns0:rPr>
+      </ns0:r>
+      <ns0:r ns0:rsidRPr="005A6394">
+        <ns0:rPr>
+          <ns0:rFonts ns0:ascii="굴림" ns0:eastAsia="굴림" ns0:hAnsi="굴림" ns0:cs="굴림"/>
+          <ns0:lang ns0:eastAsia="ko-KR"/>
+        </ns0:rPr>
+      </ns0:r>
+      <ns0:r ns0:rsidRPr="005A6394">
+        <ns0:rPr>
+          <ns0:rFonts ns0:ascii="굴림" ns0:eastAsia="굴림" ns0:hAnsi="굴림" ns0:cs="굴림"/>
+          <ns0:lang ns0:eastAsia="ko-KR"/>
+        </ns0:rPr>
+      </ns0:r>
+      <ns0:r ns0:rsidRPr="005A6394">
+        <ns0:rPr>
+          <ns0:rFonts ns0:ascii="굴림" ns0:eastAsia="굴림" ns0:hAnsi="굴림" ns0:cs="굴림"/>
+          <ns0:lang ns0:eastAsia="ko-KR"/>
+        </ns0:rPr>
+      </ns0:r>
+      <ns0:r ns0:rsidRPr="005A6394">
+        <ns0:rPr>
+          <ns0:rFonts ns0:ascii="굴림" ns0:eastAsia="굴림" ns0:hAnsi="굴림" ns0:cs="굴림"/>
+          <ns0:lang ns0:eastAsia="ko-KR"/>
+        </ns0:rPr>
+      </ns0:r>
+      <ns0:r ns0:rsidRPr="005A6394">
+        <ns0:rPr>
+          <ns0:rFonts ns0:ascii="굴림" ns0:eastAsia="굴림" ns0:hAnsi="굴림" ns0:cs="굴림"/>
+          <ns0:lang ns0:eastAsia="ko-KR"/>
+        </ns0:rPr>
+      </ns0:r>
+      <ns0:r ns0:rsidRPr="005A6394">
+        <ns0:rPr>
+          <ns0:rFonts ns0:ascii="굴림" ns0:eastAsia="굴림" ns0:hAnsi="굴림" ns0:cs="굴림"/>
+          <ns0:lang ns0:eastAsia="ko-KR"/>
+        </ns0:rPr>
+      </ns0:r>
+      <ns0:r ns0:rsidRPr="005A6394">
+        <ns0:rPr>
+          <ns0:rFonts ns0:ascii="굴림" ns0:eastAsia="굴림" ns0:hAnsi="굴림" ns0:cs="굴림"/>
+          <ns0:lang ns0:eastAsia="ko-KR"/>
+        </ns0:rPr>
+      </ns0:r>
+      <ns0:r ns0:rsidRPr="005A6394">
+        <ns0:rPr>
+          <ns0:rFonts ns0:ascii="굴림" ns0:eastAsia="굴림" ns0:hAnsi="굴림" ns0:cs="굴림"/>
+          <ns0:lang ns0:eastAsia="ko-KR"/>
+        </ns0:rPr>
+      </ns0:r>
+      <ns0:r ns0:rsidRPr="005A6394">
+        <ns0:rPr>
+          <ns0:rFonts ns0:ascii="굴림" ns0:eastAsia="굴림" ns0:hAnsi="굴림" ns0:cs="굴림"/>
+          <ns0:lang ns0:eastAsia="ko-KR"/>
+        </ns0:rPr>
+      </ns0:r>
+      <ns0:r ns0:rsidRPr="005A6394">
+        <ns0:rPr>
+          <ns0:rFonts ns0:ascii="굴림" ns0:eastAsia="굴림" ns0:hAnsi="굴림" ns0:cs="굴림"/>
+          <ns0:lang ns0:eastAsia="ko-KR"/>
+        </ns0:rPr>
+      </ns0:r>
+      <ns0:r ns0:rsidRPr="005A6394">
+        <ns0:rPr>
+          <ns0:rFonts ns0:ascii="굴림" ns0:eastAsia="굴림" ns0:hAnsi="굴림" ns0:cs="굴림"/>
+          <ns0:lang ns0:eastAsia="ko-KR"/>
+        </ns0:rPr>
+      </ns0:r>
+    </ns0:p>
+    <ns0:p ns2:paraId="6F7A3B83" ns2:textId="77777777" ns0:rsidR="00C903FE" ns0:rsidRPr="005A6394" ns0:rsidRDefault="00361B4A">
+      <ns0:pPr>
+        <ns0:rPr>
+          <ns0:rFonts ns0:ascii="굴림" ns0:eastAsia="굴림" ns0:hAnsi="굴림"/>
+          <ns0:lang ns0:eastAsia="ko-KR"/>
+        </ns0:rPr>
+      </ns0:pPr>
+      <ns0:r ns0:rsidRPr="005A6394">
+        <ns0:rPr>
+          <ns0:rFonts ns0:ascii="굴림" ns0:eastAsia="굴림" ns0:hAnsi="굴림" ns0:cs="굴림"/>
+          <ns0:lang ns0:eastAsia="ko-KR"/>
+        </ns0:rPr>
+        <ns0:t xml:space="preserve">Planning은 지도, 주행 가능 영역과 안전 여유 조건에 따라 정지 또는 회피를 판단합니다. 장애물 배치만으로 차선 변경이나 전역 Route 재생성이 항상 보장되지는 않습니다.</ns0:t>
       </ns0:r>
       <ns0:r ns0:rsidRPr="005A6394">
         <ns0:rPr>
@@ -34267,22 +37265,22 @@
 </file>
 
 <file path=word/header1.xml><?xml version="1.0" encoding="utf-8"?>
-<w:hdr xmlns:wpc="http://schemas.microsoft.com/office/word/2010/wordprocessingCanvas" xmlns:cx="http://schemas.microsoft.com/office/drawing/2014/chartex" xmlns:cx1="http://schemas.microsoft.com/office/drawing/2015/9/8/chartex" xmlns:cx2="http://schemas.microsoft.com/office/drawing/2015/10/21/chartex" xmlns:cx3="http://schemas.microsoft.com/office/drawing/2016/5/9/chartex" xmlns:cx4="http://schemas.microsoft.com/office/drawing/2016/5/10/chartex" xmlns:cx5="http://schemas.microsoft.com/office/drawing/2016/5/11/chartex" xmlns:cx6="http://schemas.microsoft.com/office/drawing/2016/5/12/chartex" xmlns:cx7="http://schemas.microsoft.com/office/drawing/2016/5/13/chartex" xmlns:cx8="http://schemas.microsoft.com/office/drawing/2016/5/14/chartex" xmlns:mc="http://schemas.openxmlformats.org/markup-compatibility/2006" xmlns:aink="http://schemas.microsoft.com/office/drawing/2016/ink" xmlns:am3d="http://schemas.microsoft.com/office/drawing/2017/model3d" xmlns:o="urn:schemas-microsoft-com:office:office" xmlns:r="http://schemas.openxmlformats.org/officeDocument/2006/relationships" xmlns:m="http://schemas.openxmlformats.org/officeDocument/2006/math" xmlns:v="urn:schemas-microsoft-com:vml" xmlns:wp14="http://schemas.microsoft.com/office/word/2010/wordprocessingDrawing" xmlns:wp="http://schemas.openxmlformats.org/drawingml/2006/wordprocessingDrawing" xmlns:w10="urn:schemas-microsoft-com:office:word" xmlns:w="http://schemas.openxmlformats.org/wordprocessingml/2006/main" xmlns:w14="http://schemas.microsoft.com/office/word/2010/wordml" xmlns:w15="http://schemas.microsoft.com/office/word/2012/wordml" xmlns:w16cex="http://schemas.microsoft.com/office/word/2018/wordml/cex" xmlns:w16cid="http://schemas.microsoft.com/office/word/2016/wordml/cid" xmlns:w16="http://schemas.microsoft.com/office/word/2018/wordml" xmlns:w16sdtdh="http://schemas.microsoft.com/office/word/2020/wordml/sdtdatahash" xmlns:w16se="http://schemas.microsoft.com/office/word/2015/wordml/symex" xmlns:wpg="http://schemas.microsoft.com/office/word/2010/wordprocessingGroup" xmlns:wpi="http://schemas.microsoft.com/office/word/2010/wordprocessingInk" xmlns:wne="http://schemas.microsoft.com/office/word/2006/wordml" xmlns:wps="http://schemas.microsoft.com/office/word/2010/wordprocessingShape" mc:Ignorable="w14 w15 w16se w16cid w16 w16cex w16sdtdh wp14">
-  <w:p>
-    <w:pPr>
-      <w:pStyle w:val="a5"/>
-      <w:jc w:val="right"/>
-    </w:pPr>
-    <w:r>
-      <w:rPr>
-        <w:rFonts w:ascii="굴림" w:hAnsi="굴림" w:eastAsia="굴림" w:cs="굴림"/>
-        <w:color w:val="8A9097"/>
-        <w:sz w:val="15"/>
-      </w:rPr>
-      <w:t>Autoware Partition  |  KATECH</w:t>
-    </w:r>
-  </w:p>
-</w:hdr>
+<ns0:hdr xmlns:ns0="http://schemas.openxmlformats.org/wordprocessingml/2006/main" xmlns:ns1="http://schemas.openxmlformats.org/markup-compatibility/2006" xmlns:ns2="http://schemas.microsoft.com/office/word/2010/wordml" ns1:Ignorable="w14 w15 w16se w16cid w16 w16cex w16sdtdh wp14">
+  <ns0:p ns2:paraId="7184BBB6" ns2:textId="77777777" ns0:rsidR="00C903FE" ns0:rsidRDefault="00361B4A">
+    <ns0:pPr>
+      <ns0:pStyle ns0:val="a5"/>
+      <ns0:jc ns0:val="right"/>
+    </ns0:pPr>
+    <ns0:r>
+      <ns0:rPr>
+        <ns0:rFonts ns0:ascii="굴림" ns0:hAnsi="굴림" ns0:eastAsia="굴림" ns0:cs="굴림"/>
+        <ns0:color ns0:val="8A9097"/>
+        <ns0:sz ns0:val="15"/>
+      </ns0:rPr>
+      <ns0:t>Autoware Partition  |  KATECH</ns0:t>
+    </ns0:r>
+  </ns0:p>
+</ns0:hdr>
 </file>
 
 <file path=word/numbering.xml><?xml version="1.0" encoding="utf-8"?>

</xml_diff>

<commit_message>
docs: record validated obstacle driving scenarios
</commit_message>
<xml_diff>
--- a/Autoware_Partition_Guide_KATECH.docx
+++ b/Autoware_Partition_Guide_KATECH.docx
@@ -1,6 +1,6 @@
 
 <file path=word/document.xml><?xml version="1.0" encoding="utf-8"?>
-<ns0:document xmlns:ns0="http://schemas.openxmlformats.org/wordprocessingml/2006/main" xmlns:ns1="http://schemas.openxmlformats.org/markup-compatibility/2006" xmlns:ns2="http://schemas.microsoft.com/office/word/2010/wordml" xmlns:ns3="http://schemas.openxmlformats.org/officeDocument/2006/relationships" ns1:Ignorable="w14 w15 w16se w16cid w16 w16cex w16sdtdh wp14">
+<ns0:document xmlns:ns0="http://schemas.openxmlformats.org/wordprocessingml/2006/main" xmlns:ns1="http://schemas.openxmlformats.org/markup-compatibility/2006" xmlns:ns2="http://schemas.microsoft.com/office/word/2010/wordml" xmlns:ns3="http://schemas.openxmlformats.org/officeDocument/2006/relationships" xmlns:w14="http://schemas.microsoft.com/office/word/2010/wordml" xmlns:w15="http://schemas.microsoft.com/office/word/2012/wordml" xmlns:w16="http://schemas.microsoft.com/office/word/2018/wordml" xmlns:w16cex="http://schemas.microsoft.com/office/word/2018/wordml/cex" xmlns:w16cid="http://schemas.microsoft.com/office/word/2016/wordml/cid" xmlns:w16sdtdh="http://schemas.microsoft.com/office/word/2020/wordml/sdtdatahash" xmlns:w16se="http://schemas.microsoft.com/office/word/2015/wordml/symex" xmlns:wp14="http://schemas.microsoft.com/office/word/2010/wordprocessingDrawing" ns1:Ignorable="w14 w15 w16se w16cid w16 w16cex w16sdtdh wp14">
   <ns0:body>
     <ns0:p ns2:paraId="3BB0E5A0" ns2:textId="7CDD5637" ns0:rsidR="00C903FE" ns0:rsidRPr="005A6394" ns0:rsidRDefault="00361B4A">
       <ns0:pPr>
@@ -69,7 +69,7 @@
           <ns0:color ns0:val="5F6368"/>
           <ns0:sz ns0:val="17"/>
         </ns0:rPr>
-        <ns0:t xml:space="preserve">  |  Version 1.1  |  2026.07.20</ns0:t>
+        <ns0:t xml:space="preserve">  |  Version 1.2  |  2026.07.24</ns0:t>
       </ns0:r>
     </ns0:p>
     <ns0:p ns2:paraId="4240993D" ns2:textId="77777777" ns0:rsidR="00C903FE" ns0:rsidRPr="005A6394" ns0:rsidRDefault="00361B4A">
@@ -1203,6 +1203,34 @@
           <ns0:lang ns0:eastAsia="ko-KR"/>
         </ns0:rPr>
         <ns0:t>테스트</ns0:t>
+      </ns0:r>
+    </ns0:p>
+    <ns0:p ns2:paraId="A6895111" ns2:textId="77777777" ns0:rsidR="00C903FE" ns0:rsidRPr="005A6394" ns0:rsidRDefault="00361B4A">
+      <ns0:pPr>
+        <ns0:spacing ns0:after="24" ns0:line="252" ns0:lineRule="auto"/>
+        <ns0:ind ns0:left="227"/>
+        <ns0:rPr>
+          <ns0:rFonts ns0:ascii="굴림" ns0:eastAsia="굴림" ns0:hAnsi="굴림"/>
+          <ns0:lang ns0:eastAsia="ko-KR"/>
+        </ns0:rPr>
+      </ns0:pPr>
+      <ns0:r ns0:rsidRPr="005A6394">
+        <ns0:rPr>
+          <ns0:rFonts ns0:ascii="굴림" ns0:eastAsia="굴림" ns0:hAnsi="굴림" ns0:cs="굴림"/>
+          <ns0:color ns0:val="0B57D0"/>
+          <ns0:sz ns0:val="17"/>
+          <ns0:lang ns0:eastAsia="ko-KR"/>
+        </ns0:rPr>
+        <ns0:t xml:space="preserve">7.1 주행 및 장애물 대응 검증</ns0:t>
+      </ns0:r>
+      <ns0:r ns0:rsidRPr="005A6394">
+        <ns0:rPr>
+          <ns0:rFonts ns0:ascii="굴림" ns0:eastAsia="굴림" ns0:hAnsi="굴림" ns0:cs="굴림"/>
+          <ns0:color ns0:val="0B57D0"/>
+          <ns0:sz ns0:val="17"/>
+          <ns0:lang ns0:eastAsia="ko-KR"/>
+        </ns0:rPr>
+        <ns0:t/>
       </ns0:r>
     </ns0:p>
     <ns0:p ns2:paraId="1117E51B" ns2:textId="77777777" ns0:rsidR="00C903FE" ns0:rsidRPr="005A6394" ns0:rsidRDefault="00361B4A">
@@ -23004,7 +23032,7 @@
           </ns0:p>
         </ns0:tc>
       </ns0:tr>
-      <ns0:tr ns0:rsidR="00C903FE" ns0:rsidRPr="005A6394" ns2:paraId="26975FFB" ns2:textId="77777777">
+      <ns0:tr ns0:rsidR="00C903FE" ns0:rsidRPr="005A6394" ns2:paraId="0DAC39E1" ns2:textId="77777777">
         <ns0:trPr>
           <ns0:cantSplit/>
           <ns0:jc ns0:val="center"/>
@@ -23020,7 +23048,7 @@
             </ns0:tcBorders>
             <ns0:shd ns0:val="clear" ns0:color="auto" ns0:fill="EEF1F4"/>
           </ns0:tcPr>
-          <ns0:p ns2:paraId="189EFE88" ns2:textId="77777777" ns0:rsidR="00C903FE" ns0:rsidRPr="005A6394" ns0:rsidRDefault="00361B4A">
+          <ns0:p ns2:paraId="67ED776F" ns2:textId="77777777" ns0:rsidR="00C903FE" ns0:rsidRPr="005A6394" ns0:rsidRDefault="00361B4A">
             <ns0:pPr>
               <ns0:spacing ns0:after="0" ns0:line="259" ns0:lineRule="auto"/>
               <ns0:rPr>
@@ -23038,7 +23066,7 @@
           </ns0:p>
         </ns0:tc>
       </ns0:tr>
-      <ns0:tr ns0:rsidR="00C903FE" ns0:rsidRPr="005A6394" ns2:paraId="26975FFB" ns2:textId="77777777">
+      <ns0:tr ns0:rsidR="00C903FE" ns0:rsidRPr="005A6394" ns2:paraId="EED08958" ns2:textId="77777777">
         <ns0:trPr>
           <ns0:cantSplit/>
           <ns0:jc ns0:val="center"/>
@@ -23054,7 +23082,7 @@
             </ns0:tcBorders>
             <ns0:shd ns0:val="clear" ns0:color="auto" ns0:fill="EEF1F4"/>
           </ns0:tcPr>
-          <ns0:p ns2:paraId="189EFE88" ns2:textId="77777777" ns0:rsidR="00C903FE" ns0:rsidRPr="005A6394" ns0:rsidRDefault="00361B4A">
+          <ns0:p ns2:paraId="820D05BD" ns2:textId="77777777" ns0:rsidR="00C903FE" ns0:rsidRPr="005A6394" ns0:rsidRDefault="00361B4A">
             <ns0:pPr>
               <ns0:spacing ns0:after="0" ns0:line="259" ns0:lineRule="auto"/>
               <ns0:rPr>
@@ -23072,7 +23100,7 @@
           </ns0:p>
         </ns0:tc>
       </ns0:tr>
-      <ns0:tr ns0:rsidR="00C903FE" ns0:rsidRPr="005A6394" ns2:paraId="26975FFB" ns2:textId="77777777">
+      <ns0:tr ns0:rsidR="00C903FE" ns0:rsidRPr="005A6394" ns2:paraId="9A597793" ns2:textId="77777777">
         <ns0:trPr>
           <ns0:cantSplit/>
           <ns0:jc ns0:val="center"/>
@@ -23088,7 +23116,7 @@
             </ns0:tcBorders>
             <ns0:shd ns0:val="clear" ns0:color="auto" ns0:fill="EEF1F4"/>
           </ns0:tcPr>
-          <ns0:p ns2:paraId="189EFE88" ns2:textId="77777777" ns0:rsidR="00C903FE" ns0:rsidRPr="005A6394" ns0:rsidRDefault="00361B4A">
+          <ns0:p ns2:paraId="BFBAE4E3" ns2:textId="77777777" ns0:rsidR="00C903FE" ns0:rsidRPr="005A6394" ns0:rsidRDefault="00361B4A">
             <ns0:pPr>
               <ns0:spacing ns0:after="0" ns0:line="259" ns0:lineRule="auto"/>
               <ns0:rPr>
@@ -23136,7 +23164,7 @@
       <ns0:tblGrid>
         <ns0:gridCol ns0:w="9638"/>
       </ns0:tblGrid>
-      <ns0:tr ns0:rsidR="00C903FE" ns0:rsidRPr="005A6394" ns2:paraId="26975FFB" ns2:textId="77777777">
+      <ns0:tr ns0:rsidR="00C903FE" ns0:rsidRPr="005A6394" ns2:paraId="357AE367" ns2:textId="77777777">
         <ns0:trPr>
           <ns0:cantSplit/>
           <ns0:jc ns0:val="center"/>
@@ -23152,7 +23180,7 @@
             </ns0:tcBorders>
             <ns0:shd ns0:val="clear" ns0:color="auto" ns0:fill="EEF1F4"/>
           </ns0:tcPr>
-          <ns0:p ns2:paraId="189EFE88" ns2:textId="77777777" ns0:rsidR="00C903FE" ns0:rsidRPr="005A6394" ns0:rsidRDefault="00361B4A">
+          <ns0:p ns2:paraId="CE456B2F" ns2:textId="77777777" ns0:rsidR="00C903FE" ns0:rsidRPr="005A6394" ns0:rsidRDefault="00361B4A">
             <ns0:pPr>
               <ns0:spacing ns0:after="0" ns0:line="259" ns0:lineRule="auto"/>
               <ns0:rPr>
@@ -27835,6 +27863,585 @@
         </ns0:rPr>
       </ns0:r>
     </ns0:p>
+    <ns0:p ns2:paraId="165C3A1E" ns2:textId="77777777" ns0:rsidR="00C903FE" ns0:rsidRPr="005A6394" ns0:rsidRDefault="00361B4A">
+      <ns0:pPr>
+        <ns0:pStyle ns0:val="21"/>
+        <ns0:rPr>
+          <ns0:rFonts ns0:ascii="굴림" ns0:eastAsia="굴림" ns0:hAnsi="굴림"/>
+        </ns0:rPr>
+      </ns0:pPr>
+      <ns0:r ns0:rsidRPr="005A6394">
+        <ns0:rPr>
+          <ns0:rFonts ns0:ascii="굴림" ns0:eastAsia="굴림" ns0:hAnsi="굴림" ns0:cs="굴림"/>
+        </ns0:rPr>
+        <ns0:t xml:space="preserve">7.1 주행 및 장애물 대응 검증</ns0:t>
+      </ns0:r>
+      <ns0:r ns0:rsidRPr="005A6394">
+        <ns0:rPr>
+          <ns0:rFonts ns0:ascii="굴림" ns0:eastAsia="굴림" ns0:hAnsi="굴림" ns0:cs="굴림"/>
+        </ns0:rPr>
+        <ns0:t/>
+      </ns0:r>
+    </ns0:p>
+    <ns0:p ns2:paraId="A864BAA7" ns2:textId="77777777" ns0:rsidR="00C903FE" ns0:rsidRPr="005A6394" ns0:rsidRDefault="00361B4A">
+      <ns0:pPr>
+        <ns0:rPr>
+          <ns0:rFonts ns0:ascii="굴림" ns0:eastAsia="굴림" ns0:hAnsi="굴림"/>
+          <ns0:lang ns0:eastAsia="ko-KR"/>
+        </ns0:rPr>
+      </ns0:pPr>
+      <ns0:r ns0:rsidRPr="005A6394">
+        <ns0:rPr>
+          <ns0:rFonts ns0:ascii="굴림" ns0:eastAsia="굴림" ns0:hAnsi="굴림" ns0:cs="굴림"/>
+          <ns0:lang ns0:eastAsia="ko-KR"/>
+        </ns0:rPr>
+        <ns0:t>기존 katech-partition 구성에서 RViz로 장애물을 배치하여 다음 주행 시나리오를 검증했습니다.</ns0:t>
+      </ns0:r>
+      <ns0:r ns0:rsidRPr="005A6394">
+        <ns0:rPr>
+          <ns0:rFonts ns0:ascii="굴림" ns0:eastAsia="굴림" ns0:hAnsi="굴림" ns0:cs="굴림"/>
+          <ns0:lang ns0:eastAsia="ko-KR"/>
+        </ns0:rPr>
+      </ns0:r>
+      <ns0:r ns0:rsidRPr="005A6394">
+        <ns0:rPr>
+          <ns0:rFonts ns0:ascii="굴림" ns0:eastAsia="굴림" ns0:hAnsi="굴림" ns0:cs="굴림"/>
+          <ns0:lang ns0:eastAsia="ko-KR"/>
+        </ns0:rPr>
+      </ns0:r>
+      <ns0:r ns0:rsidRPr="005A6394">
+        <ns0:rPr>
+          <ns0:rFonts ns0:ascii="굴림" ns0:eastAsia="굴림" ns0:hAnsi="굴림" ns0:cs="굴림"/>
+          <ns0:lang ns0:eastAsia="ko-KR"/>
+        </ns0:rPr>
+      </ns0:r>
+      <ns0:r ns0:rsidRPr="005A6394">
+        <ns0:rPr>
+          <ns0:rFonts ns0:ascii="굴림" ns0:eastAsia="굴림" ns0:hAnsi="굴림" ns0:cs="굴림"/>
+          <ns0:lang ns0:eastAsia="ko-KR"/>
+        </ns0:rPr>
+      </ns0:r>
+      <ns0:r ns0:rsidRPr="005A6394">
+        <ns0:rPr>
+          <ns0:rFonts ns0:ascii="굴림" ns0:eastAsia="굴림" ns0:hAnsi="굴림" ns0:cs="굴림"/>
+          <ns0:lang ns0:eastAsia="ko-KR"/>
+        </ns0:rPr>
+      </ns0:r>
+      <ns0:r ns0:rsidRPr="005A6394">
+        <ns0:rPr>
+          <ns0:rFonts ns0:ascii="굴림" ns0:eastAsia="굴림" ns0:hAnsi="굴림" ns0:cs="굴림"/>
+          <ns0:lang ns0:eastAsia="ko-KR"/>
+        </ns0:rPr>
+      </ns0:r>
+      <ns0:r ns0:rsidRPr="005A6394">
+        <ns0:rPr>
+          <ns0:rFonts ns0:ascii="굴림" ns0:eastAsia="굴림" ns0:hAnsi="굴림" ns0:cs="굴림"/>
+          <ns0:lang ns0:eastAsia="ko-KR"/>
+        </ns0:rPr>
+      </ns0:r>
+      <ns0:r ns0:rsidRPr="005A6394">
+        <ns0:rPr>
+          <ns0:rFonts ns0:ascii="굴림" ns0:eastAsia="굴림" ns0:hAnsi="굴림" ns0:cs="굴림"/>
+          <ns0:lang ns0:eastAsia="ko-KR"/>
+        </ns0:rPr>
+      </ns0:r>
+      <ns0:r ns0:rsidRPr="005A6394">
+        <ns0:rPr>
+          <ns0:rFonts ns0:ascii="굴림" ns0:eastAsia="굴림" ns0:hAnsi="굴림" ns0:cs="굴림"/>
+          <ns0:lang ns0:eastAsia="ko-KR"/>
+        </ns0:rPr>
+      </ns0:r>
+      <ns0:proofErr ns0:type="spellStart"/>
+      <ns0:r ns0:rsidRPr="005A6394">
+        <ns0:rPr>
+          <ns0:rFonts ns0:ascii="굴림" ns0:eastAsia="굴림" ns0:hAnsi="굴림" ns0:cs="굴림"/>
+          <ns0:lang ns0:eastAsia="ko-KR"/>
+        </ns0:rPr>
+      </ns0:r>
+      <ns0:proofErr ns0:type="spellEnd"/>
+      <ns0:r ns0:rsidRPr="005A6394">
+        <ns0:rPr>
+          <ns0:rFonts ns0:ascii="굴림" ns0:eastAsia="굴림" ns0:hAnsi="굴림" ns0:cs="굴림"/>
+          <ns0:lang ns0:eastAsia="ko-KR"/>
+        </ns0:rPr>
+      </ns0:r>
+      <ns0:r ns0:rsidRPr="005A6394">
+        <ns0:rPr>
+          <ns0:rFonts ns0:ascii="굴림" ns0:eastAsia="굴림" ns0:hAnsi="굴림" ns0:cs="굴림"/>
+          <ns0:lang ns0:eastAsia="ko-KR"/>
+        </ns0:rPr>
+      </ns0:r>
+      <ns0:r ns0:rsidRPr="005A6394">
+        <ns0:rPr>
+          <ns0:rFonts ns0:ascii="굴림" ns0:eastAsia="굴림" ns0:hAnsi="굴림" ns0:cs="굴림"/>
+          <ns0:lang ns0:eastAsia="ko-KR"/>
+        </ns0:rPr>
+      </ns0:r>
+      <ns0:r ns0:rsidRPr="005A6394">
+        <ns0:rPr>
+          <ns0:rFonts ns0:ascii="굴림" ns0:eastAsia="굴림" ns0:hAnsi="굴림" ns0:cs="굴림"/>
+          <ns0:lang ns0:eastAsia="ko-KR"/>
+        </ns0:rPr>
+      </ns0:r>
+      <ns0:r ns0:rsidRPr="005A6394">
+        <ns0:rPr>
+          <ns0:rFonts ns0:ascii="굴림" ns0:eastAsia="굴림" ns0:hAnsi="굴림" ns0:cs="굴림"/>
+          <ns0:lang ns0:eastAsia="ko-KR"/>
+        </ns0:rPr>
+      </ns0:r>
+      <ns0:r ns0:rsidRPr="005A6394">
+        <ns0:rPr>
+          <ns0:rFonts ns0:ascii="굴림" ns0:eastAsia="굴림" ns0:hAnsi="굴림" ns0:cs="굴림"/>
+          <ns0:lang ns0:eastAsia="ko-KR"/>
+        </ns0:rPr>
+      </ns0:r>
+      <ns0:r ns0:rsidRPr="005A6394">
+        <ns0:rPr>
+          <ns0:rFonts ns0:ascii="굴림" ns0:eastAsia="굴림" ns0:hAnsi="굴림" ns0:cs="굴림"/>
+          <ns0:lang ns0:eastAsia="ko-KR"/>
+        </ns0:rPr>
+      </ns0:r>
+      <ns0:r ns0:rsidRPr="005A6394">
+        <ns0:rPr>
+          <ns0:rFonts ns0:ascii="굴림" ns0:eastAsia="굴림" ns0:hAnsi="굴림" ns0:cs="굴림"/>
+          <ns0:lang ns0:eastAsia="ko-KR"/>
+        </ns0:rPr>
+      </ns0:r>
+    </ns0:p>
+    <ns0:p ns2:paraId="97361740" ns2:textId="77777777" ns0:rsidR="00C903FE" ns0:rsidRPr="005A6394" ns0:rsidRDefault="00361B4A">
+      <ns0:pPr>
+        <ns0:spacing ns0:after="40"/>
+        <ns0:ind ns0:left="397" ns0:hanging="397"/>
+        <ns0:rPr>
+          <ns0:rFonts ns0:ascii="굴림" ns0:eastAsia="굴림" ns0:hAnsi="굴림"/>
+          <ns0:lang ns0:eastAsia="ko-KR"/>
+        </ns0:rPr>
+      </ns0:pPr>
+      <ns0:r ns0:rsidRPr="005A6394">
+        <ns0:rPr>
+          <ns0:rFonts ns0:ascii="굴림" ns0:eastAsia="굴림" ns0:hAnsi="굴림" ns0:cs="굴림"/>
+          <ns0:lang ns0:eastAsia="ko-KR"/>
+        </ns0:rPr>
+        <ns0:t xml:space="preserve">1.  Initial Pose와 Goal Pose를 설정한 후 route와 trajectory가 생성되고, 차량이 목적지까지 주행하는 것을 확인했습니다.</ns0:t>
+      </ns0:r>
+      <ns0:proofErr ns0:type="spellStart"/>
+      <ns0:r ns0:rsidRPr="005A6394">
+        <ns0:rPr>
+          <ns0:rFonts ns0:ascii="굴림" ns0:eastAsia="굴림" ns0:hAnsi="굴림" ns0:cs="굴림"/>
+          <ns0:lang ns0:eastAsia="ko-KR"/>
+        </ns0:rPr>
+        <ns0:t/>
+      </ns0:r>
+      <ns0:proofErr ns0:type="spellEnd"/>
+      <ns0:r ns0:rsidRPr="005A6394">
+        <ns0:rPr>
+          <ns0:rFonts ns0:ascii="굴림" ns0:eastAsia="굴림" ns0:hAnsi="굴림" ns0:cs="굴림"/>
+          <ns0:lang ns0:eastAsia="ko-KR"/>
+        </ns0:rPr>
+        <ns0:t xml:space="preserve"/>
+      </ns0:r>
+      <ns0:r ns0:rsidRPr="005A6394">
+        <ns0:rPr>
+          <ns0:rFonts ns0:ascii="굴림" ns0:eastAsia="굴림" ns0:hAnsi="굴림" ns0:cs="굴림"/>
+          <ns0:lang ns0:eastAsia="ko-KR"/>
+        </ns0:rPr>
+        <ns0:t/>
+      </ns0:r>
+      <ns0:r ns0:rsidRPr="005A6394">
+        <ns0:rPr>
+          <ns0:rFonts ns0:ascii="굴림" ns0:eastAsia="굴림" ns0:hAnsi="굴림" ns0:cs="굴림"/>
+          <ns0:lang ns0:eastAsia="ko-KR"/>
+        </ns0:rPr>
+        <ns0:t xml:space="preserve"/>
+      </ns0:r>
+      <ns0:r ns0:rsidRPr="005A6394">
+        <ns0:rPr>
+          <ns0:rFonts ns0:ascii="굴림" ns0:eastAsia="굴림" ns0:hAnsi="굴림" ns0:cs="굴림"/>
+          <ns0:lang ns0:eastAsia="ko-KR"/>
+        </ns0:rPr>
+        <ns0:t/>
+      </ns0:r>
+      <ns0:r ns0:rsidRPr="005A6394">
+        <ns0:rPr>
+          <ns0:rFonts ns0:ascii="굴림" ns0:eastAsia="굴림" ns0:hAnsi="굴림" ns0:cs="굴림"/>
+          <ns0:lang ns0:eastAsia="ko-KR"/>
+        </ns0:rPr>
+        <ns0:t xml:space="preserve"/>
+      </ns0:r>
+      <ns0:r ns0:rsidRPr="005A6394">
+        <ns0:rPr>
+          <ns0:rFonts ns0:ascii="굴림" ns0:eastAsia="굴림" ns0:hAnsi="굴림" ns0:cs="굴림"/>
+          <ns0:lang ns0:eastAsia="ko-KR"/>
+        </ns0:rPr>
+        <ns0:t/>
+      </ns0:r>
+      <ns0:r ns0:rsidRPr="005A6394">
+        <ns0:rPr>
+          <ns0:rFonts ns0:ascii="굴림" ns0:eastAsia="굴림" ns0:hAnsi="굴림" ns0:cs="굴림"/>
+          <ns0:lang ns0:eastAsia="ko-KR"/>
+        </ns0:rPr>
+        <ns0:t xml:space="preserve"/>
+      </ns0:r>
+      <ns0:r ns0:rsidRPr="005A6394">
+        <ns0:rPr>
+          <ns0:rFonts ns0:ascii="굴림" ns0:eastAsia="굴림" ns0:hAnsi="굴림" ns0:cs="굴림"/>
+          <ns0:lang ns0:eastAsia="ko-KR"/>
+        </ns0:rPr>
+        <ns0:t/>
+      </ns0:r>
+      <ns0:r ns0:rsidRPr="005A6394">
+        <ns0:rPr>
+          <ns0:rFonts ns0:ascii="굴림" ns0:eastAsia="굴림" ns0:hAnsi="굴림" ns0:cs="굴림"/>
+          <ns0:lang ns0:eastAsia="ko-KR"/>
+        </ns0:rPr>
+        <ns0:t xml:space="preserve"/>
+      </ns0:r>
+      <ns0:r ns0:rsidRPr="005A6394">
+        <ns0:rPr>
+          <ns0:rFonts ns0:ascii="굴림" ns0:eastAsia="굴림" ns0:hAnsi="굴림" ns0:cs="굴림"/>
+          <ns0:lang ns0:eastAsia="ko-KR"/>
+        </ns0:rPr>
+        <ns0:t/>
+      </ns0:r>
+      <ns0:r ns0:rsidRPr="005A6394">
+        <ns0:rPr>
+          <ns0:rFonts ns0:ascii="굴림" ns0:eastAsia="굴림" ns0:hAnsi="굴림" ns0:cs="굴림"/>
+          <ns0:lang ns0:eastAsia="ko-KR"/>
+        </ns0:rPr>
+        <ns0:t/>
+      </ns0:r>
+    </ns0:p>
+    <ns0:p ns2:paraId="7DD57B22" ns2:textId="77777777" ns0:rsidR="00C903FE" ns0:rsidRPr="005A6394" ns0:rsidRDefault="00361B4A">
+      <ns0:pPr>
+        <ns0:spacing ns0:after="40"/>
+        <ns0:ind ns0:left="397" ns0:hanging="397"/>
+        <ns0:rPr>
+          <ns0:rFonts ns0:ascii="굴림" ns0:eastAsia="굴림" ns0:hAnsi="굴림"/>
+          <ns0:lang ns0:eastAsia="ko-KR"/>
+        </ns0:rPr>
+      </ns0:pPr>
+      <ns0:r ns0:rsidRPr="005A6394">
+        <ns0:rPr>
+          <ns0:rFonts ns0:ascii="굴림" ns0:eastAsia="굴림" ns0:hAnsi="굴림" ns0:cs="굴림"/>
+          <ns0:lang ns0:eastAsia="ko-KR"/>
+        </ns0:rPr>
+        <ns0:t xml:space="preserve">2.  주행 경로 중간에 장애물을 배치하면 차량이 장애물 앞에서 정지하고, 장애물을 제거하면 다시 출발하는 것을 확인했습니다.</ns0:t>
+      </ns0:r>
+      <ns0:proofErr ns0:type="spellStart"/>
+      <ns0:r ns0:rsidRPr="005A6394">
+        <ns0:rPr>
+          <ns0:rFonts ns0:ascii="굴림" ns0:eastAsia="굴림" ns0:hAnsi="굴림" ns0:cs="굴림"/>
+          <ns0:lang ns0:eastAsia="ko-KR"/>
+        </ns0:rPr>
+        <ns0:t/>
+      </ns0:r>
+      <ns0:proofErr ns0:type="spellEnd"/>
+      <ns0:r ns0:rsidRPr="005A6394">
+        <ns0:rPr>
+          <ns0:rFonts ns0:ascii="굴림" ns0:eastAsia="굴림" ns0:hAnsi="굴림" ns0:cs="굴림"/>
+          <ns0:lang ns0:eastAsia="ko-KR"/>
+        </ns0:rPr>
+        <ns0:t xml:space="preserve"/>
+      </ns0:r>
+      <ns0:r ns0:rsidRPr="005A6394">
+        <ns0:rPr>
+          <ns0:rFonts ns0:ascii="굴림" ns0:eastAsia="굴림" ns0:hAnsi="굴림" ns0:cs="굴림"/>
+          <ns0:lang ns0:eastAsia="ko-KR"/>
+        </ns0:rPr>
+        <ns0:t/>
+      </ns0:r>
+      <ns0:r ns0:rsidRPr="005A6394">
+        <ns0:rPr>
+          <ns0:rFonts ns0:ascii="굴림" ns0:eastAsia="굴림" ns0:hAnsi="굴림" ns0:cs="굴림"/>
+          <ns0:lang ns0:eastAsia="ko-KR"/>
+        </ns0:rPr>
+        <ns0:t xml:space="preserve"/>
+      </ns0:r>
+      <ns0:r ns0:rsidRPr="005A6394">
+        <ns0:rPr>
+          <ns0:rFonts ns0:ascii="굴림" ns0:eastAsia="굴림" ns0:hAnsi="굴림" ns0:cs="굴림"/>
+          <ns0:lang ns0:eastAsia="ko-KR"/>
+        </ns0:rPr>
+        <ns0:t/>
+      </ns0:r>
+      <ns0:r ns0:rsidRPr="005A6394">
+        <ns0:rPr>
+          <ns0:rFonts ns0:ascii="굴림" ns0:eastAsia="굴림" ns0:hAnsi="굴림" ns0:cs="굴림"/>
+          <ns0:lang ns0:eastAsia="ko-KR"/>
+        </ns0:rPr>
+        <ns0:t xml:space="preserve"/>
+      </ns0:r>
+      <ns0:r ns0:rsidRPr="005A6394">
+        <ns0:rPr>
+          <ns0:rFonts ns0:ascii="굴림" ns0:eastAsia="굴림" ns0:hAnsi="굴림" ns0:cs="굴림"/>
+          <ns0:lang ns0:eastAsia="ko-KR"/>
+        </ns0:rPr>
+        <ns0:t/>
+      </ns0:r>
+      <ns0:r ns0:rsidRPr="005A6394">
+        <ns0:rPr>
+          <ns0:rFonts ns0:ascii="굴림" ns0:eastAsia="굴림" ns0:hAnsi="굴림" ns0:cs="굴림"/>
+          <ns0:lang ns0:eastAsia="ko-KR"/>
+        </ns0:rPr>
+        <ns0:t xml:space="preserve"/>
+      </ns0:r>
+      <ns0:r ns0:rsidRPr="005A6394">
+        <ns0:rPr>
+          <ns0:rFonts ns0:ascii="굴림" ns0:eastAsia="굴림" ns0:hAnsi="굴림" ns0:cs="굴림"/>
+          <ns0:lang ns0:eastAsia="ko-KR"/>
+        </ns0:rPr>
+        <ns0:t/>
+      </ns0:r>
+      <ns0:r ns0:rsidRPr="005A6394">
+        <ns0:rPr>
+          <ns0:rFonts ns0:ascii="굴림" ns0:eastAsia="굴림" ns0:hAnsi="굴림" ns0:cs="굴림"/>
+          <ns0:lang ns0:eastAsia="ko-KR"/>
+        </ns0:rPr>
+        <ns0:t xml:space="preserve"/>
+      </ns0:r>
+      <ns0:r ns0:rsidRPr="005A6394">
+        <ns0:rPr>
+          <ns0:rFonts ns0:ascii="굴림" ns0:eastAsia="굴림" ns0:hAnsi="굴림" ns0:cs="굴림"/>
+          <ns0:lang ns0:eastAsia="ko-KR"/>
+        </ns0:rPr>
+        <ns0:t/>
+      </ns0:r>
+      <ns0:r ns0:rsidRPr="005A6394">
+        <ns0:rPr>
+          <ns0:rFonts ns0:ascii="굴림" ns0:eastAsia="굴림" ns0:hAnsi="굴림" ns0:cs="굴림"/>
+          <ns0:lang ns0:eastAsia="ko-KR"/>
+        </ns0:rPr>
+        <ns0:t/>
+      </ns0:r>
+    </ns0:p>
+    <ns0:p ns2:paraId="AB233B00" ns2:textId="77777777" ns0:rsidR="00C903FE" ns0:rsidRPr="005A6394" ns0:rsidRDefault="00361B4A">
+      <ns0:pPr>
+        <ns0:spacing ns0:after="40"/>
+        <ns0:ind ns0:left="397" ns0:hanging="397"/>
+        <ns0:rPr>
+          <ns0:rFonts ns0:ascii="굴림" ns0:eastAsia="굴림" ns0:hAnsi="굴림"/>
+          <ns0:lang ns0:eastAsia="ko-KR"/>
+        </ns0:rPr>
+      </ns0:pPr>
+      <ns0:r ns0:rsidRPr="005A6394">
+        <ns0:rPr>
+          <ns0:rFonts ns0:ascii="굴림" ns0:eastAsia="굴림" ns0:hAnsi="굴림" ns0:cs="굴림"/>
+          <ns0:lang ns0:eastAsia="ko-KR"/>
+        </ns0:rPr>
+        <ns0:t xml:space="preserve">3.  장애물이 주행 경로에서 일부 벗어난 위치에 있는 경우 회피 경로가 생성되고, 차량이 해당 경로를 따라 주행하는 것을 확인했습니다.</ns0:t>
+      </ns0:r>
+      <ns0:proofErr ns0:type="spellStart"/>
+      <ns0:r ns0:rsidRPr="005A6394">
+        <ns0:rPr>
+          <ns0:rFonts ns0:ascii="굴림" ns0:eastAsia="굴림" ns0:hAnsi="굴림" ns0:cs="굴림"/>
+          <ns0:lang ns0:eastAsia="ko-KR"/>
+        </ns0:rPr>
+        <ns0:t/>
+      </ns0:r>
+      <ns0:proofErr ns0:type="spellEnd"/>
+      <ns0:r ns0:rsidRPr="005A6394">
+        <ns0:rPr>
+          <ns0:rFonts ns0:ascii="굴림" ns0:eastAsia="굴림" ns0:hAnsi="굴림" ns0:cs="굴림"/>
+          <ns0:lang ns0:eastAsia="ko-KR"/>
+        </ns0:rPr>
+        <ns0:t xml:space="preserve"/>
+      </ns0:r>
+      <ns0:r ns0:rsidRPr="005A6394">
+        <ns0:rPr>
+          <ns0:rFonts ns0:ascii="굴림" ns0:eastAsia="굴림" ns0:hAnsi="굴림" ns0:cs="굴림"/>
+          <ns0:lang ns0:eastAsia="ko-KR"/>
+        </ns0:rPr>
+        <ns0:t/>
+      </ns0:r>
+      <ns0:r ns0:rsidRPr="005A6394">
+        <ns0:rPr>
+          <ns0:rFonts ns0:ascii="굴림" ns0:eastAsia="굴림" ns0:hAnsi="굴림" ns0:cs="굴림"/>
+          <ns0:lang ns0:eastAsia="ko-KR"/>
+        </ns0:rPr>
+        <ns0:t xml:space="preserve"/>
+      </ns0:r>
+      <ns0:r ns0:rsidRPr="005A6394">
+        <ns0:rPr>
+          <ns0:rFonts ns0:ascii="굴림" ns0:eastAsia="굴림" ns0:hAnsi="굴림" ns0:cs="굴림"/>
+          <ns0:lang ns0:eastAsia="ko-KR"/>
+        </ns0:rPr>
+        <ns0:t/>
+      </ns0:r>
+      <ns0:r ns0:rsidRPr="005A6394">
+        <ns0:rPr>
+          <ns0:rFonts ns0:ascii="굴림" ns0:eastAsia="굴림" ns0:hAnsi="굴림" ns0:cs="굴림"/>
+          <ns0:lang ns0:eastAsia="ko-KR"/>
+        </ns0:rPr>
+        <ns0:t xml:space="preserve"/>
+      </ns0:r>
+      <ns0:r ns0:rsidRPr="005A6394">
+        <ns0:rPr>
+          <ns0:rFonts ns0:ascii="굴림" ns0:eastAsia="굴림" ns0:hAnsi="굴림" ns0:cs="굴림"/>
+          <ns0:lang ns0:eastAsia="ko-KR"/>
+        </ns0:rPr>
+        <ns0:t/>
+      </ns0:r>
+      <ns0:r ns0:rsidRPr="005A6394">
+        <ns0:rPr>
+          <ns0:rFonts ns0:ascii="굴림" ns0:eastAsia="굴림" ns0:hAnsi="굴림" ns0:cs="굴림"/>
+          <ns0:lang ns0:eastAsia="ko-KR"/>
+        </ns0:rPr>
+        <ns0:t xml:space="preserve"/>
+      </ns0:r>
+      <ns0:r ns0:rsidRPr="005A6394">
+        <ns0:rPr>
+          <ns0:rFonts ns0:ascii="굴림" ns0:eastAsia="굴림" ns0:hAnsi="굴림" ns0:cs="굴림"/>
+          <ns0:lang ns0:eastAsia="ko-KR"/>
+        </ns0:rPr>
+        <ns0:t/>
+      </ns0:r>
+      <ns0:r ns0:rsidRPr="005A6394">
+        <ns0:rPr>
+          <ns0:rFonts ns0:ascii="굴림" ns0:eastAsia="굴림" ns0:hAnsi="굴림" ns0:cs="굴림"/>
+          <ns0:lang ns0:eastAsia="ko-KR"/>
+        </ns0:rPr>
+        <ns0:t xml:space="preserve"/>
+      </ns0:r>
+      <ns0:r ns0:rsidRPr="005A6394">
+        <ns0:rPr>
+          <ns0:rFonts ns0:ascii="굴림" ns0:eastAsia="굴림" ns0:hAnsi="굴림" ns0:cs="굴림"/>
+          <ns0:lang ns0:eastAsia="ko-KR"/>
+        </ns0:rPr>
+        <ns0:t/>
+      </ns0:r>
+      <ns0:r ns0:rsidRPr="005A6394">
+        <ns0:rPr>
+          <ns0:rFonts ns0:ascii="굴림" ns0:eastAsia="굴림" ns0:hAnsi="굴림" ns0:cs="굴림"/>
+          <ns0:lang ns0:eastAsia="ko-KR"/>
+        </ns0:rPr>
+        <ns0:t/>
+      </ns0:r>
+    </ns0:p>
+    <ns0:p ns2:paraId="8ED29CFA" ns2:textId="77777777" ns0:rsidR="00C903FE" ns0:rsidRPr="005A6394" ns0:rsidRDefault="00361B4A">
+      <ns0:pPr>
+        <ns0:rPr>
+          <ns0:rFonts ns0:ascii="굴림" ns0:eastAsia="굴림" ns0:hAnsi="굴림"/>
+          <ns0:lang ns0:eastAsia="ko-KR"/>
+        </ns0:rPr>
+      </ns0:pPr>
+      <ns0:r ns0:rsidRPr="005A6394">
+        <ns0:rPr>
+          <ns0:rFonts ns0:ascii="굴림" ns0:eastAsia="굴림" ns0:hAnsi="굴림" ns0:cs="굴림"/>
+          <ns0:lang ns0:eastAsia="ko-KR"/>
+        </ns0:rPr>
+        <ns0:t>장애물에 대한 정지 또는 회피 판단은 장애물의 위치, 차선 구조와 주변 주행 가능 공간에 따라 달라질 수 있습니다.</ns0:t>
+      </ns0:r>
+      <ns0:r ns0:rsidRPr="005A6394">
+        <ns0:rPr>
+          <ns0:rFonts ns0:ascii="굴림" ns0:eastAsia="굴림" ns0:hAnsi="굴림" ns0:cs="굴림"/>
+          <ns0:lang ns0:eastAsia="ko-KR"/>
+        </ns0:rPr>
+      </ns0:r>
+      <ns0:r ns0:rsidRPr="005A6394">
+        <ns0:rPr>
+          <ns0:rFonts ns0:ascii="굴림" ns0:eastAsia="굴림" ns0:hAnsi="굴림" ns0:cs="굴림"/>
+          <ns0:lang ns0:eastAsia="ko-KR"/>
+        </ns0:rPr>
+      </ns0:r>
+      <ns0:r ns0:rsidRPr="005A6394">
+        <ns0:rPr>
+          <ns0:rFonts ns0:ascii="굴림" ns0:eastAsia="굴림" ns0:hAnsi="굴림" ns0:cs="굴림"/>
+          <ns0:lang ns0:eastAsia="ko-KR"/>
+        </ns0:rPr>
+      </ns0:r>
+      <ns0:r ns0:rsidRPr="005A6394">
+        <ns0:rPr>
+          <ns0:rFonts ns0:ascii="굴림" ns0:eastAsia="굴림" ns0:hAnsi="굴림" ns0:cs="굴림"/>
+          <ns0:lang ns0:eastAsia="ko-KR"/>
+        </ns0:rPr>
+      </ns0:r>
+      <ns0:r ns0:rsidRPr="005A6394">
+        <ns0:rPr>
+          <ns0:rFonts ns0:ascii="굴림" ns0:eastAsia="굴림" ns0:hAnsi="굴림" ns0:cs="굴림"/>
+          <ns0:lang ns0:eastAsia="ko-KR"/>
+        </ns0:rPr>
+      </ns0:r>
+      <ns0:r ns0:rsidRPr="005A6394">
+        <ns0:rPr>
+          <ns0:rFonts ns0:ascii="굴림" ns0:eastAsia="굴림" ns0:hAnsi="굴림" ns0:cs="굴림"/>
+          <ns0:lang ns0:eastAsia="ko-KR"/>
+        </ns0:rPr>
+      </ns0:r>
+      <ns0:r ns0:rsidRPr="005A6394">
+        <ns0:rPr>
+          <ns0:rFonts ns0:ascii="굴림" ns0:eastAsia="굴림" ns0:hAnsi="굴림" ns0:cs="굴림"/>
+          <ns0:lang ns0:eastAsia="ko-KR"/>
+        </ns0:rPr>
+      </ns0:r>
+      <ns0:r ns0:rsidRPr="005A6394">
+        <ns0:rPr>
+          <ns0:rFonts ns0:ascii="굴림" ns0:eastAsia="굴림" ns0:hAnsi="굴림" ns0:cs="굴림"/>
+          <ns0:lang ns0:eastAsia="ko-KR"/>
+        </ns0:rPr>
+      </ns0:r>
+      <ns0:r ns0:rsidRPr="005A6394">
+        <ns0:rPr>
+          <ns0:rFonts ns0:ascii="굴림" ns0:eastAsia="굴림" ns0:hAnsi="굴림" ns0:cs="굴림"/>
+          <ns0:lang ns0:eastAsia="ko-KR"/>
+        </ns0:rPr>
+      </ns0:r>
+      <ns0:proofErr ns0:type="spellStart"/>
+      <ns0:r ns0:rsidRPr="005A6394">
+        <ns0:rPr>
+          <ns0:rFonts ns0:ascii="굴림" ns0:eastAsia="굴림" ns0:hAnsi="굴림" ns0:cs="굴림"/>
+          <ns0:lang ns0:eastAsia="ko-KR"/>
+        </ns0:rPr>
+      </ns0:r>
+      <ns0:proofErr ns0:type="spellEnd"/>
+      <ns0:r ns0:rsidRPr="005A6394">
+        <ns0:rPr>
+          <ns0:rFonts ns0:ascii="굴림" ns0:eastAsia="굴림" ns0:hAnsi="굴림" ns0:cs="굴림"/>
+          <ns0:lang ns0:eastAsia="ko-KR"/>
+        </ns0:rPr>
+      </ns0:r>
+      <ns0:r ns0:rsidRPr="005A6394">
+        <ns0:rPr>
+          <ns0:rFonts ns0:ascii="굴림" ns0:eastAsia="굴림" ns0:hAnsi="굴림" ns0:cs="굴림"/>
+          <ns0:lang ns0:eastAsia="ko-KR"/>
+        </ns0:rPr>
+      </ns0:r>
+      <ns0:r ns0:rsidRPr="005A6394">
+        <ns0:rPr>
+          <ns0:rFonts ns0:ascii="굴림" ns0:eastAsia="굴림" ns0:hAnsi="굴림" ns0:cs="굴림"/>
+          <ns0:lang ns0:eastAsia="ko-KR"/>
+        </ns0:rPr>
+      </ns0:r>
+      <ns0:r ns0:rsidRPr="005A6394">
+        <ns0:rPr>
+          <ns0:rFonts ns0:ascii="굴림" ns0:eastAsia="굴림" ns0:hAnsi="굴림" ns0:cs="굴림"/>
+          <ns0:lang ns0:eastAsia="ko-KR"/>
+        </ns0:rPr>
+      </ns0:r>
+      <ns0:r ns0:rsidRPr="005A6394">
+        <ns0:rPr>
+          <ns0:rFonts ns0:ascii="굴림" ns0:eastAsia="굴림" ns0:hAnsi="굴림" ns0:cs="굴림"/>
+          <ns0:lang ns0:eastAsia="ko-KR"/>
+        </ns0:rPr>
+      </ns0:r>
+      <ns0:r ns0:rsidRPr="005A6394">
+        <ns0:rPr>
+          <ns0:rFonts ns0:ascii="굴림" ns0:eastAsia="굴림" ns0:hAnsi="굴림" ns0:cs="굴림"/>
+          <ns0:lang ns0:eastAsia="ko-KR"/>
+        </ns0:rPr>
+      </ns0:r>
+      <ns0:r ns0:rsidRPr="005A6394">
+        <ns0:rPr>
+          <ns0:rFonts ns0:ascii="굴림" ns0:eastAsia="굴림" ns0:hAnsi="굴림" ns0:cs="굴림"/>
+          <ns0:lang ns0:eastAsia="ko-KR"/>
+        </ns0:rPr>
+      </ns0:r>
+      <ns0:r ns0:rsidRPr="005A6394">
+        <ns0:rPr>
+          <ns0:rFonts ns0:ascii="굴림" ns0:eastAsia="굴림" ns0:hAnsi="굴림" ns0:cs="굴림"/>
+          <ns0:lang ns0:eastAsia="ko-KR"/>
+        </ns0:rPr>
+      </ns0:r>
+    </ns0:p>
     <ns0:p ns2:paraId="3F4A0986" ns2:textId="77777777" ns0:rsidR="00C903FE" ns0:rsidRPr="005A6394" ns0:rsidRDefault="00361B4A">
       <ns0:pPr>
         <ns0:pStyle ns0:val="1"/>
@@ -27871,7 +28478,7 @@
       </ns0:r>
       <ns0:proofErr ns0:type="spellEnd"/>
     </ns0:p>
-    <ns0:p ns2:paraId="165C3A1E" ns2:textId="77777777" ns0:rsidR="00C903FE" ns0:rsidRPr="005A6394" ns0:rsidRDefault="00361B4A">
+    <ns0:p ns2:paraId="9C79A227" ns2:textId="77777777" ns0:rsidR="00C903FE" ns0:rsidRPr="005A6394" ns0:rsidRDefault="00361B4A">
       <ns0:pPr>
         <ns0:pStyle ns0:val="21"/>
         <ns0:rPr>

</xml_diff>